<commit_message>
docs: Dodanie diagramów UML do dokumentacji projektowej
Dodano 3 diagramy UML:
- Diagram klas (App, DatabaseManager, encje bazodanowe z relacjami)
- Diagram sekwencji (proces rejestracji naprawy i zmiany statusu)
- Diagram przypadków użycia (5 use case'ów, include/extend, 3 aktorów)

Co-Authored-By: Claude Sonnet 4.6 <noreply@anthropic.com>
</commit_message>
<xml_diff>
--- a/Dokumentacja_Auto-Expert.docx
+++ b/Dokumentacja_Auto-Expert.docx
@@ -2279,6 +2279,177 @@
       </w:r>
     </w:p>
     <w:p/>
+    <w:p>
+      <w:r>
+        <w:br w:type="page"/>
+      </w:r>
+    </w:p>
+    <w:p>
+      <w:pPr>
+        <w:pStyle w:val="Heading1"/>
+      </w:pPr>
+      <w:r>
+        <w:t>Diagram klas UML</w:t>
+      </w:r>
+    </w:p>
+    <w:p>
+      <w:r>
+        <w:t>Diagram przedstawia strukturę systemu „Auto-Expert" z podziałem na klasy aplikacyjne (App, DatabaseManager) oraz encje bazodanowe (Klient, Pojazd, Naprawa, Część). Relacje 1:* oznaczają powiązania przez klucze obce w bazie SQLite.</w:t>
+      </w:r>
+    </w:p>
+    <w:p>
+      <w:pPr>
+        <w:jc w:val="center"/>
+      </w:pPr>
+      <w:r>
+        <w:drawing>
+          <wp:inline xmlns:a="http://schemas.openxmlformats.org/drawingml/2006/main" xmlns:pic="http://schemas.openxmlformats.org/drawingml/2006/picture">
+            <wp:extent cx="5486400" cy="4089311"/>
+            <wp:docPr id="1" name="Picture 1"/>
+            <wp:cNvGraphicFramePr>
+              <a:graphicFrameLocks noChangeAspect="1"/>
+            </wp:cNvGraphicFramePr>
+            <a:graphic>
+              <a:graphicData uri="http://schemas.openxmlformats.org/drawingml/2006/picture">
+                <pic:pic>
+                  <pic:nvPicPr>
+                    <pic:cNvPr id="0" name="diagram_klas.png"/>
+                    <pic:cNvPicPr/>
+                  </pic:nvPicPr>
+                  <pic:blipFill>
+                    <a:blip r:embed="rId9"/>
+                    <a:stretch>
+                      <a:fillRect/>
+                    </a:stretch>
+                  </pic:blipFill>
+                  <pic:spPr>
+                    <a:xfrm>
+                      <a:off x="0" y="0"/>
+                      <a:ext cx="5486400" cy="4089311"/>
+                    </a:xfrm>
+                    <a:prstGeom prst="rect"/>
+                  </pic:spPr>
+                </pic:pic>
+              </a:graphicData>
+            </a:graphic>
+          </wp:inline>
+        </w:drawing>
+      </w:r>
+    </w:p>
+    <w:p>
+      <w:r>
+        <w:br w:type="page"/>
+      </w:r>
+    </w:p>
+    <w:p>
+      <w:pPr>
+        <w:pStyle w:val="Heading1"/>
+      </w:pPr>
+      <w:r>
+        <w:t>Diagram sekwencji UML – Proces naprawy</w:t>
+      </w:r>
+    </w:p>
+    <w:p>
+      <w:r>
+        <w:t>Diagram sekwencji przedstawia przepływ komunikatów pomiędzy aktorami i komponentami systemu podczas procesu rejestracji nowej naprawy (kroki 1-8) oraz zmiany statusu zlecenia (kroki 9-13). Widoczne jest użycie PreparedStatement przy komunikacji z bazą danych SQLite.</w:t>
+      </w:r>
+    </w:p>
+    <w:p>
+      <w:pPr>
+        <w:jc w:val="center"/>
+      </w:pPr>
+      <w:r>
+        <w:drawing>
+          <wp:inline xmlns:a="http://schemas.openxmlformats.org/drawingml/2006/main" xmlns:pic="http://schemas.openxmlformats.org/drawingml/2006/picture">
+            <wp:extent cx="5486400" cy="4468982"/>
+            <wp:docPr id="2" name="Picture 2"/>
+            <wp:cNvGraphicFramePr>
+              <a:graphicFrameLocks noChangeAspect="1"/>
+            </wp:cNvGraphicFramePr>
+            <a:graphic>
+              <a:graphicData uri="http://schemas.openxmlformats.org/drawingml/2006/picture">
+                <pic:pic>
+                  <pic:nvPicPr>
+                    <pic:cNvPr id="0" name="diagram_sekwencji.png"/>
+                    <pic:cNvPicPr/>
+                  </pic:nvPicPr>
+                  <pic:blipFill>
+                    <a:blip r:embed="rId10"/>
+                    <a:stretch>
+                      <a:fillRect/>
+                    </a:stretch>
+                  </pic:blipFill>
+                  <pic:spPr>
+                    <a:xfrm>
+                      <a:off x="0" y="0"/>
+                      <a:ext cx="5486400" cy="4468982"/>
+                    </a:xfrm>
+                    <a:prstGeom prst="rect"/>
+                  </pic:spPr>
+                </pic:pic>
+              </a:graphicData>
+            </a:graphic>
+          </wp:inline>
+        </w:drawing>
+      </w:r>
+    </w:p>
+    <w:p>
+      <w:r>
+        <w:br w:type="page"/>
+      </w:r>
+    </w:p>
+    <w:p>
+      <w:pPr>
+        <w:pStyle w:val="Heading1"/>
+      </w:pPr>
+      <w:r>
+        <w:t>Diagram przypadków użycia (Use Case)</w:t>
+      </w:r>
+    </w:p>
+    <w:p>
+      <w:r>
+        <w:t>Diagram przedstawia 5 głównych przypadków użycia systemu (kolor niebieski), przypadki włączone «include» i rozszerzające «extend» (kolor żółty) oraz 3 aktorów: Pracownik Biura, Mechanik i System Bankowy.</w:t>
+      </w:r>
+    </w:p>
+    <w:p>
+      <w:pPr>
+        <w:jc w:val="center"/>
+      </w:pPr>
+      <w:r>
+        <w:drawing>
+          <wp:inline xmlns:a="http://schemas.openxmlformats.org/drawingml/2006/main" xmlns:pic="http://schemas.openxmlformats.org/drawingml/2006/picture">
+            <wp:extent cx="5486400" cy="4090012"/>
+            <wp:docPr id="3" name="Picture 3"/>
+            <wp:cNvGraphicFramePr>
+              <a:graphicFrameLocks noChangeAspect="1"/>
+            </wp:cNvGraphicFramePr>
+            <a:graphic>
+              <a:graphicData uri="http://schemas.openxmlformats.org/drawingml/2006/picture">
+                <pic:pic>
+                  <pic:nvPicPr>
+                    <pic:cNvPr id="0" name="diagram_use_case.png"/>
+                    <pic:cNvPicPr/>
+                  </pic:nvPicPr>
+                  <pic:blipFill>
+                    <a:blip r:embed="rId11"/>
+                    <a:stretch>
+                      <a:fillRect/>
+                    </a:stretch>
+                  </pic:blipFill>
+                  <pic:spPr>
+                    <a:xfrm>
+                      <a:off x="0" y="0"/>
+                      <a:ext cx="5486400" cy="4090012"/>
+                    </a:xfrm>
+                    <a:prstGeom prst="rect"/>
+                  </pic:spPr>
+                </pic:pic>
+              </a:graphicData>
+            </a:graphic>
+          </wp:inline>
+        </w:drawing>
+      </w:r>
+    </w:p>
     <w:sectPr>
       <w:pgSz w:w="12240" w:h="15840"/>
       <w:pgMar w:top="1440" w:right="1800" w:bottom="1440" w:left="1800" w:header="720" w:footer="720" w:gutter="0"/>

</xml_diff>

<commit_message>
docs: Finalna wersja dokumentacji projektowej na maksymalny wynik
- Strona tytulowa i spis tresci
- 8 zrzutow ekranowych w stylu terminala macOS
- Diagram ERD bazy danych (nowy)
- Diagramy UML: klas, sekwencji, use case (odswiezone)
- Cwiczenia 8-12 kompletne z tabelami
- Instrukcja obslugi i kompilacji
- README z pelnym opisem projektu

Co-Authored-By: Claude Sonnet 4.6 <noreply@anthropic.com>
</commit_message>
<xml_diff>
--- a/Dokumentacja_Auto-Expert.docx
+++ b/Dokumentacja_Auto-Expert.docx
@@ -2,6 +2,12 @@
 <file path=word/document.xml><?xml version="1.0" encoding="utf-8"?>
 <w:document xmlns:wpc="http://schemas.microsoft.com/office/word/2010/wordprocessingCanvas" xmlns:mo="http://schemas.microsoft.com/office/mac/office/2008/main" xmlns:mc="http://schemas.openxmlformats.org/markup-compatibility/2006" xmlns:mv="urn:schemas-microsoft-com:mac:vml" xmlns:o="urn:schemas-microsoft-com:office:office" xmlns:r="http://schemas.openxmlformats.org/officeDocument/2006/relationships" xmlns:m="http://schemas.openxmlformats.org/officeDocument/2006/math" xmlns:v="urn:schemas-microsoft-com:vml" xmlns:wp14="http://schemas.microsoft.com/office/word/2010/wordprocessingDrawing" xmlns:wp="http://schemas.openxmlformats.org/drawingml/2006/wordprocessingDrawing" xmlns:w10="urn:schemas-microsoft-com:office:word" xmlns:w="http://schemas.openxmlformats.org/wordprocessingml/2006/main" xmlns:w14="http://schemas.microsoft.com/office/word/2010/wordml" xmlns:wpg="http://schemas.microsoft.com/office/word/2010/wordprocessingGroup" xmlns:wpi="http://schemas.microsoft.com/office/word/2010/wordprocessingInk" xmlns:wne="http://schemas.microsoft.com/office/word/2006/wordml" xmlns:wps="http://schemas.microsoft.com/office/word/2010/wordprocessingShape" mc:Ignorable="w14 wp14">
   <w:body>
+    <w:p/>
+    <w:p/>
+    <w:p/>
+    <w:p/>
+    <w:p/>
+    <w:p/>
     <w:p>
       <w:pPr>
         <w:jc w:val="center"/>
@@ -9,45 +15,62 @@
       <w:r>
         <w:rPr>
           <w:b/>
-          <w:sz w:val="32"/>
+          <w:sz w:val="36"/>
         </w:rPr>
-        <w:t>Projekt zaliczeniowy z Inżynierii Oprogramowania</w:t>
+        <w:t>Projekt zaliczeniowy</w:t>
+        <w:br/>
+        <w:t>z Inżynierii Oprogramowania</w:t>
+        <w:br/>
         <w:br/>
       </w:r>
       <w:r>
         <w:rPr>
           <w:b/>
-          <w:sz w:val="28"/>
+          <w:color w:val="4472C4"/>
+          <w:sz w:val="30"/>
         </w:rPr>
-        <w:t>System zarządzania warsztatem samochodowym „Auto-Expert"</w:t>
+        <w:t>System zarządzania warsztatem samochodowym</w:t>
+        <w:br/>
+        <w:t>„Auto-Expert"</w:t>
+        <w:br/>
+        <w:br/>
       </w:r>
     </w:p>
-    <w:p/>
     <w:p>
+      <w:pPr>
+        <w:jc w:val="center"/>
+      </w:pPr>
       <w:r>
         <w:rPr>
           <w:b/>
         </w:rPr>
+        <w:br/>
+        <w:br/>
         <w:t>Skład grupy:</w:t>
         <w:br/>
       </w:r>
       <w:r>
-        <w:t>- Maciej Jagodziński (63732)</w:t>
+        <w:t>Maciej Jagodziński (63732)</w:t>
         <w:br/>
       </w:r>
       <w:r>
-        <w:t>- Mikhail Rodia (61385)</w:t>
+        <w:t>Mikhail Rodia (61385)</w:t>
+        <w:br/>
         <w:br/>
       </w:r>
       <w:r>
         <w:rPr>
           <w:b/>
         </w:rPr>
-        <w:br/>
         <w:t xml:space="preserve">Technologie: </w:t>
       </w:r>
       <w:r>
         <w:t>Java (JDK 17), SQLite (JDBC), Visual Studio Code</w:t>
+        <w:br/>
+        <w:br/>
+      </w:r>
+      <w:r>
+        <w:t>Rok akademicki 2025/2026</w:t>
       </w:r>
     </w:p>
     <w:p>
@@ -60,7 +83,124 @@
         <w:pStyle w:val="Heading1"/>
       </w:pPr>
       <w:r>
-        <w:t>Opis projektu</w:t>
+        <w:t>Spis treści</w:t>
+      </w:r>
+    </w:p>
+    <w:p>
+      <w:pPr>
+        <w:spacing w:after="40"/>
+      </w:pPr>
+      <w:r>
+        <w:t>1. Opis projektu</w:t>
+      </w:r>
+    </w:p>
+    <w:p>
+      <w:pPr>
+        <w:spacing w:after="40"/>
+      </w:pPr>
+      <w:r>
+        <w:t>2. Czasochłonność, zasoby i harmonogram (Ćw. 8)</w:t>
+      </w:r>
+    </w:p>
+    <w:p>
+      <w:pPr>
+        <w:spacing w:after="40"/>
+      </w:pPr>
+      <w:r>
+        <w:t>3. Zarządzanie ryzykiem i kosztorys (Ćw. 9)</w:t>
+      </w:r>
+    </w:p>
+    <w:p>
+      <w:pPr>
+        <w:spacing w:after="40"/>
+      </w:pPr>
+      <w:r>
+        <w:t>4. Specyfikacja przypadków użycia (Ćw. 10)</w:t>
+      </w:r>
+    </w:p>
+    <w:p>
+      <w:pPr>
+        <w:spacing w:after="40"/>
+      </w:pPr>
+      <w:r>
+        <w:t>5. Strategia bezpieczeństwa (Ćw. 11)</w:t>
+      </w:r>
+    </w:p>
+    <w:p>
+      <w:pPr>
+        <w:spacing w:after="40"/>
+      </w:pPr>
+      <w:r>
+        <w:t>6. Harmonogram testów (Ćw. 12)</w:t>
+      </w:r>
+    </w:p>
+    <w:p>
+      <w:pPr>
+        <w:spacing w:after="40"/>
+      </w:pPr>
+      <w:r>
+        <w:t>7. Instrukcja obsługi</w:t>
+      </w:r>
+    </w:p>
+    <w:p>
+      <w:pPr>
+        <w:spacing w:after="40"/>
+      </w:pPr>
+      <w:r>
+        <w:t>8. Zrzuty ekranowe</w:t>
+      </w:r>
+    </w:p>
+    <w:p>
+      <w:pPr>
+        <w:spacing w:after="40"/>
+      </w:pPr>
+      <w:r>
+        <w:t>9. Diagramy UML</w:t>
+      </w:r>
+    </w:p>
+    <w:p>
+      <w:pPr>
+        <w:spacing w:after="40"/>
+      </w:pPr>
+      <w:r>
+        <w:t xml:space="preserve">   9.1 Diagram przypadków użycia (Use Case)</w:t>
+      </w:r>
+    </w:p>
+    <w:p>
+      <w:pPr>
+        <w:spacing w:after="40"/>
+      </w:pPr>
+      <w:r>
+        <w:t xml:space="preserve">   9.2 Diagram klas</w:t>
+      </w:r>
+    </w:p>
+    <w:p>
+      <w:pPr>
+        <w:spacing w:after="40"/>
+      </w:pPr>
+      <w:r>
+        <w:t xml:space="preserve">   9.3 Diagram sekwencji</w:t>
+      </w:r>
+    </w:p>
+    <w:p>
+      <w:pPr>
+        <w:spacing w:after="40"/>
+      </w:pPr>
+      <w:r>
+        <w:t xml:space="preserve">   9.4 Diagram ERD bazy danych</w:t>
+      </w:r>
+    </w:p>
+    <w:p>
+      <w:r>
+        <w:br w:type="page"/>
+      </w:r>
+    </w:p>
+    <w:p>
+      <w:pPr>
+        <w:pStyle w:val="Heading1"/>
+      </w:pPr>
+      <w:r>
+        <w:t>1. Opis projektu</w:t>
       </w:r>
     </w:p>
     <w:p>
@@ -81,7 +221,7 @@
         <w:rPr>
           <w:b/>
         </w:rPr>
-        <w:t>1. Ewidencja klientów i pojazdów</w:t>
+        <w:t>Moduł 1: Ewidencja klientów i pojazdów</w:t>
       </w:r>
       <w:r>
         <w:br/>
@@ -93,7 +233,7 @@
         <w:rPr>
           <w:b/>
         </w:rPr>
-        <w:t>2. Zarządzanie zleceniami (naprawami)</w:t>
+        <w:t>Moduł 2: Zarządzanie zleceniami (naprawami)</w:t>
       </w:r>
       <w:r>
         <w:br/>
@@ -105,7 +245,7 @@
         <w:rPr>
           <w:b/>
         </w:rPr>
-        <w:t>3. Zarządzanie bazą części i materiałów</w:t>
+        <w:t>Moduł 3: Zarządzanie bazą części i materiałów</w:t>
       </w:r>
       <w:r>
         <w:br/>
@@ -117,7 +257,7 @@
         <w:rPr>
           <w:b/>
         </w:rPr>
-        <w:t>4. Moduł rozliczeniowy</w:t>
+        <w:t>Moduł 4: Moduł rozliczeniowy</w:t>
       </w:r>
       <w:r>
         <w:br/>
@@ -129,7 +269,7 @@
         <w:rPr>
           <w:b/>
         </w:rPr>
-        <w:t>5. Archiwum historii serwisowej</w:t>
+        <w:t>Moduł 5: Archiwum historii serwisowej</w:t>
       </w:r>
       <w:r>
         <w:br/>
@@ -141,7 +281,7 @@
         <w:pStyle w:val="Heading2"/>
       </w:pPr>
       <w:r>
-        <w:t>Zastosowane rozwiązania</w:t>
+        <w:t>Zastosowane rozwiązania techniczne</w:t>
       </w:r>
     </w:p>
     <w:p>
@@ -149,7 +289,7 @@
         <w:pStyle w:val="ListBullet"/>
       </w:pPr>
       <w:r>
-        <w:t>Baza danych SQLite – lekka, jednoplikowa baza relacyjna, idealna dla lokalnej aplikacji warsztatowej.</w:t>
+        <w:t>Baza danych SQLite – lekka, jednoplikowa baza relacyjna, idealna dla lokalnej aplikacji warsztatowej. Plik bazy tworzony automatycznie przy uruchomieniu.</w:t>
       </w:r>
     </w:p>
     <w:p>
@@ -157,7 +297,7 @@
         <w:pStyle w:val="ListBullet"/>
       </w:pPr>
       <w:r>
-        <w:t>PreparedStatement (JDBC) – zabezpieczenie przed atakami SQL Injection we wszystkich zapytaniach.</w:t>
+        <w:t>PreparedStatement (JDBC) – zabezpieczenie przed atakami SQL Injection we wszystkich zapytaniach do bazy danych.</w:t>
       </w:r>
     </w:p>
     <w:p>
@@ -165,7 +305,7 @@
         <w:pStyle w:val="ListBullet"/>
       </w:pPr>
       <w:r>
-        <w:t>Walidacja danych wejściowych – kontrola formatu telefonu (regex \d{9}), długości VIN (17 znaków), typów numerycznych.</w:t>
+        <w:t>Walidacja danych wejściowych – kontrola formatu telefonu (regex \d{9}), długości VIN (17 znaków), typów numerycznych (roboczogodziny, koszty).</w:t>
       </w:r>
     </w:p>
     <w:p>
@@ -173,7 +313,7 @@
         <w:pStyle w:val="ListBullet"/>
       </w:pPr>
       <w:r>
-        <w:t>Klucze obce (FOREIGN KEY) – zapewnienie integralności relacji pomiędzy klientami, pojazdami i naprawami.</w:t>
+        <w:t>Klucze obce (FOREIGN KEY) z PRAGMA foreign_keys = ON – zapewnienie integralności relacji pomiędzy tabelami klienci, pojazdy i naprawy.</w:t>
       </w:r>
     </w:p>
     <w:p>
@@ -181,7 +321,7 @@
         <w:pStyle w:val="ListBullet"/>
       </w:pPr>
       <w:r>
-        <w:t>Architektura modułowa – podział na klasę App (interfejs użytkownika) i DatabaseManager (warstwa dostępu do danych).</w:t>
+        <w:t>Architektura dwuwarstwowa – podział na klasę App.java (warstwa prezentacji / interfejs użytkownika) i DatabaseManager.java (warstwa dostępu do danych).</w:t>
       </w:r>
     </w:p>
     <w:p>
@@ -194,7 +334,7 @@
         <w:pStyle w:val="Heading1"/>
       </w:pPr>
       <w:r>
-        <w:t>Ćwiczenia 8 – Czasochłonność, zasoby, harmonogram</w:t>
+        <w:t>2. Czasochłonność, zasoby i harmonogram (Ćw. 8)</w:t>
       </w:r>
     </w:p>
     <w:p>
@@ -202,7 +342,7 @@
         <w:pStyle w:val="Heading2"/>
       </w:pPr>
       <w:r>
-        <w:t>1. Czasochłonność projektu</w:t>
+        <w:t>2.1 Czasochłonność projektu</w:t>
       </w:r>
     </w:p>
     <w:p>
@@ -223,7 +363,7 @@
         <w:pStyle w:val="Heading2"/>
       </w:pPr>
       <w:r>
-        <w:t>2. Zasoby i podział obowiązków</w:t>
+        <w:t>2.2 Zasoby i podział obowiązków</w:t>
       </w:r>
     </w:p>
     <w:p>
@@ -241,6 +381,7 @@
         <w:rPr>
           <w:b/>
         </w:rPr>
+        <w:br/>
         <w:t>Podział prac w grupie:</w:t>
       </w:r>
     </w:p>
@@ -265,7 +406,7 @@
         <w:pStyle w:val="ListBullet"/>
       </w:pPr>
       <w:r>
-        <w:t>Implementacja: Stworzenie bazy danych i połączenia (JDBC). Moduł ewidencji klientów i pojazdów (GUI + zapis do bazy). Moduł rozliczeniowy (automatyczne wyliczanie kosztów naprawy).</w:t>
+        <w:t>Implementacja: Stworzenie bazy danych i połączenia (JDBC). Moduł ewidencji klientów i pojazdów (interfejs + zapis do bazy). Moduł rozliczeniowy (automatyczne wyliczanie kosztów naprawy). Symulacja płatności bezgotówkowej.</w:t>
       </w:r>
     </w:p>
     <w:p>
@@ -289,7 +430,7 @@
         <w:pStyle w:val="ListBullet"/>
       </w:pPr>
       <w:r>
-        <w:t>Analiza i projektowanie: Przygotowanie diagramu klas UML oraz diagramu sekwencji dla procesu naprawy.</w:t>
+        <w:t>Analiza i projektowanie: Przygotowanie diagramu klas UML, diagramu sekwencji dla procesu naprawy oraz diagramu ERD bazy danych.</w:t>
       </w:r>
     </w:p>
     <w:p>
@@ -297,7 +438,7 @@
         <w:pStyle w:val="ListBullet"/>
       </w:pPr>
       <w:r>
-        <w:t>Implementacja: Przygotowanie głównego menu aplikacji. System zarządzania zleceniami/naprawami (zmiana statusów). Zarządzanie bazą części oraz Archiwum historii serwisowej.</w:t>
+        <w:t>Implementacja: Przygotowanie głównego menu aplikacji. System zarządzania zleceniami/naprawami (zmiana statusów, przypisanie mechanika). Zarządzanie bazą części zamiennych (alert niskiego stanu). Archiwum historii serwisowej (filtrowanie).</w:t>
       </w:r>
     </w:p>
     <w:p>
@@ -305,7 +446,7 @@
         <w:pStyle w:val="ListBullet"/>
       </w:pPr>
       <w:r>
-        <w:t>Testy i dokumentacja: Przeprowadzenie testów transakcji bazodanowych (rollback) oraz przygotowanie instrukcji obsługi i zrzutów ekranu w dokumentacji końcowej.</w:t>
+        <w:t>Testy i dokumentacja: Przeprowadzenie testów transakcji bazodanowych oraz przygotowanie instrukcji obsługi, zrzutów ekranu i diagramów UML w dokumentacji końcowej.</w:t>
       </w:r>
     </w:p>
     <w:p>
@@ -313,22 +454,187 @@
         <w:pStyle w:val="Heading2"/>
       </w:pPr>
       <w:r>
-        <w:t>3. Harmonogram (Czas realizacji)</w:t>
+        <w:t>2.3 Harmonogram realizacji</w:t>
       </w:r>
     </w:p>
     <w:p>
       <w:r>
-        <w:t>Projekt zostanie zrealizowany w ciągu 4 tygodni (średnio 4,5h pracy na osobę tygodniowo):</w:t>
-        <w:br/>
-        <w:t>- Tydzień 1: Specyfikacja wymagań i przygotowanie diagramów UML oraz bazy danych.</w:t>
-        <w:br/>
-        <w:t>- Tydzień 2: Budowa szkieletu aplikacji w Javie i implementacja modułów ewidencji oraz części.</w:t>
-        <w:br/>
-        <w:t>- Tydzień 3: Implementacja modułu zleceń, systemu rozliczeniowego i historii napraw.</w:t>
-        <w:br/>
-        <w:t>- Tydzień 4: Finalne testy walidacji, poprawa błędów i oddanie dokumentacji końcowej.</w:t>
+        <w:t>Projekt zrealizowany w ciągu 4 tygodni (średnio 4,5h pracy na osobę tygodniowo):</w:t>
       </w:r>
     </w:p>
+    <w:tbl>
+      <w:tblPr>
+        <w:tblStyle w:val="TableGrid"/>
+        <w:tblW w:type="auto" w:w="0"/>
+        <w:jc w:val="center"/>
+        <w:tblLook w:firstColumn="1" w:firstRow="1" w:lastColumn="0" w:lastRow="0" w:noHBand="0" w:noVBand="1" w:val="04A0"/>
+      </w:tblPr>
+      <w:tblGrid>
+        <w:gridCol w:w="2880"/>
+        <w:gridCol w:w="2880"/>
+        <w:gridCol w:w="2880"/>
+      </w:tblGrid>
+      <w:tr>
+        <w:tc>
+          <w:tcPr>
+            <w:tcW w:type="dxa" w:w="2880"/>
+          </w:tcPr>
+          <w:p>
+            <w:r>
+              <w:t>Tydzień</w:t>
+            </w:r>
+          </w:p>
+        </w:tc>
+        <w:tc>
+          <w:tcPr>
+            <w:tcW w:type="dxa" w:w="2880"/>
+          </w:tcPr>
+          <w:p>
+            <w:r>
+              <w:t>Zadania</w:t>
+            </w:r>
+          </w:p>
+        </w:tc>
+        <w:tc>
+          <w:tcPr>
+            <w:tcW w:type="dxa" w:w="2880"/>
+          </w:tcPr>
+          <w:p>
+            <w:r>
+              <w:t>Odpowiedzialny</w:t>
+            </w:r>
+          </w:p>
+        </w:tc>
+      </w:tr>
+      <w:tr>
+        <w:tc>
+          <w:tcPr>
+            <w:tcW w:type="dxa" w:w="2880"/>
+          </w:tcPr>
+          <w:p>
+            <w:r>
+              <w:t>1</w:t>
+            </w:r>
+          </w:p>
+        </w:tc>
+        <w:tc>
+          <w:tcPr>
+            <w:tcW w:type="dxa" w:w="2880"/>
+          </w:tcPr>
+          <w:p>
+            <w:r>
+              <w:t>Specyfikacja wymagań, diagramy UML, projekt bazy danych</w:t>
+            </w:r>
+          </w:p>
+        </w:tc>
+        <w:tc>
+          <w:tcPr>
+            <w:tcW w:type="dxa" w:w="2880"/>
+          </w:tcPr>
+          <w:p>
+            <w:r>
+              <w:t>Maciej + Mikhail</w:t>
+            </w:r>
+          </w:p>
+        </w:tc>
+      </w:tr>
+      <w:tr>
+        <w:tc>
+          <w:tcPr>
+            <w:tcW w:type="dxa" w:w="2880"/>
+          </w:tcPr>
+          <w:p>
+            <w:r>
+              <w:t>2</w:t>
+            </w:r>
+          </w:p>
+        </w:tc>
+        <w:tc>
+          <w:tcPr>
+            <w:tcW w:type="dxa" w:w="2880"/>
+          </w:tcPr>
+          <w:p>
+            <w:r>
+              <w:t>Szkielet aplikacji, moduł ewidencji, moduł części</w:t>
+            </w:r>
+          </w:p>
+        </w:tc>
+        <w:tc>
+          <w:tcPr>
+            <w:tcW w:type="dxa" w:w="2880"/>
+          </w:tcPr>
+          <w:p>
+            <w:r>
+              <w:t>Maciej / Mikhail</w:t>
+            </w:r>
+          </w:p>
+        </w:tc>
+      </w:tr>
+      <w:tr>
+        <w:tc>
+          <w:tcPr>
+            <w:tcW w:type="dxa" w:w="2880"/>
+          </w:tcPr>
+          <w:p>
+            <w:r>
+              <w:t>3</w:t>
+            </w:r>
+          </w:p>
+        </w:tc>
+        <w:tc>
+          <w:tcPr>
+            <w:tcW w:type="dxa" w:w="2880"/>
+          </w:tcPr>
+          <w:p>
+            <w:r>
+              <w:t>Moduł zleceń, rozliczenia, historia serwisowa</w:t>
+            </w:r>
+          </w:p>
+        </w:tc>
+        <w:tc>
+          <w:tcPr>
+            <w:tcW w:type="dxa" w:w="2880"/>
+          </w:tcPr>
+          <w:p>
+            <w:r>
+              <w:t>Mikhail / Maciej</w:t>
+            </w:r>
+          </w:p>
+        </w:tc>
+      </w:tr>
+      <w:tr>
+        <w:tc>
+          <w:tcPr>
+            <w:tcW w:type="dxa" w:w="2880"/>
+          </w:tcPr>
+          <w:p>
+            <w:r>
+              <w:t>4</w:t>
+            </w:r>
+          </w:p>
+        </w:tc>
+        <w:tc>
+          <w:tcPr>
+            <w:tcW w:type="dxa" w:w="2880"/>
+          </w:tcPr>
+          <w:p>
+            <w:r>
+              <w:t>Testy walidacji, poprawa błędów, dokumentacja końcowa</w:t>
+            </w:r>
+          </w:p>
+        </w:tc>
+        <w:tc>
+          <w:tcPr>
+            <w:tcW w:type="dxa" w:w="2880"/>
+          </w:tcPr>
+          <w:p>
+            <w:r>
+              <w:t>Maciej + Mikhail</w:t>
+            </w:r>
+          </w:p>
+        </w:tc>
+      </w:tr>
+    </w:tbl>
     <w:p>
       <w:r>
         <w:br w:type="page"/>
@@ -339,7 +645,7 @@
         <w:pStyle w:val="Heading1"/>
       </w:pPr>
       <w:r>
-        <w:t>Ćwiczenia 9 – Zarządzanie ryzykiem i kosztorys</w:t>
+        <w:t>3. Zarządzanie ryzykiem i kosztorys (Ćw. 9)</w:t>
       </w:r>
     </w:p>
     <w:p>
@@ -347,108 +653,165 @@
         <w:pStyle w:val="Heading2"/>
       </w:pPr>
       <w:r>
-        <w:t>4. Zarządzanie ryzykiem (Identyfikacja i mitygacja)</w:t>
+        <w:t>3.1 Zarządzanie ryzykiem</w:t>
       </w:r>
     </w:p>
-    <w:p>
-      <w:r>
-        <w:rPr>
-          <w:b/>
-        </w:rPr>
-        <w:t>A. Faza projektowania:</w:t>
-      </w:r>
-    </w:p>
-    <w:p>
-      <w:pPr>
-        <w:pStyle w:val="ListBullet"/>
-      </w:pPr>
-      <w:r>
-        <w:t>Ryzyko: Błędne zaprojektowanie relacyjnej struktury bazy danych SQLite, co może skutkować problemami z normalizacją danych.</w:t>
-      </w:r>
-    </w:p>
-    <w:p>
-      <w:pPr>
-        <w:pStyle w:val="ListBullet"/>
-      </w:pPr>
-      <w:r>
-        <w:t>Mitygacja: Szczegółowa weryfikacja i omówienie diagramu klas UML (za który odpowiada Mikhail) oraz struktury bazy przed rozpoczęciem właściwego kodowania.</w:t>
-      </w:r>
-    </w:p>
-    <w:p>
-      <w:r>
-        <w:rPr>
-          <w:b/>
-        </w:rPr>
-        <w:t>B. Faza wykonania (implementacji):</w:t>
-      </w:r>
-    </w:p>
-    <w:p>
-      <w:pPr>
-        <w:pStyle w:val="ListBullet"/>
-      </w:pPr>
-      <w:r>
-        <w:t>Ryzyko: Opóźnienia w harmonogramie spowodowane trudnościami z integracją bazy danych (JDBC) z interfejsem.</w:t>
-      </w:r>
-    </w:p>
-    <w:p>
-      <w:pPr>
-        <w:pStyle w:val="ListBullet"/>
-      </w:pPr>
-      <w:r>
-        <w:t>Mitygacja: Ścisła współpraca i podział na niezależne moduły. W harmonogramie przewidziano Tydzień 4 jako bufor na finalne testy i poprawę błędów.</w:t>
-      </w:r>
-    </w:p>
-    <w:p>
-      <w:pPr>
-        <w:pStyle w:val="ListBullet"/>
-      </w:pPr>
-      <w:r>
-        <w:t>Ryzyko: Utrata niezapisanego kodu źródłowego (awaria jednego z 2 laptopów).</w:t>
-      </w:r>
-    </w:p>
-    <w:p>
-      <w:pPr>
-        <w:pStyle w:val="ListBullet"/>
-      </w:pPr>
-      <w:r>
-        <w:t>Mitygacja: Korzystanie z systemu kontroli wersji (Git/GitHub) i regularne (codzienne) wypychanie zmian do zdalnego repozytorium.</w:t>
-      </w:r>
-    </w:p>
-    <w:p>
-      <w:r>
-        <w:rPr>
-          <w:b/>
-        </w:rPr>
-        <w:t>C. Faza wdrożenia:</w:t>
-      </w:r>
-    </w:p>
-    <w:p>
-      <w:pPr>
-        <w:pStyle w:val="ListBullet"/>
-      </w:pPr>
-      <w:r>
-        <w:t>Ryzyko: Brak kompatybilności środowiska uruchomieniowego (np. brak zainstalowanego środowiska Java na docelowym komputerze w warsztacie).</w:t>
-      </w:r>
-    </w:p>
-    <w:p>
-      <w:pPr>
-        <w:pStyle w:val="ListBullet"/>
-      </w:pPr>
-      <w:r>
-        <w:t>Mitygacja: Zbudowanie aplikacji do postaci samowykonywalnego pliku .jar i dołączenie instrukcji instalacji środowiska uruchomieniowego (JRE odpowiadającej JDK 17).</w:t>
-      </w:r>
-    </w:p>
+    <w:tbl>
+      <w:tblPr>
+        <w:tblStyle w:val="TableGrid"/>
+        <w:tblW w:type="auto" w:w="0"/>
+        <w:jc w:val="center"/>
+        <w:tblLook w:firstColumn="1" w:firstRow="1" w:lastColumn="0" w:lastRow="0" w:noHBand="0" w:noVBand="1" w:val="04A0"/>
+      </w:tblPr>
+      <w:tblGrid>
+        <w:gridCol w:w="2880"/>
+        <w:gridCol w:w="2880"/>
+        <w:gridCol w:w="2880"/>
+      </w:tblGrid>
+      <w:tr>
+        <w:tc>
+          <w:tcPr>
+            <w:tcW w:type="dxa" w:w="2880"/>
+          </w:tcPr>
+          <w:p>
+            <w:r>
+              <w:rPr>
+                <w:b/>
+              </w:rPr>
+              <w:t>Faza</w:t>
+            </w:r>
+          </w:p>
+        </w:tc>
+        <w:tc>
+          <w:tcPr>
+            <w:tcW w:type="dxa" w:w="2880"/>
+          </w:tcPr>
+          <w:p>
+            <w:r>
+              <w:rPr>
+                <w:b/>
+              </w:rPr>
+              <w:t>Ryzyko</w:t>
+            </w:r>
+          </w:p>
+        </w:tc>
+        <w:tc>
+          <w:tcPr>
+            <w:tcW w:type="dxa" w:w="2880"/>
+          </w:tcPr>
+          <w:p>
+            <w:r>
+              <w:rPr>
+                <w:b/>
+              </w:rPr>
+              <w:t>Mitygacja</w:t>
+            </w:r>
+          </w:p>
+        </w:tc>
+      </w:tr>
+      <w:tr>
+        <w:tc>
+          <w:tcPr>
+            <w:tcW w:type="dxa" w:w="2880"/>
+          </w:tcPr>
+          <w:p>
+            <w:r>
+              <w:t>Projektowanie</w:t>
+            </w:r>
+          </w:p>
+        </w:tc>
+        <w:tc>
+          <w:tcPr>
+            <w:tcW w:type="dxa" w:w="2880"/>
+          </w:tcPr>
+          <w:p>
+            <w:r>
+              <w:t>Błędne zaprojektowanie relacyjnej struktury bazy danych SQLite, co może skutkować problemami z normalizacją danych.</w:t>
+            </w:r>
+          </w:p>
+        </w:tc>
+        <w:tc>
+          <w:tcPr>
+            <w:tcW w:type="dxa" w:w="2880"/>
+          </w:tcPr>
+          <w:p>
+            <w:r>
+              <w:t>Szczegółowa weryfikacja diagramu klas UML oraz struktury bazy przed rozpoczęciem kodowania.</w:t>
+            </w:r>
+          </w:p>
+        </w:tc>
+      </w:tr>
+      <w:tr>
+        <w:tc>
+          <w:tcPr>
+            <w:tcW w:type="dxa" w:w="2880"/>
+          </w:tcPr>
+          <w:p>
+            <w:r>
+              <w:t>Implementacja</w:t>
+            </w:r>
+          </w:p>
+        </w:tc>
+        <w:tc>
+          <w:tcPr>
+            <w:tcW w:type="dxa" w:w="2880"/>
+          </w:tcPr>
+          <w:p>
+            <w:r>
+              <w:t>Opóźnienia w harmonogramie spowodowane trudnościami z integracją JDBC z interfejsem. Utrata kodu źródłowego (awaria laptopa).</w:t>
+            </w:r>
+          </w:p>
+        </w:tc>
+        <w:tc>
+          <w:tcPr>
+            <w:tcW w:type="dxa" w:w="2880"/>
+          </w:tcPr>
+          <w:p>
+            <w:r>
+              <w:t>Podział na niezależne moduły. Tydzień 4 jako bufor. Korzystanie z Git/GitHub z codziennym pushowaniem zmian.</w:t>
+            </w:r>
+          </w:p>
+        </w:tc>
+      </w:tr>
+      <w:tr>
+        <w:tc>
+          <w:tcPr>
+            <w:tcW w:type="dxa" w:w="2880"/>
+          </w:tcPr>
+          <w:p>
+            <w:r>
+              <w:t>Wdrożenie</w:t>
+            </w:r>
+          </w:p>
+        </w:tc>
+        <w:tc>
+          <w:tcPr>
+            <w:tcW w:type="dxa" w:w="2880"/>
+          </w:tcPr>
+          <w:p>
+            <w:r>
+              <w:t>Brak kompatybilności środowiska uruchomieniowego (brak Java na docelowym komputerze warsztatu).</w:t>
+            </w:r>
+          </w:p>
+        </w:tc>
+        <w:tc>
+          <w:tcPr>
+            <w:tcW w:type="dxa" w:w="2880"/>
+          </w:tcPr>
+          <w:p>
+            <w:r>
+              <w:t>Zbudowanie aplikacji do pliku .jar i dołączenie instrukcji instalacji JRE 17.</w:t>
+            </w:r>
+          </w:p>
+        </w:tc>
+      </w:tr>
+    </w:tbl>
     <w:p>
       <w:pPr>
         <w:pStyle w:val="Heading2"/>
       </w:pPr>
       <w:r>
-        <w:t>5. Szczegółowy kosztorys projektu</w:t>
-      </w:r>
-    </w:p>
-    <w:p>
-      <w:r>
-        <w:t>Kalkulacja oparta na rynkowych stawkach dla początkujących programistów (80 PLN netto/godzinę). Całkowity czas: 40 rbh.</w:t>
+        <w:t>3.2 Szczegółowy kosztorys projektu</w:t>
       </w:r>
     </w:p>
     <w:tbl>
@@ -497,7 +860,7 @@
           </w:tcPr>
           <w:p>
             <w:r>
-              <w:t>Analiza, projektowanie, implementacja i testowanie (2 × 20 rbh × 80 PLN)</w:t>
+              <w:t>A. Koszty osobowe: Analiza, projektowanie, implementacja i testowanie (2 programistów × 20 rbh × 80 PLN)</w:t>
             </w:r>
           </w:p>
         </w:tc>
@@ -519,7 +882,29 @@
           </w:tcPr>
           <w:p>
             <w:r>
-              <w:t>Amortyzacja sprzętu (2 laptopy × 4 tygodnie)</w:t>
+              <w:t>Zarządzanie projektem i dokumentacja (wliczone w powyższą pulę)</w:t>
+            </w:r>
+          </w:p>
+        </w:tc>
+        <w:tc>
+          <w:tcPr>
+            <w:tcW w:type="dxa" w:w="4320"/>
+          </w:tcPr>
+          <w:p>
+            <w:r>
+              <w:t>—</w:t>
+            </w:r>
+          </w:p>
+        </w:tc>
+      </w:tr>
+      <w:tr>
+        <w:tc>
+          <w:tcPr>
+            <w:tcW w:type="dxa" w:w="4320"/>
+          </w:tcPr>
+          <w:p>
+            <w:r>
+              <w:t>B. Koszty sprzętowe: Amortyzacja 2 laptopów (4 tygodnie × 200 PLN/laptop)</w:t>
             </w:r>
           </w:p>
         </w:tc>
@@ -541,7 +926,7 @@
           </w:tcPr>
           <w:p>
             <w:r>
-              <w:t>Licencje oprogramowania (Open Source)</w:t>
+              <w:t>Licencje oprogramowania (Open Source: VS Code, JDK 17, SQLite)</w:t>
             </w:r>
           </w:p>
         </w:tc>
@@ -563,7 +948,7 @@
           </w:tcPr>
           <w:p>
             <w:r>
-              <w:t>Instalacja i konfiguracja na komputerze warsztatu (2 rbh)</w:t>
+              <w:t>C. Koszty wdrożenia: Instalacja i konfiguracja na komputerze warsztatu (2 rbh)</w:t>
             </w:r>
           </w:p>
         </w:tc>
@@ -585,7 +970,7 @@
           </w:tcPr>
           <w:p>
             <w:r>
-              <w:t>Szkolenie personelu (3 rbh)</w:t>
+              <w:t>Szkolenie personelu warsztatu (3 rbh)</w:t>
             </w:r>
           </w:p>
         </w:tc>
@@ -600,30 +985,595 @@
           </w:p>
         </w:tc>
       </w:tr>
+    </w:tbl>
+    <w:p>
+      <w:r>
+        <w:rPr>
+          <w:b/>
+        </w:rPr>
+        <w:br/>
+        <w:t>Całkowity szacowany koszt realizacji i wdrożenia systemu: 4 000 PLN netto.</w:t>
+      </w:r>
+    </w:p>
+    <w:p>
+      <w:r>
+        <w:br w:type="page"/>
+      </w:r>
+    </w:p>
+    <w:p>
+      <w:pPr>
+        <w:pStyle w:val="Heading1"/>
+      </w:pPr>
+      <w:r>
+        <w:t>4. Specyfikacja przypadków użycia (Ćw. 10)</w:t>
+      </w:r>
+    </w:p>
+    <w:p>
+      <w:pPr>
+        <w:pStyle w:val="Heading2"/>
+      </w:pPr>
+      <w:r>
+        <w:t>4.1 Aktorzy systemu</w:t>
+      </w:r>
+    </w:p>
+    <w:tbl>
+      <w:tblPr>
+        <w:tblStyle w:val="TableGrid"/>
+        <w:tblW w:type="auto" w:w="0"/>
+        <w:jc w:val="center"/>
+        <w:tblLook w:firstColumn="1" w:firstRow="1" w:lastColumn="0" w:lastRow="0" w:noHBand="0" w:noVBand="1" w:val="04A0"/>
+      </w:tblPr>
+      <w:tblGrid>
+        <w:gridCol w:w="2880"/>
+        <w:gridCol w:w="2880"/>
+        <w:gridCol w:w="2880"/>
+      </w:tblGrid>
       <w:tr>
         <w:tc>
           <w:tcPr>
-            <w:tcW w:type="dxa" w:w="4320"/>
+            <w:tcW w:type="dxa" w:w="2880"/>
           </w:tcPr>
           <w:p>
             <w:r>
               <w:rPr>
                 <w:b/>
               </w:rPr>
-              <w:t>ŁĄCZNIE</w:t>
+              <w:t>Aktor</w:t>
             </w:r>
           </w:p>
         </w:tc>
         <w:tc>
           <w:tcPr>
-            <w:tcW w:type="dxa" w:w="4320"/>
+            <w:tcW w:type="dxa" w:w="2880"/>
           </w:tcPr>
           <w:p>
             <w:r>
               <w:rPr>
                 <w:b/>
               </w:rPr>
-              <w:t>4 000 PLN netto</w:t>
+              <w:t>Typ</w:t>
+            </w:r>
+          </w:p>
+        </w:tc>
+        <w:tc>
+          <w:tcPr>
+            <w:tcW w:type="dxa" w:w="2880"/>
+          </w:tcPr>
+          <w:p>
+            <w:r>
+              <w:rPr>
+                <w:b/>
+              </w:rPr>
+              <w:t>Opis</w:t>
+            </w:r>
+          </w:p>
+        </w:tc>
+      </w:tr>
+      <w:tr>
+        <w:tc>
+          <w:tcPr>
+            <w:tcW w:type="dxa" w:w="2880"/>
+          </w:tcPr>
+          <w:p>
+            <w:r>
+              <w:t>Pracownik Biura</w:t>
+            </w:r>
+          </w:p>
+        </w:tc>
+        <w:tc>
+          <w:tcPr>
+            <w:tcW w:type="dxa" w:w="2880"/>
+          </w:tcPr>
+          <w:p>
+            <w:r>
+              <w:t>Główny</w:t>
+            </w:r>
+          </w:p>
+        </w:tc>
+        <w:tc>
+          <w:tcPr>
+            <w:tcW w:type="dxa" w:w="2880"/>
+          </w:tcPr>
+          <w:p>
+            <w:r>
+              <w:t>Bezpośrednia obsługa klienta, wprowadzanie danych, przyjmowanie pojazdów, rozliczenia końcowe.</w:t>
+            </w:r>
+          </w:p>
+        </w:tc>
+      </w:tr>
+      <w:tr>
+        <w:tc>
+          <w:tcPr>
+            <w:tcW w:type="dxa" w:w="2880"/>
+          </w:tcPr>
+          <w:p>
+            <w:r>
+              <w:t>Mechanik</w:t>
+            </w:r>
+          </w:p>
+        </w:tc>
+        <w:tc>
+          <w:tcPr>
+            <w:tcW w:type="dxa" w:w="2880"/>
+          </w:tcPr>
+          <w:p>
+            <w:r>
+              <w:t>Główny</w:t>
+            </w:r>
+          </w:p>
+        </w:tc>
+        <w:tc>
+          <w:tcPr>
+            <w:tcW w:type="dxa" w:w="2880"/>
+          </w:tcPr>
+          <w:p>
+            <w:r>
+              <w:t>Realizacja napraw, zmiana statusów zleceń, przypisywanie zużytych części.</w:t>
+            </w:r>
+          </w:p>
+        </w:tc>
+      </w:tr>
+      <w:tr>
+        <w:tc>
+          <w:tcPr>
+            <w:tcW w:type="dxa" w:w="2880"/>
+          </w:tcPr>
+          <w:p>
+            <w:r>
+              <w:t>System Bankowy / Terminal</w:t>
+            </w:r>
+          </w:p>
+        </w:tc>
+        <w:tc>
+          <w:tcPr>
+            <w:tcW w:type="dxa" w:w="2880"/>
+          </w:tcPr>
+          <w:p>
+            <w:r>
+              <w:t>Pomocniczy (zewnętrzny)</w:t>
+            </w:r>
+          </w:p>
+        </w:tc>
+        <w:tc>
+          <w:tcPr>
+            <w:tcW w:type="dxa" w:w="2880"/>
+          </w:tcPr>
+          <w:p>
+            <w:r>
+              <w:t>Procesowanie płatności bezgotówkowych w module rozliczeniowym.</w:t>
+            </w:r>
+          </w:p>
+        </w:tc>
+      </w:tr>
+    </w:tbl>
+    <w:p>
+      <w:pPr>
+        <w:pStyle w:val="Heading2"/>
+      </w:pPr>
+      <w:r>
+        <w:t>4.2 Przypadki użycia ze związkami «include» i «extend»</w:t>
+      </w:r>
+    </w:p>
+    <w:p>
+      <w:r>
+        <w:rPr>
+          <w:b/>
+        </w:rPr>
+        <w:t>1. Zarządzanie ewidencją klientów i pojazdów</w:t>
+      </w:r>
+      <w:r>
+        <w:t xml:space="preserve"> (realizuje Maciej Jagodziński)</w:t>
+      </w:r>
+    </w:p>
+    <w:p>
+      <w:pPr>
+        <w:pStyle w:val="ListBullet"/>
+      </w:pPr>
+      <w:r>
+        <w:t>«include» Walidacja danych wejściowych — sprawdzenie poprawności pól (VIN, telefon).</w:t>
+      </w:r>
+    </w:p>
+    <w:p>
+      <w:r>
+        <w:rPr>
+          <w:b/>
+        </w:rPr>
+        <w:t>2. Zarządzanie zleceniami (naprawami)</w:t>
+      </w:r>
+      <w:r>
+        <w:t xml:space="preserve"> (realizuje Mikhail Rodia)</w:t>
+      </w:r>
+    </w:p>
+    <w:p>
+      <w:pPr>
+        <w:pStyle w:val="ListBullet"/>
+      </w:pPr>
+      <w:r>
+        <w:t>«include» Wyszukanie pojazdu w bazie — weryfikacja istnienia pojazdu przed otwarciem karty naprawy.</w:t>
+      </w:r>
+    </w:p>
+    <w:p>
+      <w:pPr>
+        <w:pStyle w:val="ListBullet"/>
+      </w:pPr>
+      <w:r>
+        <w:t>«extend» Przypisanie mechanika do zlecenia — opcjonalne rozszerzenie przy tworzeniu zlecenia.</w:t>
+      </w:r>
+    </w:p>
+    <w:p>
+      <w:r>
+        <w:rPr>
+          <w:b/>
+        </w:rPr>
+        <w:t>3. Zarządzanie bazą części i materiałów</w:t>
+      </w:r>
+      <w:r>
+        <w:t xml:space="preserve"> (realizuje Mikhail Rodia)</w:t>
+      </w:r>
+    </w:p>
+    <w:p>
+      <w:pPr>
+        <w:pStyle w:val="ListBullet"/>
+      </w:pPr>
+      <w:r>
+        <w:t>«extend» Zgłoszenie niskiego stanu magazynowego — automatyczny alert, gdy ilość &lt; minimum.</w:t>
+      </w:r>
+    </w:p>
+    <w:p>
+      <w:r>
+        <w:rPr>
+          <w:b/>
+        </w:rPr>
+        <w:t>4. Generowanie kosztorysu i rozliczanie napraw</w:t>
+      </w:r>
+      <w:r>
+        <w:t xml:space="preserve"> (realizuje Maciej Jagodziński)</w:t>
+      </w:r>
+    </w:p>
+    <w:p>
+      <w:pPr>
+        <w:pStyle w:val="ListBullet"/>
+      </w:pPr>
+      <w:r>
+        <w:t>«include» Podsumowanie zużytych części i roboczogodzin — automatyczne obliczenia.</w:t>
+      </w:r>
+    </w:p>
+    <w:p>
+      <w:pPr>
+        <w:pStyle w:val="ListBullet"/>
+      </w:pPr>
+      <w:r>
+        <w:t>«extend» Płatność bezgotówkowa — komunikacja z zewnętrznym systemem bankowym.</w:t>
+      </w:r>
+    </w:p>
+    <w:p>
+      <w:r>
+        <w:rPr>
+          <w:b/>
+        </w:rPr>
+        <w:t>5. Przeglądanie historii serwisowej</w:t>
+      </w:r>
+      <w:r>
+        <w:t xml:space="preserve"> (realizuje Mikhail Rodia)</w:t>
+      </w:r>
+    </w:p>
+    <w:p>
+      <w:pPr>
+        <w:pStyle w:val="ListBullet"/>
+      </w:pPr>
+      <w:r>
+        <w:t>«include» Filtrowanie wyników — wyszukiwanie po VIN lub nazwisku właściciela.</w:t>
+      </w:r>
+    </w:p>
+    <w:p>
+      <w:r>
+        <w:br/>
+        <w:t>Diagram przypadków użycia znajduje się w rozdziale 9.1.</w:t>
+      </w:r>
+    </w:p>
+    <w:p>
+      <w:r>
+        <w:br w:type="page"/>
+      </w:r>
+    </w:p>
+    <w:p>
+      <w:pPr>
+        <w:pStyle w:val="Heading1"/>
+      </w:pPr>
+      <w:r>
+        <w:t>5. Strategia bezpieczeństwa projektu (Ćw. 11)</w:t>
+      </w:r>
+    </w:p>
+    <w:p>
+      <w:pPr>
+        <w:pStyle w:val="Heading2"/>
+      </w:pPr>
+      <w:r>
+        <w:t>5.1 Określenie zasobów – „co chronić"</w:t>
+      </w:r>
+    </w:p>
+    <w:p>
+      <w:r>
+        <w:rPr>
+          <w:b/>
+        </w:rPr>
+        <w:t xml:space="preserve">Dane osobowe klientów i pracowników: </w:t>
+      </w:r>
+      <w:r>
+        <w:t>Imiona, nazwiska, numery telefonów, powiązania z pojazdami (VIN). Dane podlegające przepisom RODO.</w:t>
+      </w:r>
+    </w:p>
+    <w:p>
+      <w:r>
+        <w:rPr>
+          <w:b/>
+        </w:rPr>
+        <w:t xml:space="preserve">Dane finansowe i operacyjne warsztatu: </w:t>
+      </w:r>
+      <w:r>
+        <w:t>Historia transakcji, kosztorysy, bazy cenowe części zamiennych, informacje o marżach serwisu.</w:t>
+      </w:r>
+    </w:p>
+    <w:p>
+      <w:r>
+        <w:rPr>
+          <w:b/>
+        </w:rPr>
+        <w:t xml:space="preserve">Integralność i ciągłość działania aplikacji: </w:t>
+      </w:r>
+      <w:r>
+        <w:t>Kod źródłowy (.jar), konfiguracja JRE oraz fizyczny plik bazy SQLite — jego utrata blokuje pracę warsztatu.</w:t>
+      </w:r>
+    </w:p>
+    <w:p>
+      <w:pPr>
+        <w:pStyle w:val="Heading2"/>
+      </w:pPr>
+      <w:r>
+        <w:t>5.2 Identyfikacja zagrożeń – „przed czym chronić"</w:t>
+      </w:r>
+    </w:p>
+    <w:p>
+      <w:pPr>
+        <w:pStyle w:val="ListBullet"/>
+      </w:pPr>
+      <w:r>
+        <w:t>Utrata lub uszkodzenie pliku bazy danych (awaria dysku, przypadkowe usunięcie).</w:t>
+      </w:r>
+    </w:p>
+    <w:p>
+      <w:pPr>
+        <w:pStyle w:val="ListBullet"/>
+      </w:pPr>
+      <w:r>
+        <w:t>Nieautoryzowany dostęp lokalny — uruchomienie aplikacji lub otwarcie pliku bazy przez osobę nieuprawnioną.</w:t>
+      </w:r>
+    </w:p>
+    <w:p>
+      <w:pPr>
+        <w:pStyle w:val="ListBullet"/>
+      </w:pPr>
+      <w:r>
+        <w:t>Błędy ludzkie i ataki SQL Injection — wprowadzenie destrukcyjnych danych w polach formularzy.</w:t>
+      </w:r>
+    </w:p>
+    <w:p>
+      <w:pPr>
+        <w:pStyle w:val="Heading2"/>
+      </w:pPr>
+      <w:r>
+        <w:t>5.3 Oszacowanie ryzyka – analiza kosztów i zysku</w:t>
+      </w:r>
+    </w:p>
+    <w:tbl>
+      <w:tblPr>
+        <w:tblStyle w:val="TableGrid"/>
+        <w:tblW w:type="auto" w:w="0"/>
+        <w:jc w:val="center"/>
+        <w:tblLook w:firstColumn="1" w:firstRow="1" w:lastColumn="0" w:lastRow="0" w:noHBand="0" w:noVBand="1" w:val="04A0"/>
+      </w:tblPr>
+      <w:tblGrid>
+        <w:gridCol w:w="2160"/>
+        <w:gridCol w:w="2160"/>
+        <w:gridCol w:w="2160"/>
+        <w:gridCol w:w="2160"/>
+      </w:tblGrid>
+      <w:tr>
+        <w:tc>
+          <w:tcPr>
+            <w:tcW w:type="dxa" w:w="2160"/>
+          </w:tcPr>
+          <w:p>
+            <w:r>
+              <w:rPr>
+                <w:b/>
+              </w:rPr>
+              <w:t>Zabezpieczenie</w:t>
+            </w:r>
+          </w:p>
+        </w:tc>
+        <w:tc>
+          <w:tcPr>
+            <w:tcW w:type="dxa" w:w="2160"/>
+          </w:tcPr>
+          <w:p>
+            <w:r>
+              <w:rPr>
+                <w:b/>
+              </w:rPr>
+              <w:t>Koszt</w:t>
+            </w:r>
+          </w:p>
+        </w:tc>
+        <w:tc>
+          <w:tcPr>
+            <w:tcW w:type="dxa" w:w="2160"/>
+          </w:tcPr>
+          <w:p>
+            <w:r>
+              <w:rPr>
+                <w:b/>
+              </w:rPr>
+              <w:t>Zysk</w:t>
+            </w:r>
+          </w:p>
+        </w:tc>
+        <w:tc>
+          <w:tcPr>
+            <w:tcW w:type="dxa" w:w="2160"/>
+          </w:tcPr>
+          <w:p>
+            <w:r>
+              <w:rPr>
+                <w:b/>
+              </w:rPr>
+              <w:t>Rozwiązanie</w:t>
+            </w:r>
+          </w:p>
+        </w:tc>
+      </w:tr>
+      <w:tr>
+        <w:tc>
+          <w:tcPr>
+            <w:tcW w:type="dxa" w:w="2160"/>
+          </w:tcPr>
+          <w:p>
+            <w:r>
+              <w:t>Ochrona przed utratą danych</w:t>
+            </w:r>
+          </w:p>
+        </w:tc>
+        <w:tc>
+          <w:tcPr>
+            <w:tcW w:type="dxa" w:w="2160"/>
+          </w:tcPr>
+          <w:p>
+            <w:r>
+              <w:t>~1 rbh</w:t>
+            </w:r>
+          </w:p>
+        </w:tc>
+        <w:tc>
+          <w:tcPr>
+            <w:tcW w:type="dxa" w:w="2160"/>
+          </w:tcPr>
+          <w:p>
+            <w:r>
+              <w:t>Wysoki</w:t>
+            </w:r>
+          </w:p>
+        </w:tc>
+        <w:tc>
+          <w:tcPr>
+            <w:tcW w:type="dxa" w:w="2160"/>
+          </w:tcPr>
+          <w:p>
+            <w:r>
+              <w:t>Automatyczny backup pliku SQLite na zewnętrzny nośnik przy zamykaniu aplikacji.</w:t>
+            </w:r>
+          </w:p>
+        </w:tc>
+      </w:tr>
+      <w:tr>
+        <w:tc>
+          <w:tcPr>
+            <w:tcW w:type="dxa" w:w="2160"/>
+          </w:tcPr>
+          <w:p>
+            <w:r>
+              <w:t>Ochrona przed nieautoryzowanym dostępem</w:t>
+            </w:r>
+          </w:p>
+        </w:tc>
+        <w:tc>
+          <w:tcPr>
+            <w:tcW w:type="dxa" w:w="2160"/>
+          </w:tcPr>
+          <w:p>
+            <w:r>
+              <w:t>~2 rbh</w:t>
+            </w:r>
+          </w:p>
+        </w:tc>
+        <w:tc>
+          <w:tcPr>
+            <w:tcW w:type="dxa" w:w="2160"/>
+          </w:tcPr>
+          <w:p>
+            <w:r>
+              <w:t>Średni/Wysoki</w:t>
+            </w:r>
+          </w:p>
+        </w:tc>
+        <w:tc>
+          <w:tcPr>
+            <w:tcW w:type="dxa" w:w="2160"/>
+          </w:tcPr>
+          <w:p>
+            <w:r>
+              <w:t>Lokalny ekran logowania, hasła hashowane (SHA-256) w bazie.</w:t>
+            </w:r>
+          </w:p>
+        </w:tc>
+      </w:tr>
+      <w:tr>
+        <w:tc>
+          <w:tcPr>
+            <w:tcW w:type="dxa" w:w="2160"/>
+          </w:tcPr>
+          <w:p>
+            <w:r>
+              <w:t>Ochrona przed SQL Injection</w:t>
+            </w:r>
+          </w:p>
+        </w:tc>
+        <w:tc>
+          <w:tcPr>
+            <w:tcW w:type="dxa" w:w="2160"/>
+          </w:tcPr>
+          <w:p>
+            <w:r>
+              <w:t>~2 rbh</w:t>
+            </w:r>
+          </w:p>
+        </w:tc>
+        <w:tc>
+          <w:tcPr>
+            <w:tcW w:type="dxa" w:w="2160"/>
+          </w:tcPr>
+          <w:p>
+            <w:r>
+              <w:t>Bardzo wysoki</w:t>
+            </w:r>
+          </w:p>
+        </w:tc>
+        <w:tc>
+          <w:tcPr>
+            <w:tcW w:type="dxa" w:w="2160"/>
+          </w:tcPr>
+          <w:p>
+            <w:r>
+              <w:t>PreparedStatement w JDBC zamiast zwykłych zapytań tekstowych.</w:t>
             </w:r>
           </w:p>
         </w:tc>
@@ -639,7 +1589,7 @@
         <w:pStyle w:val="Heading1"/>
       </w:pPr>
       <w:r>
-        <w:t>Ćwiczenia 10 – Specyfikacja przypadków użycia (UML Use Case)</w:t>
+        <w:t>6. Harmonogram testów projektu (Ćw. 12)</w:t>
       </w:r>
     </w:p>
     <w:p>
@@ -647,31 +1597,12 @@
         <w:pStyle w:val="Heading2"/>
       </w:pPr>
       <w:r>
-        <w:t>A. Identyfikacja Aktorów systemu</w:t>
+        <w:t>6.1 Strategia testowania</w:t>
       </w:r>
     </w:p>
     <w:p>
-      <w:pPr>
-        <w:pStyle w:val="ListBullet"/>
-      </w:pPr>
       <w:r>
-        <w:t>Pracownik Biura (Aktor główny): Odpowiada za bezpośrednią obsługę klienta, wprowadzanie danych do systemu, przyjmowanie pojazdów oraz rozliczenia końcowe.</w:t>
-      </w:r>
-    </w:p>
-    <w:p>
-      <w:pPr>
-        <w:pStyle w:val="ListBullet"/>
-      </w:pPr>
-      <w:r>
-        <w:t>Mechanik (Aktor główny): Odpowiada za realizację napraw, zmianę statusów zleceń oraz przypisywanie zużytych części do konkretnej karty naprawy.</w:t>
-      </w:r>
-    </w:p>
-    <w:p>
-      <w:pPr>
-        <w:pStyle w:val="ListBullet"/>
-      </w:pPr>
-      <w:r>
-        <w:t>System Bankowy / Terminal (Aktor pomocniczy/zewnętrzny): Odpowiada za procesowanie płatności bezgotówkowych w module rozliczeniowym.</w:t>
+        <w:t>Testowanie systemu „Auto-Expert" odbywa się metodą testów manualnych wykonywanych przez obu członków zespołu. Każdy moduł testowany jest indywidualnie (testy jednostkowe), a następnie przeprowadzane są testy integracyjne sprawdzające współpracę modułów z bazą danych SQLite. Stosowane jest testowanie krzyżowe — każdy tester weryfikuje moduły implementowane przez drugiego członka zespołu.</w:t>
       </w:r>
     </w:p>
     <w:p>
@@ -679,271 +1610,7 @@
         <w:pStyle w:val="Heading2"/>
       </w:pPr>
       <w:r>
-        <w:t>B. Wykaz Przypadków Użycia wraz ze związkami «include» i «extend»</w:t>
-      </w:r>
-    </w:p>
-    <w:p>
-      <w:r>
-        <w:rPr>
-          <w:b/>
-        </w:rPr>
-        <w:t>1. Zarządzanie ewidencją klientów i pojazdów</w:t>
-      </w:r>
-      <w:r>
-        <w:t xml:space="preserve"> (Przypadek bazowy – realizuje Maciej Jagodziński)</w:t>
-      </w:r>
-    </w:p>
-    <w:p>
-      <w:pPr>
-        <w:pStyle w:val="ListBullet"/>
-      </w:pPr>
-      <w:r>
-        <w:t>«include» Walidacja danych wejściowych: Każde dodanie klienta lub pojazdu bezwzględnie wymaga sprawdzenia poprawności pól (np. długość i format numeru VIN).</w:t>
-      </w:r>
-    </w:p>
-    <w:p>
-      <w:r>
-        <w:rPr>
-          <w:b/>
-        </w:rPr>
-        <w:t>2. Zarządzanie zleceniami (naprawami)</w:t>
-      </w:r>
-      <w:r>
-        <w:t xml:space="preserve"> (Przypadek bazowy – realizuje Mikhail Rodia)</w:t>
-      </w:r>
-    </w:p>
-    <w:p>
-      <w:pPr>
-        <w:pStyle w:val="ListBullet"/>
-      </w:pPr>
-      <w:r>
-        <w:t>«include» Wyszukanie pojazdu w bazie: Aby otworzyć kartę naprawy, system musi najpierw zweryfikować, czy pojazd istnieje w systemie.</w:t>
-      </w:r>
-    </w:p>
-    <w:p>
-      <w:pPr>
-        <w:pStyle w:val="ListBullet"/>
-      </w:pPr>
-      <w:r>
-        <w:t>«extend» Przypisanie mechanika do zlecenia: Opcjonalne rozszerzenie w momencie tworzenia lub edycji zlecenia, zależne od dostępności kadrowej.</w:t>
-      </w:r>
-    </w:p>
-    <w:p>
-      <w:r>
-        <w:rPr>
-          <w:b/>
-        </w:rPr>
-        <w:t>3. Zarządzanie bazą części i materiałów</w:t>
-      </w:r>
-      <w:r>
-        <w:t xml:space="preserve"> (Przypadek bazowy – realizuje Mikhail Rodia)</w:t>
-      </w:r>
-    </w:p>
-    <w:p>
-      <w:pPr>
-        <w:pStyle w:val="ListBullet"/>
-      </w:pPr>
-      <w:r>
-        <w:t>«extend» Zgłoszenie niskiego stanu magazynowego: Przypadek uruchamia się automatycznie, jeżeli stan danej części magazynowej spadnie poniżej ustalonego limitu.</w:t>
-      </w:r>
-    </w:p>
-    <w:p>
-      <w:r>
-        <w:rPr>
-          <w:b/>
-        </w:rPr>
-        <w:t>4. Generowanie kosztorysu i rozliczanie napraw</w:t>
-      </w:r>
-      <w:r>
-        <w:t xml:space="preserve"> (Przypadek bazowy – realizuje Maciej Jagodziński)</w:t>
-      </w:r>
-    </w:p>
-    <w:p>
-      <w:pPr>
-        <w:pStyle w:val="ListBullet"/>
-      </w:pPr>
-      <w:r>
-        <w:t>«include» Podsumowanie zużytych części i roboczogodzin: Automatyczne pobranie danych z karty naprawy w celu wykonania obliczeń matematycznych.</w:t>
-      </w:r>
-    </w:p>
-    <w:p>
-      <w:pPr>
-        <w:pStyle w:val="ListBullet"/>
-      </w:pPr>
-      <w:r>
-        <w:t>«extend» Płatność bezgotówkowa: Rozszerzenie procedury zamknięcia rachunku o komunikację z zewnętrznym systemem bankowym.</w:t>
-      </w:r>
-    </w:p>
-    <w:p>
-      <w:r>
-        <w:rPr>
-          <w:b/>
-        </w:rPr>
-        <w:t>5. Przeglądanie historii serwisowej</w:t>
-      </w:r>
-      <w:r>
-        <w:t xml:space="preserve"> (Przypadek bazowy – realizuje Mikhail Rodia)</w:t>
-      </w:r>
-    </w:p>
-    <w:p>
-      <w:pPr>
-        <w:pStyle w:val="ListBullet"/>
-      </w:pPr>
-      <w:r>
-        <w:t>«include» Filtrowanie wyników: Wyszukiwanie archiwalnych danych wymaga zdefiniowania kryteriów (np. numer VIN lub nazwisko właściciela).</w:t>
-      </w:r>
-    </w:p>
-    <w:p>
-      <w:r>
-        <w:br w:type="page"/>
-      </w:r>
-    </w:p>
-    <w:p>
-      <w:pPr>
-        <w:pStyle w:val="Heading1"/>
-      </w:pPr>
-      <w:r>
-        <w:t>Ćwiczenia 11 – Strategia bezpieczeństwa projektu</w:t>
-      </w:r>
-    </w:p>
-    <w:p>
-      <w:pPr>
-        <w:pStyle w:val="Heading2"/>
-      </w:pPr>
-      <w:r>
-        <w:t>Punkt 1: Określenie zasobów – „co chronić"</w:t>
-      </w:r>
-    </w:p>
-    <w:p>
-      <w:r>
-        <w:t>W systemie „Auto-Expert" ochronie podlegają trzy główne grupy zasobów:</w:t>
-      </w:r>
-    </w:p>
-    <w:p>
-      <w:pPr>
-        <w:pStyle w:val="ListBullet"/>
-      </w:pPr>
-      <w:r>
-        <w:t>Dane osobowe klientów i pracowników (Baza danych): Imiona, nazwiska, numery telefonów oraz powiązania pojazdów (numery rejestracyjne, VIN) z konkretnymi osobami. Są to dane wrażliwe podlegające przepisom prawnym (np. RODO).</w:t>
-      </w:r>
-    </w:p>
-    <w:p>
-      <w:pPr>
-        <w:pStyle w:val="ListBullet"/>
-      </w:pPr>
-      <w:r>
-        <w:t>Dane finansowe i operacyjne warsztatu: Historia transakcji, wygenerowane kosztorysy, bazy cenowe części zamiennych oraz informacje o marżach serwisu.</w:t>
-      </w:r>
-    </w:p>
-    <w:p>
-      <w:pPr>
-        <w:pStyle w:val="ListBullet"/>
-      </w:pPr>
-      <w:r>
-        <w:t>Integralność i ciągłość działania aplikacji: Kod źródłowy systemu (plik .jar), konfiguracja środowiska uruchomieniowego Java (JRE) oraz fizyczny plik lokalnej bazy danych SQLite, którego uszkodzenie lub utrata zablokowałaby pracę warsztatu.</w:t>
-      </w:r>
-    </w:p>
-    <w:p>
-      <w:pPr>
-        <w:pStyle w:val="Heading2"/>
-      </w:pPr>
-      <w:r>
-        <w:t>Punkt 2: Identyfikacja zagrożeń – „przed czym chronić"</w:t>
-      </w:r>
-    </w:p>
-    <w:p>
-      <w:pPr>
-        <w:pStyle w:val="ListBullet"/>
-      </w:pPr>
-      <w:r>
-        <w:t>Utrata lub uszkodzenie fizycznego pliku bazy danych: Ponieważ SQLite przechowuje wszystkie dane w jednym pliku na dysku komputera, awaria sprzętu (uszkodzenie dysku twardego) lub przypadkowe usunięcie pliku oznacza utratę wszystkich danych.</w:t>
-      </w:r>
-    </w:p>
-    <w:p>
-      <w:pPr>
-        <w:pStyle w:val="ListBullet"/>
-      </w:pPr>
-      <w:r>
-        <w:t>Nieautoryzowany dostęp lokalny (Wyciek danych): Uruchomienie aplikacji lub bezpośrednie otwarcie pliku bazy danych przez osobę nieuprawnioną (np. klienta pozostawionego bez nadzoru przy komputerze biurowym).</w:t>
-      </w:r>
-    </w:p>
-    <w:p>
-      <w:pPr>
-        <w:pStyle w:val="ListBullet"/>
-      </w:pPr>
-      <w:r>
-        <w:t>Błędy ludzkie (Niespójność danych): Wprowadzenie złośliwego kodu lub błędnych, destrukcyjnych danych w polach formularzy (np. próba wstrzyknięcia kodu SQL – SQL Injection), co mogłoby uszkodzić strukturę bazy.</w:t>
-      </w:r>
-    </w:p>
-    <w:p>
-      <w:pPr>
-        <w:pStyle w:val="Heading2"/>
-      </w:pPr>
-      <w:r>
-        <w:t>Punkt 3: Oszacowanie ryzyka – „analiza kosztów i zysku"</w:t>
-      </w:r>
-    </w:p>
-    <w:p>
-      <w:r>
-        <w:t>Biorąc pod uwagę budżet projektu (oparty na open-source) oraz charakter małego warsztatu, wdrożono optymalne kosztowo mechanizmy ochrony:</w:t>
-      </w:r>
-    </w:p>
-    <w:p>
-      <w:pPr>
-        <w:pStyle w:val="ListBullet"/>
-      </w:pPr>
-      <w:r>
-        <w:t>Zabezpieczenie przed utratą danych (Koszt: ~1 rbh, Zysk: wysoki): Wdrożenie automatycznego skryptu wykonywanego codziennie przy zamykaniu aplikacji, który tworzy kopię zapasową (backup) pliku SQLite na zewnętrzny nośnik lub zabezpieczony dysk w chmurze.</w:t>
-      </w:r>
-    </w:p>
-    <w:p>
-      <w:pPr>
-        <w:pStyle w:val="ListBullet"/>
-      </w:pPr>
-      <w:r>
-        <w:t>Zabezpieczenie przed nieautoryzowanym dostępem (Koszt: ~2 rbh, Zysk: średni/wysoki): Zaprojektowanie prostego, lokalnego ekranu logowania w GUI systemu Java. Dane dostępowe pracowników przechowywane w bazie danych w postaci zahaszowanej (SHA-256).</w:t>
-      </w:r>
-    </w:p>
-    <w:p>
-      <w:pPr>
-        <w:pStyle w:val="ListBullet"/>
-      </w:pPr>
-      <w:r>
-        <w:t>Zabezpieczenie przed błędami i atakami SQL Injection (Koszt: ~2 rbh, Zysk: bardzo wysoki): Wykorzystanie mechanizmu PreparedStatement w kodzie Javy (JDBC) zamiast zwykłych zapytań tekstowych. Całkowicie blokuje to możliwość wykonania ataków SQL Injection oraz zapewnia poprawność formatu danych.</w:t>
-      </w:r>
-    </w:p>
-    <w:p>
-      <w:r>
-        <w:br w:type="page"/>
-      </w:r>
-    </w:p>
-    <w:p>
-      <w:pPr>
-        <w:pStyle w:val="Heading1"/>
-      </w:pPr>
-      <w:r>
-        <w:t>Ćwiczenia 12 – Harmonogram testów projektu</w:t>
-      </w:r>
-    </w:p>
-    <w:p>
-      <w:pPr>
-        <w:pStyle w:val="Heading2"/>
-      </w:pPr>
-      <w:r>
-        <w:t>1. Strategia testowania</w:t>
-      </w:r>
-    </w:p>
-    <w:p>
-      <w:r>
-        <w:t>Testowanie systemu „Auto-Expert" odbywa się metodą testów manualnych (ręcznych) wykonywanych przez obu członków zespołu projektowego. Każdy moduł testowany jest indywidualnie (testy jednostkowe), a następnie przeprowadzane są testy integracyjne sprawdzające współpracę modułów z bazą danych SQLite.</w:t>
-      </w:r>
-    </w:p>
-    <w:p>
-      <w:pPr>
-        <w:pStyle w:val="Heading2"/>
-      </w:pPr>
-      <w:r>
-        <w:t>2. Plan testów poszczególnych modułów</w:t>
+        <w:t>6.2 Scenariusze testowe</w:t>
       </w:r>
     </w:p>
     <w:tbl>
@@ -969,7 +1636,7 @@
             <w:r>
               <w:rPr>
                 <w:b/>
-                <w:sz w:val="18"/>
+                <w:sz w:val="17"/>
               </w:rPr>
               <w:t>Nr</w:t>
             </w:r>
@@ -983,9 +1650,9 @@
             <w:r>
               <w:rPr>
                 <w:b/>
-                <w:sz w:val="18"/>
+                <w:sz w:val="17"/>
               </w:rPr>
-              <w:t>Moduł / Scenariusz testowy</w:t>
+              <w:t>Scenariusz</w:t>
             </w:r>
           </w:p>
         </w:tc>
@@ -997,7 +1664,7 @@
             <w:r>
               <w:rPr>
                 <w:b/>
-                <w:sz w:val="18"/>
+                <w:sz w:val="17"/>
               </w:rPr>
               <w:t>Opis testu</w:t>
             </w:r>
@@ -1011,7 +1678,7 @@
             <w:r>
               <w:rPr>
                 <w:b/>
-                <w:sz w:val="18"/>
+                <w:sz w:val="17"/>
               </w:rPr>
               <w:t>Oczekiwany wynik</w:t>
             </w:r>
@@ -1025,7 +1692,7 @@
             <w:r>
               <w:rPr>
                 <w:b/>
-                <w:sz w:val="18"/>
+                <w:sz w:val="17"/>
               </w:rPr>
               <w:t>Tester</w:t>
             </w:r>
@@ -1040,7 +1707,7 @@
           <w:p>
             <w:r>
               <w:rPr>
-                <w:sz w:val="18"/>
+                <w:sz w:val="17"/>
               </w:rPr>
               <w:t>T1</w:t>
             </w:r>
@@ -1053,9 +1720,9 @@
           <w:p>
             <w:r>
               <w:rPr>
-                <w:sz w:val="18"/>
+                <w:sz w:val="17"/>
               </w:rPr>
-              <w:t>Dodawanie klienta – dane poprawne</w:t>
+              <w:t>Klient – dane poprawne</w:t>
             </w:r>
           </w:p>
         </w:tc>
@@ -1066,9 +1733,9 @@
           <w:p>
             <w:r>
               <w:rPr>
-                <w:sz w:val="18"/>
+                <w:sz w:val="17"/>
               </w:rPr>
-              <w:t>Wprowadzenie imienia, nazwiska i 9-cyfrowego telefonu</w:t>
+              <w:t>Imię, nazwisko, 9-cyfrowy telefon</w:t>
             </w:r>
           </w:p>
         </w:tc>
@@ -1079,9 +1746,9 @@
           <w:p>
             <w:r>
               <w:rPr>
-                <w:sz w:val="18"/>
+                <w:sz w:val="17"/>
               </w:rPr>
-              <w:t>Klient zapisany w bazie, komunikat potwierdzający</w:t>
+              <w:t>Klient zapisany, komunikat OK</w:t>
             </w:r>
           </w:p>
         </w:tc>
@@ -1092,7 +1759,7 @@
           <w:p>
             <w:r>
               <w:rPr>
-                <w:sz w:val="18"/>
+                <w:sz w:val="17"/>
               </w:rPr>
               <w:t>Maciej</w:t>
             </w:r>
@@ -1107,7 +1774,7 @@
           <w:p>
             <w:r>
               <w:rPr>
-                <w:sz w:val="18"/>
+                <w:sz w:val="17"/>
               </w:rPr>
               <w:t>T2</w:t>
             </w:r>
@@ -1120,9 +1787,9 @@
           <w:p>
             <w:r>
               <w:rPr>
-                <w:sz w:val="18"/>
+                <w:sz w:val="17"/>
               </w:rPr>
-              <w:t>Dodawanie klienta – walidacja telefonu</w:t>
+              <w:t>Klient – walidacja telefonu</w:t>
             </w:r>
           </w:p>
         </w:tc>
@@ -1133,9 +1800,9 @@
           <w:p>
             <w:r>
               <w:rPr>
-                <w:sz w:val="18"/>
+                <w:sz w:val="17"/>
               </w:rPr>
-              <w:t>Wprowadzenie telefonu z literami lub o złej długości</w:t>
+              <w:t>Telefon z literami / zła długość</w:t>
             </w:r>
           </w:p>
         </w:tc>
@@ -1146,9 +1813,9 @@
           <w:p>
             <w:r>
               <w:rPr>
-                <w:sz w:val="18"/>
+                <w:sz w:val="17"/>
               </w:rPr>
-              <w:t>Komunikat błędu, klient NIE zostaje zapisany</w:t>
+              <w:t>Błąd, klient NIE zapisany</w:t>
             </w:r>
           </w:p>
         </w:tc>
@@ -1159,7 +1826,7 @@
           <w:p>
             <w:r>
               <w:rPr>
-                <w:sz w:val="18"/>
+                <w:sz w:val="17"/>
               </w:rPr>
               <w:t>Maciej</w:t>
             </w:r>
@@ -1174,7 +1841,7 @@
           <w:p>
             <w:r>
               <w:rPr>
-                <w:sz w:val="18"/>
+                <w:sz w:val="17"/>
               </w:rPr>
               <w:t>T3</w:t>
             </w:r>
@@ -1187,9 +1854,9 @@
           <w:p>
             <w:r>
               <w:rPr>
-                <w:sz w:val="18"/>
+                <w:sz w:val="17"/>
               </w:rPr>
-              <w:t>Dodawanie pojazdu – walidacja VIN</w:t>
+              <w:t>Pojazd – walidacja VIN</w:t>
             </w:r>
           </w:p>
         </w:tc>
@@ -1200,9 +1867,9 @@
           <w:p>
             <w:r>
               <w:rPr>
-                <w:sz w:val="18"/>
+                <w:sz w:val="17"/>
               </w:rPr>
-              <w:t>Wprowadzenie numeru VIN krótszego/dłuższego niż 17 znaków</w:t>
+              <w:t>VIN ≠ 17 znaków</w:t>
             </w:r>
           </w:p>
         </w:tc>
@@ -1213,9 +1880,9 @@
           <w:p>
             <w:r>
               <w:rPr>
-                <w:sz w:val="18"/>
+                <w:sz w:val="17"/>
               </w:rPr>
-              <w:t>Komunikat błędu, pojazd NIE zostaje zapisany</w:t>
+              <w:t>Błąd, pojazd NIE zapisany</w:t>
             </w:r>
           </w:p>
         </w:tc>
@@ -1226,7 +1893,7 @@
           <w:p>
             <w:r>
               <w:rPr>
-                <w:sz w:val="18"/>
+                <w:sz w:val="17"/>
               </w:rPr>
               <w:t>Maciej</w:t>
             </w:r>
@@ -1241,7 +1908,7 @@
           <w:p>
             <w:r>
               <w:rPr>
-                <w:sz w:val="18"/>
+                <w:sz w:val="17"/>
               </w:rPr>
               <w:t>T4</w:t>
             </w:r>
@@ -1254,9 +1921,9 @@
           <w:p>
             <w:r>
               <w:rPr>
-                <w:sz w:val="18"/>
+                <w:sz w:val="17"/>
               </w:rPr>
-              <w:t>Dodawanie naprawy z mechanikiem</w:t>
+              <w:t>Naprawa z mechanikiem</w:t>
             </w:r>
           </w:p>
         </w:tc>
@@ -1267,9 +1934,9 @@
           <w:p>
             <w:r>
               <w:rPr>
-                <w:sz w:val="18"/>
+                <w:sz w:val="17"/>
               </w:rPr>
-              <w:t>Utworzenie naprawy, podanie mechanika</w:t>
+              <w:t>Nowa naprawa + nazwa mechanika</w:t>
             </w:r>
           </w:p>
         </w:tc>
@@ -1280,9 +1947,9 @@
           <w:p>
             <w:r>
               <w:rPr>
-                <w:sz w:val="18"/>
+                <w:sz w:val="17"/>
               </w:rPr>
-              <w:t>Naprawa zapisana ze statusem „Przyjęte" i przypisanym mechanikiem</w:t>
+              <w:t>Status „Przyjęte", mechanik przypisany</w:t>
             </w:r>
           </w:p>
         </w:tc>
@@ -1293,7 +1960,7 @@
           <w:p>
             <w:r>
               <w:rPr>
-                <w:sz w:val="18"/>
+                <w:sz w:val="17"/>
               </w:rPr>
               <w:t>Mikhail</w:t>
             </w:r>
@@ -1308,7 +1975,7 @@
           <w:p>
             <w:r>
               <w:rPr>
-                <w:sz w:val="18"/>
+                <w:sz w:val="17"/>
               </w:rPr>
               <w:t>T5</w:t>
             </w:r>
@@ -1321,7 +1988,7 @@
           <w:p>
             <w:r>
               <w:rPr>
-                <w:sz w:val="18"/>
+                <w:sz w:val="17"/>
               </w:rPr>
               <w:t>Zmiana statusu zlecenia</w:t>
             </w:r>
@@ -1334,9 +2001,9 @@
           <w:p>
             <w:r>
               <w:rPr>
-                <w:sz w:val="18"/>
+                <w:sz w:val="17"/>
               </w:rPr>
-              <w:t>Zmiana statusu z „Przyjęte" na „W trakcie naprawy", potem na „Zakończone"</w:t>
+              <w:t>Przyjęte → W trakcie → Zakończone</w:t>
             </w:r>
           </w:p>
         </w:tc>
@@ -1347,9 +2014,9 @@
           <w:p>
             <w:r>
               <w:rPr>
-                <w:sz w:val="18"/>
+                <w:sz w:val="17"/>
               </w:rPr>
-              <w:t>Status zmieniony, widoczny na liście zleceń</w:t>
+              <w:t>Status zmieniony na liście</w:t>
             </w:r>
           </w:p>
         </w:tc>
@@ -1360,7 +2027,7 @@
           <w:p>
             <w:r>
               <w:rPr>
-                <w:sz w:val="18"/>
+                <w:sz w:val="17"/>
               </w:rPr>
               <w:t>Mikhail</w:t>
             </w:r>
@@ -1375,7 +2042,7 @@
           <w:p>
             <w:r>
               <w:rPr>
-                <w:sz w:val="18"/>
+                <w:sz w:val="17"/>
               </w:rPr>
               <w:t>T6</w:t>
             </w:r>
@@ -1388,9 +2055,9 @@
           <w:p>
             <w:r>
               <w:rPr>
-                <w:sz w:val="18"/>
+                <w:sz w:val="17"/>
               </w:rPr>
-              <w:t>Magazyn części – dodawanie</w:t>
+              <w:t>Części – dodawanie</w:t>
             </w:r>
           </w:p>
         </w:tc>
@@ -1401,9 +2068,9 @@
           <w:p>
             <w:r>
               <w:rPr>
-                <w:sz w:val="18"/>
+                <w:sz w:val="17"/>
               </w:rPr>
-              <w:t>Dodanie części z nazwą, ceną, ilością i min. stanem</w:t>
+              <w:t>Nowa część: nazwa, cena, ilość, min</w:t>
             </w:r>
           </w:p>
         </w:tc>
@@ -1414,7 +2081,7 @@
           <w:p>
             <w:r>
               <w:rPr>
-                <w:sz w:val="18"/>
+                <w:sz w:val="17"/>
               </w:rPr>
               <w:t>Część widoczna w magazynie</w:t>
             </w:r>
@@ -1427,7 +2094,7 @@
           <w:p>
             <w:r>
               <w:rPr>
-                <w:sz w:val="18"/>
+                <w:sz w:val="17"/>
               </w:rPr>
               <w:t>Mikhail</w:t>
             </w:r>
@@ -1442,7 +2109,7 @@
           <w:p>
             <w:r>
               <w:rPr>
-                <w:sz w:val="18"/>
+                <w:sz w:val="17"/>
               </w:rPr>
               <w:t>T7</w:t>
             </w:r>
@@ -1455,9 +2122,9 @@
           <w:p>
             <w:r>
               <w:rPr>
-                <w:sz w:val="18"/>
+                <w:sz w:val="17"/>
               </w:rPr>
-              <w:t>Magazyn części – alert niskiego stanu</w:t>
+              <w:t>Części – alert niskiego stanu</w:t>
             </w:r>
           </w:p>
         </w:tc>
@@ -1468,9 +2135,9 @@
           <w:p>
             <w:r>
               <w:rPr>
-                <w:sz w:val="18"/>
+                <w:sz w:val="17"/>
               </w:rPr>
-              <w:t>Ustawienie ilości poniżej min. stanu</w:t>
+              <w:t>Ilość &lt; min_stan</w:t>
             </w:r>
           </w:p>
         </w:tc>
@@ -1481,9 +2148,9 @@
           <w:p>
             <w:r>
               <w:rPr>
-                <w:sz w:val="18"/>
+                <w:sz w:val="17"/>
               </w:rPr>
-              <w:t>Automatyczny alert „NISKI STAN!" przy danej części</w:t>
+              <w:t>Alert „⚠ NISKI STAN!"</w:t>
             </w:r>
           </w:p>
         </w:tc>
@@ -1494,7 +2161,7 @@
           <w:p>
             <w:r>
               <w:rPr>
-                <w:sz w:val="18"/>
+                <w:sz w:val="17"/>
               </w:rPr>
               <w:t>Mikhail</w:t>
             </w:r>
@@ -1509,7 +2176,7 @@
           <w:p>
             <w:r>
               <w:rPr>
-                <w:sz w:val="18"/>
+                <w:sz w:val="17"/>
               </w:rPr>
               <w:t>T8</w:t>
             </w:r>
@@ -1522,9 +2189,9 @@
           <w:p>
             <w:r>
               <w:rPr>
-                <w:sz w:val="18"/>
+                <w:sz w:val="17"/>
               </w:rPr>
-              <w:t>Moduł rozliczeniowy – kalkulacja</w:t>
+              <w:t>Rozliczenie – kalkulacja</w:t>
             </w:r>
           </w:p>
         </w:tc>
@@ -1535,9 +2202,9 @@
           <w:p>
             <w:r>
               <w:rPr>
-                <w:sz w:val="18"/>
+                <w:sz w:val="17"/>
               </w:rPr>
-              <w:t>Sprawdzenie wyliczenia: 2.5 rbh × 150 PLN + 350 PLN części</w:t>
+              <w:t>2.5 rbh × 150 + 350 części</w:t>
             </w:r>
           </w:p>
         </w:tc>
@@ -1548,9 +2215,9 @@
           <w:p>
             <w:r>
               <w:rPr>
-                <w:sz w:val="18"/>
+                <w:sz w:val="17"/>
               </w:rPr>
-              <w:t>Suma końcowa = 725 PLN</w:t>
+              <w:t>Suma = 725 PLN</w:t>
             </w:r>
           </w:p>
         </w:tc>
@@ -1561,7 +2228,7 @@
           <w:p>
             <w:r>
               <w:rPr>
-                <w:sz w:val="18"/>
+                <w:sz w:val="17"/>
               </w:rPr>
               <w:t>Maciej</w:t>
             </w:r>
@@ -1576,7 +2243,7 @@
           <w:p>
             <w:r>
               <w:rPr>
-                <w:sz w:val="18"/>
+                <w:sz w:val="17"/>
               </w:rPr>
               <w:t>T9</w:t>
             </w:r>
@@ -1589,9 +2256,9 @@
           <w:p>
             <w:r>
               <w:rPr>
-                <w:sz w:val="18"/>
+                <w:sz w:val="17"/>
               </w:rPr>
-              <w:t>Historia serwisowa – filtrowanie po VIN</w:t>
+              <w:t>Historia – filtr VIN</w:t>
             </w:r>
           </w:p>
         </w:tc>
@@ -1602,9 +2269,9 @@
           <w:p>
             <w:r>
               <w:rPr>
-                <w:sz w:val="18"/>
+                <w:sz w:val="17"/>
               </w:rPr>
-              <w:t>Wyszukanie historii napraw po numerze VIN pojazdu</w:t>
+              <w:t>Wyszukanie po numerze VIN</w:t>
             </w:r>
           </w:p>
         </w:tc>
@@ -1615,9 +2282,9 @@
           <w:p>
             <w:r>
               <w:rPr>
-                <w:sz w:val="18"/>
+                <w:sz w:val="17"/>
               </w:rPr>
-              <w:t>Wyświetlenie listy napraw danego pojazdu z kosztami</w:t>
+              <w:t>Lista napraw danego pojazdu</w:t>
             </w:r>
           </w:p>
         </w:tc>
@@ -1628,7 +2295,7 @@
           <w:p>
             <w:r>
               <w:rPr>
-                <w:sz w:val="18"/>
+                <w:sz w:val="17"/>
               </w:rPr>
               <w:t>Mikhail</w:t>
             </w:r>
@@ -1643,7 +2310,7 @@
           <w:p>
             <w:r>
               <w:rPr>
-                <w:sz w:val="18"/>
+                <w:sz w:val="17"/>
               </w:rPr>
               <w:t>T10</w:t>
             </w:r>
@@ -1656,9 +2323,9 @@
           <w:p>
             <w:r>
               <w:rPr>
-                <w:sz w:val="18"/>
+                <w:sz w:val="17"/>
               </w:rPr>
-              <w:t>Historia serwisowa – filtrowanie po nazwisku</w:t>
+              <w:t>Historia – filtr nazwisko</w:t>
             </w:r>
           </w:p>
         </w:tc>
@@ -1669,9 +2336,9 @@
           <w:p>
             <w:r>
               <w:rPr>
-                <w:sz w:val="18"/>
+                <w:sz w:val="17"/>
               </w:rPr>
-              <w:t>Wyszukanie historii po fragmencie nazwiska klienta</w:t>
+              <w:t>Fragment nazwiska klienta</w:t>
             </w:r>
           </w:p>
         </w:tc>
@@ -1682,9 +2349,9 @@
           <w:p>
             <w:r>
               <w:rPr>
-                <w:sz w:val="18"/>
+                <w:sz w:val="17"/>
               </w:rPr>
-              <w:t>Wyświetlenie pasujących wyników (wyszukiwanie częściowe LIKE)</w:t>
+              <w:t>Pasujące wyniki (LIKE)</w:t>
             </w:r>
           </w:p>
         </w:tc>
@@ -1695,7 +2362,7 @@
           <w:p>
             <w:r>
               <w:rPr>
-                <w:sz w:val="18"/>
+                <w:sz w:val="17"/>
               </w:rPr>
               <w:t>Mikhail</w:t>
             </w:r>
@@ -1708,18 +2375,25 @@
         <w:pStyle w:val="Heading2"/>
       </w:pPr>
       <w:r>
-        <w:t>3. Czas trwania testów</w:t>
+        <w:t>6.3 Czas trwania i przydział testerów</w:t>
       </w:r>
     </w:p>
     <w:p>
       <w:r>
-        <w:t>Łączny czas przeznaczony na testowanie: 5 roboczogodzin.</w:t>
+        <w:t>Łączny czas testowania: 5 roboczogodzin.</w:t>
         <w:br/>
         <w:t>- Testy jednostkowe poszczególnych modułów: 3 rbh (po ~0.5 rbh na moduł)</w:t>
         <w:br/>
         <w:t>- Testy integracyjne (współpraca modułów z bazą danych): 1 rbh</w:t>
         <w:br/>
         <w:t>- Testy walidacji danych wejściowych i scenariuszy błędnych: 1 rbh</w:t>
+        <w:br/>
+        <w:br/>
+        <w:t>Testowanie krzyżowe:</w:t>
+        <w:br/>
+        <w:t>- Maciej Jagodziński testuje moduły Mikhail'a: zlecenia, części, historia (T4-T7, T9-T10)</w:t>
+        <w:br/>
+        <w:t>- Mikhail Rodia testuje moduły Maciej'a: ewidencja, rozliczenia (T1-T3, T8)</w:t>
       </w:r>
     </w:p>
     <w:p>
@@ -1727,32 +2401,12 @@
         <w:pStyle w:val="Heading2"/>
       </w:pPr>
       <w:r>
-        <w:t>4. Kto testuje</w:t>
+        <w:t>6.4 Wyniki testów</w:t>
       </w:r>
     </w:p>
     <w:p>
       <w:r>
-        <w:t>Każdy członek zespołu testuje przede wszystkim moduły, za które odpowiada drugi członek zespołu (testowanie krzyżowe), co zapewnia obiektywność oceny:</w:t>
-        <w:br/>
-        <w:t>- Maciej Jagodziński testuje: moduły zleceń, bazy części i historii serwisowej (implementowane przez Mikhail)</w:t>
-        <w:br/>
-        <w:t>- Mikhail Rodia testuje: moduły ewidencji klientów/pojazdów i rozliczeń (implementowane przez Maciej)</w:t>
-        <w:br/>
-        <w:br/>
-        <w:t>Dodatkowo oba członkowie zespołu wspólnie przeprowadzają testy integracyjne sprawdzające poprawność relacji w bazie danych (klucze obce, spójność transakcji, rollback).</w:t>
-      </w:r>
-    </w:p>
-    <w:p>
-      <w:pPr>
-        <w:pStyle w:val="Heading2"/>
-      </w:pPr>
-      <w:r>
-        <w:t>5. Wyniki testów</w:t>
-      </w:r>
-    </w:p>
-    <w:p>
-      <w:r>
-        <w:t>Wszystkie 10 scenariuszy testowych (T1–T10) zakończone wynikiem pozytywnym (PASS). Nie wykryto błędów krytycznych. Drobne poprawki kosmetyczne (formatowanie komunikatów) zostały naniesione na bieżąco.</w:t>
+        <w:t>Wszystkie 10 scenariuszy testowych (T1–T10) zakończone wynikiem pozytywnym (PASS). Nie wykryto błędów krytycznych.</w:t>
       </w:r>
     </w:p>
     <w:p>
@@ -1765,7 +2419,7 @@
         <w:pStyle w:val="Heading1"/>
       </w:pPr>
       <w:r>
-        <w:t>Instrukcja obsługi systemu „Auto-Expert"</w:t>
+        <w:t>7. Instrukcja obsługi systemu</w:t>
       </w:r>
     </w:p>
     <w:p>
@@ -1773,7 +2427,7 @@
         <w:pStyle w:val="Heading2"/>
       </w:pPr>
       <w:r>
-        <w:t>Wymagania systemowe</w:t>
+        <w:t>7.1 Wymagania systemowe</w:t>
       </w:r>
     </w:p>
     <w:p>
@@ -1805,7 +2459,7 @@
         <w:pStyle w:val="Heading2"/>
       </w:pPr>
       <w:r>
-        <w:t>Uruchomienie aplikacji</w:t>
+        <w:t>7.2 Kompilacja i uruchomienie</w:t>
       </w:r>
     </w:p>
     <w:p>
@@ -1824,7 +2478,7 @@
     </w:p>
     <w:p>
       <w:r>
-        <w:t>Uruchomienie:</w:t>
+        <w:t>Uruchomienie (macOS/Linux):</w:t>
       </w:r>
     </w:p>
     <w:p>
@@ -1838,7 +2492,16 @@
     </w:p>
     <w:p>
       <w:r>
-        <w:t>(Na Windows zamienić : na ; w classpath)</w:t>
+        <w:t>Uruchomienie (Windows):</w:t>
+      </w:r>
+    </w:p>
+    <w:p>
+      <w:r>
+        <w:rPr>
+          <w:rFonts w:ascii="Consolas" w:hAnsi="Consolas"/>
+          <w:sz w:val="20"/>
+        </w:rPr>
+        <w:t>java -cp "bin;lib\sqlite-jdbc-3.53.1.0.jar" App</w:t>
       </w:r>
     </w:p>
     <w:p>
@@ -1846,12 +2509,12 @@
         <w:pStyle w:val="Heading2"/>
       </w:pPr>
       <w:r>
-        <w:t>Obsługa menu głównego</w:t>
+        <w:t>7.3 Obsługa menu</w:t>
       </w:r>
     </w:p>
     <w:p>
       <w:r>
-        <w:t>Po uruchomieniu aplikacji wyświetla się menu główne z 10 opcjami (0-9). Należy wpisać numer opcji i nacisnąć Enter. Aby wrócić z podmenu do menu głównego, należy wybrać opcję 0.</w:t>
+        <w:t>Po uruchomieniu wyświetla się menu główne z opcjami 0-9. Należy wpisać numer opcji i nacisnąć Enter. Opcje 7, 8 i 9 otwierają podmenu z własnymi opcjami — powrót do menu głównego przez 0.</w:t>
       </w:r>
     </w:p>
     <w:p>
@@ -1859,11 +2522,10 @@
         <w:rPr>
           <w:b/>
         </w:rPr>
-        <w:t>Opcja 1 – Dodaj nowego klienta</w:t>
+        <w:t xml:space="preserve">Opcja 1 – Dodaj klienta: </w:t>
       </w:r>
       <w:r>
-        <w:br/>
-        <w:t>System prosi o podanie imienia, nazwiska i numeru telefonu (dokładnie 9 cyfr). Po walidacji klient zostaje zapisany w bazie danych.</w:t>
+        <w:t>Imię, nazwisko, telefon (dokładnie 9 cyfr). Walidacja automatyczna.</w:t>
       </w:r>
     </w:p>
     <w:p>
@@ -1871,11 +2533,10 @@
         <w:rPr>
           <w:b/>
         </w:rPr>
-        <w:t>Opcja 2 – Wyświetl wszystkich klientów</w:t>
+        <w:t xml:space="preserve">Opcja 2 – Lista klientów: </w:t>
       </w:r>
       <w:r>
-        <w:br/>
-        <w:t>Wyświetla listę wszystkich klientów z ich ID, imieniem, nazwiskiem i numerem telefonu.</w:t>
+        <w:t>ID, imię, nazwisko, telefon wszystkich klientów.</w:t>
       </w:r>
     </w:p>
     <w:p>
@@ -1883,11 +2544,10 @@
         <w:rPr>
           <w:b/>
         </w:rPr>
-        <w:t>Opcja 3 – Dodaj nowy pojazd</w:t>
+        <w:t xml:space="preserve">Opcja 3 – Dodaj pojazd: </w:t>
       </w:r>
       <w:r>
-        <w:br/>
-        <w:t>System prosi o 17-znakowy numer VIN, markę, model oraz ID właściciela (klienta). Pojazd zostaje przypisany do klienta.</w:t>
+        <w:t>17-znakowy VIN, marka, model, ID właściciela.</w:t>
       </w:r>
     </w:p>
     <w:p>
@@ -1895,11 +2555,10 @@
         <w:rPr>
           <w:b/>
         </w:rPr>
-        <w:t>Opcja 4 – Wyświetl wszystkie pojazdy</w:t>
+        <w:t xml:space="preserve">Opcja 4 – Lista pojazdów: </w:t>
       </w:r>
       <w:r>
-        <w:br/>
-        <w:t>Wyświetla listę pojazdów z numerami VIN, marką, modelem i danymi właściciela.</w:t>
+        <w:t>VIN, marka, model, właściciel.</w:t>
       </w:r>
     </w:p>
     <w:p>
@@ -1907,11 +2566,10 @@
         <w:rPr>
           <w:b/>
         </w:rPr>
-        <w:t>Opcja 5 – Dodaj nową naprawę</w:t>
+        <w:t xml:space="preserve">Opcja 5 – Nowa naprawa: </w:t>
       </w:r>
       <w:r>
-        <w:br/>
-        <w:t>System prosi o opis usterki, liczbę roboczogodzin, koszt części, VIN pojazdu i opcjonalnie imię mechanika.</w:t>
+        <w:t>Opis usterki, roboczogodziny, koszt części, VIN, mechanik (opcjonalnie).</w:t>
       </w:r>
     </w:p>
     <w:p>
@@ -1919,11 +2577,10 @@
         <w:rPr>
           <w:b/>
         </w:rPr>
-        <w:t>Opcja 6 – Moduł rozliczeniowy</w:t>
+        <w:t xml:space="preserve">Opcja 6 – Rozliczenia: </w:t>
       </w:r>
       <w:r>
-        <w:br/>
-        <w:t>Wyświetla faktury dla wszystkich napraw z automatycznym wyliczeniem kosztów. Dla każdej faktury można wybrać płatność gotówkową lub bezgotówkową (symulacja terminala).</w:t>
+        <w:t>Faktury z kalkulacją + wybór płatności gotówkowej/bezgotówkowej.</w:t>
       </w:r>
     </w:p>
     <w:p>
@@ -1931,11 +2588,10 @@
         <w:rPr>
           <w:b/>
         </w:rPr>
-        <w:t>Opcja 7 – Zarządzanie zleceniami</w:t>
+        <w:t xml:space="preserve">Opcja 7 – Zlecenia: </w:t>
       </w:r>
       <w:r>
-        <w:br/>
-        <w:t>Podmenu umożliwiające przeglądanie zleceń i zmianę statusów (Przyjęte → W trakcie naprawy → Zakończone).</w:t>
+        <w:t>Lista zleceń ze statusami. Zmiana statusu: Przyjęte → W trakcie → Zakończone.</w:t>
       </w:r>
     </w:p>
     <w:p>
@@ -1943,11 +2599,10 @@
         <w:rPr>
           <w:b/>
         </w:rPr>
-        <w:t>Opcja 8 – Zarządzanie bazą części</w:t>
+        <w:t xml:space="preserve">Opcja 8 – Magazyn części: </w:t>
       </w:r>
       <w:r>
-        <w:br/>
-        <w:t>Podmenu umożliwiające przeglądanie magazynu (z alertami niskiego stanu), dodawanie nowych części i aktualizację stanów magazynowych.</w:t>
+        <w:t>Lista z alertami niskiego stanu. Dodawanie i aktualizacja ilości.</w:t>
       </w:r>
     </w:p>
     <w:p>
@@ -1955,11 +2610,10 @@
         <w:rPr>
           <w:b/>
         </w:rPr>
-        <w:t>Opcja 9 – Archiwum historii serwisowej</w:t>
+        <w:t xml:space="preserve">Opcja 9 – Historia serwisowa: </w:t>
       </w:r>
       <w:r>
-        <w:br/>
-        <w:t>Podmenu umożliwiające wyszukiwanie historii napraw po numerze VIN pojazdu lub po nazwisku klienta.</w:t>
+        <w:t>Wyszukiwanie po VIN lub nazwisku klienta.</w:t>
       </w:r>
     </w:p>
     <w:p>
@@ -1972,310 +2626,422 @@
         <w:pStyle w:val="Heading1"/>
       </w:pPr>
       <w:r>
-        <w:t>Zrzuty ekranowe (output konsoli)</w:t>
-      </w:r>
-    </w:p>
-    <w:p>
-      <w:r>
-        <w:rPr>
-          <w:b/>
-        </w:rPr>
-        <w:t>Menu główne systemu:</w:t>
+        <w:t>8. Zrzuty ekranowe</w:t>
       </w:r>
     </w:p>
     <w:p>
       <w:pPr>
-        <w:ind w:left="432"/>
+        <w:jc w:val="center"/>
+      </w:pPr>
+      <w:r>
+        <w:drawing>
+          <wp:inline xmlns:a="http://schemas.openxmlformats.org/drawingml/2006/main" xmlns:pic="http://schemas.openxmlformats.org/drawingml/2006/picture">
+            <wp:extent cx="5303520" cy="4037249"/>
+            <wp:docPr id="1" name="Picture 1"/>
+            <wp:cNvGraphicFramePr>
+              <a:graphicFrameLocks noChangeAspect="1"/>
+            </wp:cNvGraphicFramePr>
+            <a:graphic>
+              <a:graphicData uri="http://schemas.openxmlformats.org/drawingml/2006/picture">
+                <pic:pic>
+                  <pic:nvPicPr>
+                    <pic:cNvPr id="0" name="screen_menu.png"/>
+                    <pic:cNvPicPr/>
+                  </pic:nvPicPr>
+                  <pic:blipFill>
+                    <a:blip r:embed="rId9"/>
+                    <a:stretch>
+                      <a:fillRect/>
+                    </a:stretch>
+                  </pic:blipFill>
+                  <pic:spPr>
+                    <a:xfrm>
+                      <a:off x="0" y="0"/>
+                      <a:ext cx="5303520" cy="4037249"/>
+                    </a:xfrm>
+                    <a:prstGeom prst="rect"/>
+                  </pic:spPr>
+                </pic:pic>
+              </a:graphicData>
+            </a:graphic>
+          </wp:inline>
+        </w:drawing>
+      </w:r>
+    </w:p>
+    <w:p>
+      <w:pPr>
+        <w:jc w:val="center"/>
       </w:pPr>
       <w:r>
         <w:rPr>
-          <w:rFonts w:ascii="Consolas" w:hAnsi="Consolas"/>
+          <w:i/>
           <w:sz w:val="18"/>
         </w:rPr>
-        <w:t>================================================</w:t>
-        <w:br/>
-        <w:t xml:space="preserve">          SYSTEM ZARZĄDZANIA AUTO-EXPERT        </w:t>
-        <w:br/>
-        <w:t>================================================</w:t>
-        <w:br/>
-        <w:t>1.  Dodaj nowego klienta</w:t>
-        <w:br/>
-        <w:t>2.  Wyświetl wszystkich klientów</w:t>
-        <w:br/>
-        <w:t>3.  Dodaj nowy pojazd (przypisz do klienta)</w:t>
-        <w:br/>
-        <w:t>4.  Wyświetl wszystkie pojazdy</w:t>
-        <w:br/>
-        <w:t>5.  Dodaj nową naprawę dla pojazdu</w:t>
-        <w:br/>
-        <w:t>6.  Pokaż MODUŁ ROZLICZENIOWY (Faktury)</w:t>
-        <w:br/>
-        <w:t>7.  Zarządzanie zleceniami (statusy)</w:t>
-        <w:br/>
-        <w:t>8.  Zarządzanie bazą części</w:t>
-        <w:br/>
-        <w:t>9.  Archiwum historii serwisowej</w:t>
-        <w:br/>
-        <w:t>0.  Wyjście z programu</w:t>
-        <w:br/>
-        <w:t>================================================</w:t>
-        <w:br/>
-        <w:t>Wybierz opcję: _</w:t>
+        <w:t>Rysunek 1: Menu główne systemu Auto-Expert</w:t>
       </w:r>
     </w:p>
     <w:p/>
     <w:p>
+      <w:pPr>
+        <w:jc w:val="center"/>
+      </w:pPr>
       <w:r>
-        <w:rPr>
-          <w:b/>
-        </w:rPr>
-        <w:t>Lista klientów (opcja 2):</w:t>
+        <w:drawing>
+          <wp:inline xmlns:a="http://schemas.openxmlformats.org/drawingml/2006/main" xmlns:pic="http://schemas.openxmlformats.org/drawingml/2006/picture">
+            <wp:extent cx="5303520" cy="2738756"/>
+            <wp:docPr id="2" name="Picture 2"/>
+            <wp:cNvGraphicFramePr>
+              <a:graphicFrameLocks noChangeAspect="1"/>
+            </wp:cNvGraphicFramePr>
+            <a:graphic>
+              <a:graphicData uri="http://schemas.openxmlformats.org/drawingml/2006/picture">
+                <pic:pic>
+                  <pic:nvPicPr>
+                    <pic:cNvPr id="0" name="screen_klient.png"/>
+                    <pic:cNvPicPr/>
+                  </pic:nvPicPr>
+                  <pic:blipFill>
+                    <a:blip r:embed="rId10"/>
+                    <a:stretch>
+                      <a:fillRect/>
+                    </a:stretch>
+                  </pic:blipFill>
+                  <pic:spPr>
+                    <a:xfrm>
+                      <a:off x="0" y="0"/>
+                      <a:ext cx="5303520" cy="2738756"/>
+                    </a:xfrm>
+                    <a:prstGeom prst="rect"/>
+                  </pic:spPr>
+                </pic:pic>
+              </a:graphicData>
+            </a:graphic>
+          </wp:inline>
+        </w:drawing>
       </w:r>
     </w:p>
     <w:p>
       <w:pPr>
-        <w:ind w:left="432"/>
+        <w:jc w:val="center"/>
       </w:pPr>
       <w:r>
         <w:rPr>
-          <w:rFonts w:ascii="Consolas" w:hAnsi="Consolas"/>
+          <w:i/>
           <w:sz w:val="18"/>
         </w:rPr>
-        <w:t>================ LISTA KLIENTÓW ================</w:t>
-        <w:br/>
-        <w:t>ID: 1 | Jan Kowalski | Tel: 123456789</w:t>
-        <w:br/>
-        <w:t>ID: 2 | Anna Nowak | Tel: 987654321</w:t>
-        <w:br/>
-        <w:t>================================================</w:t>
+        <w:t>Rysunek 2: Dodawanie klienta z walidacją numeru telefonu</w:t>
       </w:r>
     </w:p>
     <w:p/>
     <w:p>
+      <w:pPr>
+        <w:jc w:val="center"/>
+      </w:pPr>
       <w:r>
-        <w:rPr>
-          <w:b/>
-        </w:rPr>
-        <w:t>Lista pojazdów (opcja 4):</w:t>
+        <w:drawing>
+          <wp:inline xmlns:a="http://schemas.openxmlformats.org/drawingml/2006/main" xmlns:pic="http://schemas.openxmlformats.org/drawingml/2006/picture">
+            <wp:extent cx="5303520" cy="2738756"/>
+            <wp:docPr id="3" name="Picture 3"/>
+            <wp:cNvGraphicFramePr>
+              <a:graphicFrameLocks noChangeAspect="1"/>
+            </wp:cNvGraphicFramePr>
+            <a:graphic>
+              <a:graphicData uri="http://schemas.openxmlformats.org/drawingml/2006/picture">
+                <pic:pic>
+                  <pic:nvPicPr>
+                    <pic:cNvPr id="0" name="screen_lista.png"/>
+                    <pic:cNvPicPr/>
+                  </pic:nvPicPr>
+                  <pic:blipFill>
+                    <a:blip r:embed="rId11"/>
+                    <a:stretch>
+                      <a:fillRect/>
+                    </a:stretch>
+                  </pic:blipFill>
+                  <pic:spPr>
+                    <a:xfrm>
+                      <a:off x="0" y="0"/>
+                      <a:ext cx="5303520" cy="2738756"/>
+                    </a:xfrm>
+                    <a:prstGeom prst="rect"/>
+                  </pic:spPr>
+                </pic:pic>
+              </a:graphicData>
+            </a:graphic>
+          </wp:inline>
+        </w:drawing>
       </w:r>
     </w:p>
     <w:p>
       <w:pPr>
-        <w:ind w:left="432"/>
+        <w:jc w:val="center"/>
       </w:pPr>
       <w:r>
         <w:rPr>
-          <w:rFonts w:ascii="Consolas" w:hAnsi="Consolas"/>
+          <w:i/>
           <w:sz w:val="18"/>
         </w:rPr>
-        <w:t>================ LISTA POJAZDÓW ================</w:t>
-        <w:br/>
-        <w:t>VIN: WDBRF61J21F123456 | Mercedes C200 | Właściciel: Jan Kowalski</w:t>
-        <w:br/>
-        <w:t>VIN: 1HGBH41JXMN109186 | BMW 320i | Właściciel: Anna Nowak</w:t>
-        <w:br/>
-        <w:t>================================================</w:t>
+        <w:t>Rysunek 3: Lista klientów i pojazdów w systemie</w:t>
       </w:r>
     </w:p>
     <w:p/>
     <w:p>
+      <w:pPr>
+        <w:jc w:val="center"/>
+      </w:pPr>
       <w:r>
-        <w:rPr>
-          <w:b/>
-        </w:rPr>
-        <w:t>Zarządzanie zleceniami – lista zleceń (opcja 7):</w:t>
+        <w:drawing>
+          <wp:inline xmlns:a="http://schemas.openxmlformats.org/drawingml/2006/main" xmlns:pic="http://schemas.openxmlformats.org/drawingml/2006/picture">
+            <wp:extent cx="5303520" cy="2577653"/>
+            <wp:docPr id="4" name="Picture 4"/>
+            <wp:cNvGraphicFramePr>
+              <a:graphicFrameLocks noChangeAspect="1"/>
+            </wp:cNvGraphicFramePr>
+            <a:graphic>
+              <a:graphicData uri="http://schemas.openxmlformats.org/drawingml/2006/picture">
+                <pic:pic>
+                  <pic:nvPicPr>
+                    <pic:cNvPr id="0" name="screen_vin.png"/>
+                    <pic:cNvPicPr/>
+                  </pic:nvPicPr>
+                  <pic:blipFill>
+                    <a:blip r:embed="rId12"/>
+                    <a:stretch>
+                      <a:fillRect/>
+                    </a:stretch>
+                  </pic:blipFill>
+                  <pic:spPr>
+                    <a:xfrm>
+                      <a:off x="0" y="0"/>
+                      <a:ext cx="5303520" cy="2577653"/>
+                    </a:xfrm>
+                    <a:prstGeom prst="rect"/>
+                  </pic:spPr>
+                </pic:pic>
+              </a:graphicData>
+            </a:graphic>
+          </wp:inline>
+        </w:drawing>
       </w:r>
     </w:p>
     <w:p>
       <w:pPr>
-        <w:ind w:left="432"/>
+        <w:jc w:val="center"/>
       </w:pPr>
       <w:r>
         <w:rPr>
-          <w:rFonts w:ascii="Consolas" w:hAnsi="Consolas"/>
+          <w:i/>
           <w:sz w:val="18"/>
         </w:rPr>
-        <w:t>================ LISTA ZLECEŃ ================</w:t>
-        <w:br/>
-        <w:t>Zlecenie #1 | Auto: Mercedes C200 (VIN: WDBRF61J21F123456)</w:t>
-        <w:br/>
-        <w:t xml:space="preserve">   Usterka: Wymiana klockow hamulcowych</w:t>
-        <w:br/>
-        <w:t xml:space="preserve">   Status: Przyjęte | Mechanik: Piotr Zielinski | Data: 2026-05-28</w:t>
-        <w:br/>
-        <w:t>------------------------------------------------</w:t>
-        <w:br/>
-        <w:t>Zlecenie #2 | Auto: BMW 320i (VIN: 1HGBH41JXMN109186)</w:t>
-        <w:br/>
-        <w:t xml:space="preserve">   Usterka: Wymiana oleju i filtrow</w:t>
-        <w:br/>
-        <w:t xml:space="preserve">   Status: W trakcie naprawy | Mechanik: Jan Mechanik | Data: 2026-05-29</w:t>
-        <w:br/>
-        <w:t>------------------------------------------------</w:t>
-        <w:br/>
-        <w:t>===============================================</w:t>
+        <w:t>Rysunek 4: Walidacja numeru VIN przy dodawaniu pojazdu</w:t>
       </w:r>
     </w:p>
     <w:p/>
     <w:p>
+      <w:pPr>
+        <w:jc w:val="center"/>
+      </w:pPr>
       <w:r>
-        <w:rPr>
-          <w:b/>
-        </w:rPr>
-        <w:t>Moduł rozliczeniowy – faktura (opcja 6):</w:t>
+        <w:drawing>
+          <wp:inline xmlns:a="http://schemas.openxmlformats.org/drawingml/2006/main" xmlns:pic="http://schemas.openxmlformats.org/drawingml/2006/picture">
+            <wp:extent cx="5303520" cy="4523781"/>
+            <wp:docPr id="5" name="Picture 5"/>
+            <wp:cNvGraphicFramePr>
+              <a:graphicFrameLocks noChangeAspect="1"/>
+            </wp:cNvGraphicFramePr>
+            <a:graphic>
+              <a:graphicData uri="http://schemas.openxmlformats.org/drawingml/2006/picture">
+                <pic:pic>
+                  <pic:nvPicPr>
+                    <pic:cNvPr id="0" name="screen_zlecenia.png"/>
+                    <pic:cNvPicPr/>
+                  </pic:nvPicPr>
+                  <pic:blipFill>
+                    <a:blip r:embed="rId13"/>
+                    <a:stretch>
+                      <a:fillRect/>
+                    </a:stretch>
+                  </pic:blipFill>
+                  <pic:spPr>
+                    <a:xfrm>
+                      <a:off x="0" y="0"/>
+                      <a:ext cx="5303520" cy="4523781"/>
+                    </a:xfrm>
+                    <a:prstGeom prst="rect"/>
+                  </pic:spPr>
+                </pic:pic>
+              </a:graphicData>
+            </a:graphic>
+          </wp:inline>
+        </w:drawing>
       </w:r>
     </w:p>
     <w:p>
       <w:pPr>
-        <w:ind w:left="432"/>
+        <w:jc w:val="center"/>
       </w:pPr>
       <w:r>
         <w:rPr>
-          <w:rFonts w:ascii="Consolas" w:hAnsi="Consolas"/>
+          <w:i/>
           <w:sz w:val="18"/>
         </w:rPr>
-        <w:t>================ MODUŁ ROZLICZENIOWY ================</w:t>
-        <w:br/>
-        <w:t>Faktura nr: 1 | Auto: Mercedes C200</w:t>
-        <w:br/>
-        <w:t xml:space="preserve"> -&gt; Usługa: Wymiana klockow hamulcowych</w:t>
-        <w:br/>
-        <w:t xml:space="preserve"> -&gt; Robocizna: 2.5 rbh x 150.0 PLN = 375.0 PLN</w:t>
-        <w:br/>
-        <w:t xml:space="preserve"> -&gt; Koszt części: 350.0 PLN</w:t>
-        <w:br/>
-        <w:t xml:space="preserve"> -&gt; ŁĄCZNIE DO ZAPŁATY: 725.0 PLN</w:t>
-        <w:br/>
-        <w:t>----------------------------------------------------</w:t>
-        <w:br/>
-        <w:t>Czy płatność bezgotówkowo kartą/telefonem? (T/N): T</w:t>
-        <w:br/>
-        <w:br/>
-        <w:t>[SYSTEM BANKOWY] Inicjalizacja połączenia z terminalem...</w:t>
-        <w:br/>
-        <w:t>[SYSTEM BANKOWY] Proszę przyłożyć kartę...</w:t>
-        <w:br/>
-        <w:t>[SYSTEM BANKOWY] Płatność autoryzowana! Pobrano: 725.0 PLN.</w:t>
-        <w:br/>
-        <w:t>=====================================================</w:t>
+        <w:t>Rysunek 5: Zarządzanie zleceniami — lista i zmiana statusu</w:t>
       </w:r>
     </w:p>
     <w:p/>
     <w:p>
+      <w:pPr>
+        <w:jc w:val="center"/>
+      </w:pPr>
       <w:r>
-        <w:rPr>
-          <w:b/>
-        </w:rPr>
-        <w:t>Magazyn części z alertem niskiego stanu (opcja 8):</w:t>
+        <w:drawing>
+          <wp:inline xmlns:a="http://schemas.openxmlformats.org/drawingml/2006/main" xmlns:pic="http://schemas.openxmlformats.org/drawingml/2006/picture">
+            <wp:extent cx="5303520" cy="4523781"/>
+            <wp:docPr id="6" name="Picture 6"/>
+            <wp:cNvGraphicFramePr>
+              <a:graphicFrameLocks noChangeAspect="1"/>
+            </wp:cNvGraphicFramePr>
+            <a:graphic>
+              <a:graphicData uri="http://schemas.openxmlformats.org/drawingml/2006/picture">
+                <pic:pic>
+                  <pic:nvPicPr>
+                    <pic:cNvPr id="0" name="screen_rozliczenie.png"/>
+                    <pic:cNvPicPr/>
+                  </pic:nvPicPr>
+                  <pic:blipFill>
+                    <a:blip r:embed="rId14"/>
+                    <a:stretch>
+                      <a:fillRect/>
+                    </a:stretch>
+                  </pic:blipFill>
+                  <pic:spPr>
+                    <a:xfrm>
+                      <a:off x="0" y="0"/>
+                      <a:ext cx="5303520" cy="4523781"/>
+                    </a:xfrm>
+                    <a:prstGeom prst="rect"/>
+                  </pic:spPr>
+                </pic:pic>
+              </a:graphicData>
+            </a:graphic>
+          </wp:inline>
+        </w:drawing>
       </w:r>
     </w:p>
     <w:p>
       <w:pPr>
-        <w:ind w:left="432"/>
+        <w:jc w:val="center"/>
       </w:pPr>
       <w:r>
         <w:rPr>
-          <w:rFonts w:ascii="Consolas" w:hAnsi="Consolas"/>
+          <w:i/>
           <w:sz w:val="18"/>
         </w:rPr>
-        <w:t>================ MAGAZYN CZĘŚCI ================</w:t>
-        <w:br/>
-        <w:t>ID: 2 | Filtr oleju | Cena: 45.0 PLN | Ilość: 3 szt. | Min: 5 szt. ⚠ NISKI STAN!</w:t>
-        <w:br/>
-        <w:t>ID: 1 | Klocki hamulcowe przod | Cena: 180.0 PLN | Ilość: 12 szt. | Min: 5 szt.</w:t>
-        <w:br/>
-        <w:t>ID: 3 | Olej silnikowy 5W30 1L | Cena: 35.0 PLN | Ilość: 20 szt. | Min: 10 szt.</w:t>
-        <w:br/>
-        <w:t>================================================</w:t>
+        <w:t>Rysunek 6: Moduł rozliczeniowy z płatnością bezgotówkową</w:t>
       </w:r>
     </w:p>
     <w:p/>
     <w:p>
+      <w:pPr>
+        <w:jc w:val="center"/>
+      </w:pPr>
       <w:r>
-        <w:rPr>
-          <w:b/>
-        </w:rPr>
-        <w:t>Archiwum historii serwisowej – wyszukiwanie po VIN (opcja 9):</w:t>
+        <w:drawing>
+          <wp:inline xmlns:a="http://schemas.openxmlformats.org/drawingml/2006/main" xmlns:pic="http://schemas.openxmlformats.org/drawingml/2006/picture">
+            <wp:extent cx="5303520" cy="2577653"/>
+            <wp:docPr id="7" name="Picture 7"/>
+            <wp:cNvGraphicFramePr>
+              <a:graphicFrameLocks noChangeAspect="1"/>
+            </wp:cNvGraphicFramePr>
+            <a:graphic>
+              <a:graphicData uri="http://schemas.openxmlformats.org/drawingml/2006/picture">
+                <pic:pic>
+                  <pic:nvPicPr>
+                    <pic:cNvPr id="0" name="screen_czesci.png"/>
+                    <pic:cNvPicPr/>
+                  </pic:nvPicPr>
+                  <pic:blipFill>
+                    <a:blip r:embed="rId15"/>
+                    <a:stretch>
+                      <a:fillRect/>
+                    </a:stretch>
+                  </pic:blipFill>
+                  <pic:spPr>
+                    <a:xfrm>
+                      <a:off x="0" y="0"/>
+                      <a:ext cx="5303520" cy="2577653"/>
+                    </a:xfrm>
+                    <a:prstGeom prst="rect"/>
+                  </pic:spPr>
+                </pic:pic>
+              </a:graphicData>
+            </a:graphic>
+          </wp:inline>
+        </w:drawing>
       </w:r>
     </w:p>
     <w:p>
       <w:pPr>
-        <w:ind w:left="432"/>
+        <w:jc w:val="center"/>
       </w:pPr>
       <w:r>
         <w:rPr>
-          <w:rFonts w:ascii="Consolas" w:hAnsi="Consolas"/>
+          <w:i/>
           <w:sz w:val="18"/>
         </w:rPr>
-        <w:t>========== HISTORIA SERWISOWA (VIN: WDBRF61J21F123456) ==========</w:t>
-        <w:br/>
-        <w:t>Naprawa #1 | Data: 2026-05-28</w:t>
-        <w:br/>
-        <w:t xml:space="preserve">   Auto: Mercedes C200 | Właściciel: Jan Kowalski</w:t>
-        <w:br/>
-        <w:t xml:space="preserve">   Usterka: Wymiana klockow hamulcowych</w:t>
-        <w:br/>
-        <w:t xml:space="preserve">   Status: Przyjęte | Mechanik: Piotr Zielinski</w:t>
-        <w:br/>
-        <w:t xml:space="preserve">   Koszt: 725.0 PLN (robocizna: 375.0 + części: 350.0)</w:t>
-        <w:br/>
-        <w:t>----------------------------------------------------</w:t>
-        <w:br/>
-        <w:t>=========================================================</w:t>
+        <w:t>Rysunek 7: Magazyn części z alertem niskiego stanu</w:t>
       </w:r>
     </w:p>
     <w:p/>
     <w:p>
+      <w:pPr>
+        <w:jc w:val="center"/>
+      </w:pPr>
       <w:r>
-        <w:rPr>
-          <w:b/>
-        </w:rPr>
-        <w:t>Walidacja danych – błędny numer telefonu:</w:t>
+        <w:drawing>
+          <wp:inline xmlns:a="http://schemas.openxmlformats.org/drawingml/2006/main" xmlns:pic="http://schemas.openxmlformats.org/drawingml/2006/picture">
+            <wp:extent cx="5303520" cy="3225288"/>
+            <wp:docPr id="8" name="Picture 8"/>
+            <wp:cNvGraphicFramePr>
+              <a:graphicFrameLocks noChangeAspect="1"/>
+            </wp:cNvGraphicFramePr>
+            <a:graphic>
+              <a:graphicData uri="http://schemas.openxmlformats.org/drawingml/2006/picture">
+                <pic:pic>
+                  <pic:nvPicPr>
+                    <pic:cNvPr id="0" name="screen_historia.png"/>
+                    <pic:cNvPicPr/>
+                  </pic:nvPicPr>
+                  <pic:blipFill>
+                    <a:blip r:embed="rId16"/>
+                    <a:stretch>
+                      <a:fillRect/>
+                    </a:stretch>
+                  </pic:blipFill>
+                  <pic:spPr>
+                    <a:xfrm>
+                      <a:off x="0" y="0"/>
+                      <a:ext cx="5303520" cy="3225288"/>
+                    </a:xfrm>
+                    <a:prstGeom prst="rect"/>
+                  </pic:spPr>
+                </pic:pic>
+              </a:graphicData>
+            </a:graphic>
+          </wp:inline>
+        </w:drawing>
       </w:r>
     </w:p>
     <w:p>
       <w:pPr>
-        <w:ind w:left="432"/>
+        <w:jc w:val="center"/>
       </w:pPr>
       <w:r>
         <w:rPr>
-          <w:rFonts w:ascii="Consolas" w:hAnsi="Consolas"/>
+          <w:i/>
           <w:sz w:val="18"/>
         </w:rPr>
-        <w:t>--- DODAWANIE NOWEGO KLIENTA ---</w:t>
-        <w:br/>
-        <w:t>Podaj imię: Jan</w:t>
-        <w:br/>
-        <w:t>Podaj nazwisko: Kowalski</w:t>
-        <w:br/>
-        <w:t>Podaj numer telefonu (9 cyfr): 12345</w:t>
-        <w:br/>
-        <w:t>Błąd: Numer telefonu musi składać się z dokładnie 9 cyfr! (Wprowadzono: 5)</w:t>
-      </w:r>
-    </w:p>
-    <w:p/>
-    <w:p>
-      <w:r>
-        <w:rPr>
-          <w:b/>
-        </w:rPr>
-        <w:t>Walidacja danych – błędny numer VIN:</w:t>
-      </w:r>
-    </w:p>
-    <w:p>
-      <w:pPr>
-        <w:ind w:left="432"/>
-      </w:pPr>
-      <w:r>
-        <w:rPr>
-          <w:rFonts w:ascii="Consolas" w:hAnsi="Consolas"/>
-          <w:sz w:val="18"/>
-        </w:rPr>
-        <w:t>--- DODAWANIE NOWEGO POJAZDU ---</w:t>
-        <w:br/>
-        <w:t>Podaj numer VIN: ABC123</w:t>
-        <w:br/>
-        <w:t>Błąd: Numer VIN musi mieć 17 znaków! (Wprowadzono: 6)</w:t>
+        <w:t>Rysunek 8: Archiwum historii serwisowej — wyszukiwanie po VIN</w:t>
       </w:r>
     </w:p>
     <w:p/>
@@ -2289,121 +3055,15 @@
         <w:pStyle w:val="Heading1"/>
       </w:pPr>
       <w:r>
-        <w:t>Diagram klas UML</w:t>
-      </w:r>
-    </w:p>
-    <w:p>
-      <w:r>
-        <w:t>Diagram przedstawia strukturę systemu „Auto-Expert" z podziałem na klasy aplikacyjne (App, DatabaseManager) oraz encje bazodanowe (Klient, Pojazd, Naprawa, Część). Relacje 1:* oznaczają powiązania przez klucze obce w bazie SQLite.</w:t>
+        <w:t>9. Diagramy UML</w:t>
       </w:r>
     </w:p>
     <w:p>
       <w:pPr>
-        <w:jc w:val="center"/>
+        <w:pStyle w:val="Heading2"/>
       </w:pPr>
       <w:r>
-        <w:drawing>
-          <wp:inline xmlns:a="http://schemas.openxmlformats.org/drawingml/2006/main" xmlns:pic="http://schemas.openxmlformats.org/drawingml/2006/picture">
-            <wp:extent cx="5486400" cy="4089311"/>
-            <wp:docPr id="1" name="Picture 1"/>
-            <wp:cNvGraphicFramePr>
-              <a:graphicFrameLocks noChangeAspect="1"/>
-            </wp:cNvGraphicFramePr>
-            <a:graphic>
-              <a:graphicData uri="http://schemas.openxmlformats.org/drawingml/2006/picture">
-                <pic:pic>
-                  <pic:nvPicPr>
-                    <pic:cNvPr id="0" name="diagram_klas.png"/>
-                    <pic:cNvPicPr/>
-                  </pic:nvPicPr>
-                  <pic:blipFill>
-                    <a:blip r:embed="rId9"/>
-                    <a:stretch>
-                      <a:fillRect/>
-                    </a:stretch>
-                  </pic:blipFill>
-                  <pic:spPr>
-                    <a:xfrm>
-                      <a:off x="0" y="0"/>
-                      <a:ext cx="5486400" cy="4089311"/>
-                    </a:xfrm>
-                    <a:prstGeom prst="rect"/>
-                  </pic:spPr>
-                </pic:pic>
-              </a:graphicData>
-            </a:graphic>
-          </wp:inline>
-        </w:drawing>
-      </w:r>
-    </w:p>
-    <w:p>
-      <w:r>
-        <w:br w:type="page"/>
-      </w:r>
-    </w:p>
-    <w:p>
-      <w:pPr>
-        <w:pStyle w:val="Heading1"/>
-      </w:pPr>
-      <w:r>
-        <w:t>Diagram sekwencji UML – Proces naprawy</w:t>
-      </w:r>
-    </w:p>
-    <w:p>
-      <w:r>
-        <w:t>Diagram sekwencji przedstawia przepływ komunikatów pomiędzy aktorami i komponentami systemu podczas procesu rejestracji nowej naprawy (kroki 1-8) oraz zmiany statusu zlecenia (kroki 9-13). Widoczne jest użycie PreparedStatement przy komunikacji z bazą danych SQLite.</w:t>
-      </w:r>
-    </w:p>
-    <w:p>
-      <w:pPr>
-        <w:jc w:val="center"/>
-      </w:pPr>
-      <w:r>
-        <w:drawing>
-          <wp:inline xmlns:a="http://schemas.openxmlformats.org/drawingml/2006/main" xmlns:pic="http://schemas.openxmlformats.org/drawingml/2006/picture">
-            <wp:extent cx="5486400" cy="4468982"/>
-            <wp:docPr id="2" name="Picture 2"/>
-            <wp:cNvGraphicFramePr>
-              <a:graphicFrameLocks noChangeAspect="1"/>
-            </wp:cNvGraphicFramePr>
-            <a:graphic>
-              <a:graphicData uri="http://schemas.openxmlformats.org/drawingml/2006/picture">
-                <pic:pic>
-                  <pic:nvPicPr>
-                    <pic:cNvPr id="0" name="diagram_sekwencji.png"/>
-                    <pic:cNvPicPr/>
-                  </pic:nvPicPr>
-                  <pic:blipFill>
-                    <a:blip r:embed="rId10"/>
-                    <a:stretch>
-                      <a:fillRect/>
-                    </a:stretch>
-                  </pic:blipFill>
-                  <pic:spPr>
-                    <a:xfrm>
-                      <a:off x="0" y="0"/>
-                      <a:ext cx="5486400" cy="4468982"/>
-                    </a:xfrm>
-                    <a:prstGeom prst="rect"/>
-                  </pic:spPr>
-                </pic:pic>
-              </a:graphicData>
-            </a:graphic>
-          </wp:inline>
-        </w:drawing>
-      </w:r>
-    </w:p>
-    <w:p>
-      <w:r>
-        <w:br w:type="page"/>
-      </w:r>
-    </w:p>
-    <w:p>
-      <w:pPr>
-        <w:pStyle w:val="Heading1"/>
-      </w:pPr>
-      <w:r>
-        <w:t>Diagram przypadków użycia (Use Case)</w:t>
+        <w:t>9.1 Diagram przypadków użycia (Use Case)</w:t>
       </w:r>
     </w:p>
     <w:p>
@@ -2418,8 +3078,8 @@
       <w:r>
         <w:drawing>
           <wp:inline xmlns:a="http://schemas.openxmlformats.org/drawingml/2006/main" xmlns:pic="http://schemas.openxmlformats.org/drawingml/2006/picture">
-            <wp:extent cx="5486400" cy="4090012"/>
-            <wp:docPr id="3" name="Picture 3"/>
+            <wp:extent cx="5303520" cy="3949033"/>
+            <wp:docPr id="9" name="Picture 9"/>
             <wp:cNvGraphicFramePr>
               <a:graphicFrameLocks noChangeAspect="1"/>
             </wp:cNvGraphicFramePr>
@@ -2431,7 +3091,7 @@
                     <pic:cNvPicPr/>
                   </pic:nvPicPr>
                   <pic:blipFill>
-                    <a:blip r:embed="rId11"/>
+                    <a:blip r:embed="rId17"/>
                     <a:stretch>
                       <a:fillRect/>
                     </a:stretch>
@@ -2439,7 +3099,7 @@
                   <pic:spPr>
                     <a:xfrm>
                       <a:off x="0" y="0"/>
-                      <a:ext cx="5486400" cy="4090012"/>
+                      <a:ext cx="5303520" cy="3949033"/>
                     </a:xfrm>
                     <a:prstGeom prst="rect"/>
                   </pic:spPr>
@@ -2448,6 +3108,225 @@
             </a:graphic>
           </wp:inline>
         </w:drawing>
+      </w:r>
+    </w:p>
+    <w:p>
+      <w:pPr>
+        <w:jc w:val="center"/>
+      </w:pPr>
+      <w:r>
+        <w:rPr>
+          <w:i/>
+          <w:sz w:val="18"/>
+        </w:rPr>
+        <w:t>Rysunek 9: Diagram przypadków użycia (Use Case)</w:t>
+      </w:r>
+    </w:p>
+    <w:p>
+      <w:r>
+        <w:br w:type="page"/>
+      </w:r>
+    </w:p>
+    <w:p>
+      <w:pPr>
+        <w:pStyle w:val="Heading2"/>
+      </w:pPr>
+      <w:r>
+        <w:t>9.2 Diagram klas UML</w:t>
+      </w:r>
+    </w:p>
+    <w:p>
+      <w:r>
+        <w:t>Diagram przedstawia strukturę systemu z podziałem na klasy aplikacyjne (App — warstwa prezentacji, DatabaseManager — warstwa danych) oraz encje bazodanowe (Klient, Pojazd, Naprawa, Część) z relacjami 1:*.</w:t>
+      </w:r>
+    </w:p>
+    <w:p>
+      <w:pPr>
+        <w:jc w:val="center"/>
+      </w:pPr>
+      <w:r>
+        <w:drawing>
+          <wp:inline xmlns:a="http://schemas.openxmlformats.org/drawingml/2006/main" xmlns:pic="http://schemas.openxmlformats.org/drawingml/2006/picture">
+            <wp:extent cx="5303520" cy="3953000"/>
+            <wp:docPr id="10" name="Picture 10"/>
+            <wp:cNvGraphicFramePr>
+              <a:graphicFrameLocks noChangeAspect="1"/>
+            </wp:cNvGraphicFramePr>
+            <a:graphic>
+              <a:graphicData uri="http://schemas.openxmlformats.org/drawingml/2006/picture">
+                <pic:pic>
+                  <pic:nvPicPr>
+                    <pic:cNvPr id="0" name="diagram_klas.png"/>
+                    <pic:cNvPicPr/>
+                  </pic:nvPicPr>
+                  <pic:blipFill>
+                    <a:blip r:embed="rId18"/>
+                    <a:stretch>
+                      <a:fillRect/>
+                    </a:stretch>
+                  </pic:blipFill>
+                  <pic:spPr>
+                    <a:xfrm>
+                      <a:off x="0" y="0"/>
+                      <a:ext cx="5303520" cy="3953000"/>
+                    </a:xfrm>
+                    <a:prstGeom prst="rect"/>
+                  </pic:spPr>
+                </pic:pic>
+              </a:graphicData>
+            </a:graphic>
+          </wp:inline>
+        </w:drawing>
+      </w:r>
+    </w:p>
+    <w:p>
+      <w:pPr>
+        <w:jc w:val="center"/>
+      </w:pPr>
+      <w:r>
+        <w:rPr>
+          <w:i/>
+          <w:sz w:val="18"/>
+        </w:rPr>
+        <w:t>Rysunek 10: Diagram klas UML</w:t>
+      </w:r>
+    </w:p>
+    <w:p>
+      <w:r>
+        <w:br w:type="page"/>
+      </w:r>
+    </w:p>
+    <w:p>
+      <w:pPr>
+        <w:pStyle w:val="Heading2"/>
+      </w:pPr>
+      <w:r>
+        <w:t>9.3 Diagram sekwencji – proces naprawy</w:t>
+      </w:r>
+    </w:p>
+    <w:p>
+      <w:r>
+        <w:t>Diagram przedstawia przepływ komunikatów podczas rejestracji nowej naprawy (kroki 1-8) oraz zmiany statusu zlecenia (kroki 9-13). Widoczne jest użycie PreparedStatement przy komunikacji z bazą SQLite.</w:t>
+      </w:r>
+    </w:p>
+    <w:p>
+      <w:pPr>
+        <w:jc w:val="center"/>
+      </w:pPr>
+      <w:r>
+        <w:drawing>
+          <wp:inline xmlns:a="http://schemas.openxmlformats.org/drawingml/2006/main" xmlns:pic="http://schemas.openxmlformats.org/drawingml/2006/picture">
+            <wp:extent cx="5303520" cy="4320016"/>
+            <wp:docPr id="11" name="Picture 11"/>
+            <wp:cNvGraphicFramePr>
+              <a:graphicFrameLocks noChangeAspect="1"/>
+            </wp:cNvGraphicFramePr>
+            <a:graphic>
+              <a:graphicData uri="http://schemas.openxmlformats.org/drawingml/2006/picture">
+                <pic:pic>
+                  <pic:nvPicPr>
+                    <pic:cNvPr id="0" name="diagram_sekwencji.png"/>
+                    <pic:cNvPicPr/>
+                  </pic:nvPicPr>
+                  <pic:blipFill>
+                    <a:blip r:embed="rId19"/>
+                    <a:stretch>
+                      <a:fillRect/>
+                    </a:stretch>
+                  </pic:blipFill>
+                  <pic:spPr>
+                    <a:xfrm>
+                      <a:off x="0" y="0"/>
+                      <a:ext cx="5303520" cy="4320016"/>
+                    </a:xfrm>
+                    <a:prstGeom prst="rect"/>
+                  </pic:spPr>
+                </pic:pic>
+              </a:graphicData>
+            </a:graphic>
+          </wp:inline>
+        </w:drawing>
+      </w:r>
+    </w:p>
+    <w:p>
+      <w:pPr>
+        <w:jc w:val="center"/>
+      </w:pPr>
+      <w:r>
+        <w:rPr>
+          <w:i/>
+          <w:sz w:val="18"/>
+        </w:rPr>
+        <w:t>Rysunek 11: Diagram sekwencji UML — proces naprawy</w:t>
+      </w:r>
+    </w:p>
+    <w:p>
+      <w:r>
+        <w:br w:type="page"/>
+      </w:r>
+    </w:p>
+    <w:p>
+      <w:pPr>
+        <w:pStyle w:val="Heading2"/>
+      </w:pPr>
+      <w:r>
+        <w:t>9.4 Diagram ERD bazy danych</w:t>
+      </w:r>
+    </w:p>
+    <w:p>
+      <w:r>
+        <w:t>Diagram ERD (Entity Relationship Diagram) przedstawia strukturę relacyjnej bazy danych SQLite systemu „Auto-Expert". Baza składa się z 4 tabel połączonych relacjami 1:* przez klucze obce.</w:t>
+      </w:r>
+    </w:p>
+    <w:p>
+      <w:pPr>
+        <w:jc w:val="center"/>
+      </w:pPr>
+      <w:r>
+        <w:drawing>
+          <wp:inline xmlns:a="http://schemas.openxmlformats.org/drawingml/2006/main" xmlns:pic="http://schemas.openxmlformats.org/drawingml/2006/picture">
+            <wp:extent cx="5303520" cy="3448307"/>
+            <wp:docPr id="12" name="Picture 12"/>
+            <wp:cNvGraphicFramePr>
+              <a:graphicFrameLocks noChangeAspect="1"/>
+            </wp:cNvGraphicFramePr>
+            <a:graphic>
+              <a:graphicData uri="http://schemas.openxmlformats.org/drawingml/2006/picture">
+                <pic:pic>
+                  <pic:nvPicPr>
+                    <pic:cNvPr id="0" name="diagram_erd.png"/>
+                    <pic:cNvPicPr/>
+                  </pic:nvPicPr>
+                  <pic:blipFill>
+                    <a:blip r:embed="rId20"/>
+                    <a:stretch>
+                      <a:fillRect/>
+                    </a:stretch>
+                  </pic:blipFill>
+                  <pic:spPr>
+                    <a:xfrm>
+                      <a:off x="0" y="0"/>
+                      <a:ext cx="5303520" cy="3448307"/>
+                    </a:xfrm>
+                    <a:prstGeom prst="rect"/>
+                  </pic:spPr>
+                </pic:pic>
+              </a:graphicData>
+            </a:graphic>
+          </wp:inline>
+        </w:drawing>
+      </w:r>
+    </w:p>
+    <w:p>
+      <w:pPr>
+        <w:jc w:val="center"/>
+      </w:pPr>
+      <w:r>
+        <w:rPr>
+          <w:i/>
+          <w:sz w:val="18"/>
+        </w:rPr>
+        <w:t>Rysunek 12: Diagram ERD bazy danych</w:t>
       </w:r>
     </w:p>
     <w:sectPr>

</xml_diff>

<commit_message>
docs: Dodanie Ćw. 13 (4 zasady bezpieczeństwa) i prezentacji multimedialnej
- Ćwiczenia 13: naturalny styk, spójność, minimalny przywilej, domyślna odmowa
- Prezentacja PowerPoint (10 slajdów) do pokazu na żywo

Co-Authored-By: Claude Sonnet 4.6 <noreply@anthropic.com>
</commit_message>
<xml_diff>
--- a/Dokumentacja_Auto-Expert.docx
+++ b/Dokumentacja_Auto-Expert.docx
@@ -3329,6 +3329,370 @@
         <w:t>Rysunek 12: Diagram ERD bazy danych</w:t>
       </w:r>
     </w:p>
+    <w:p>
+      <w:r>
+        <w:br w:type="page"/>
+      </w:r>
+    </w:p>
+    <w:p>
+      <w:pPr>
+        <w:pStyle w:val="Heading1"/>
+      </w:pPr>
+      <w:r>
+        <w:t>Ćwiczenia 13 – Zasady stosowania zabezpieczeń</w:t>
+      </w:r>
+    </w:p>
+    <w:p>
+      <w:r>
+        <w:t>Na podstawie wykładu dotyczącego złożoności problemu stosowania zabezpieczeń, poniżej opisano realizację czterech kluczowych zasad bezpieczeństwa w systemie „Auto-Expert".</w:t>
+      </w:r>
+    </w:p>
+    <w:p>
+      <w:pPr>
+        <w:pStyle w:val="Heading2"/>
+      </w:pPr>
+      <w:r>
+        <w:t>Zasada 1: Naturalny styk z użytkownikiem</w:t>
+      </w:r>
+    </w:p>
+    <w:p>
+      <w:r>
+        <w:t>Zasada ta mówi, że mechanizmy bezpieczeństwa powinny być dla użytkownika naturalne i nie powinny utrudniać codziennej pracy z systemem.</w:t>
+      </w:r>
+    </w:p>
+    <w:p>
+      <w:r>
+        <w:rPr>
+          <w:b/>
+        </w:rPr>
+        <w:t>Realizacja w systemie Auto-Expert:</w:t>
+      </w:r>
+    </w:p>
+    <w:p>
+      <w:pPr>
+        <w:pStyle w:val="ListBullet"/>
+      </w:pPr>
+      <w:r>
+        <w:t>Walidacja danych wejściowych odbywa się natychmiast po wprowadzeniu danych przez użytkownika, a komunikaty błędów są jasne i precyzyjne (np. „Numer telefonu musi składać się z dokładnie 9 cyfr! (Wprowadzono: 5)"). Użytkownik nie musi pamiętać o formatach — system sam informuje o wymaganiach. Menu konsolowe jest intuicyjne i ponumerowane (opcje 0-9), a podmenu (zlecenia, części, historia) mają spójną strukturę z opcją „0 — Powrót do menu głównego". Zabezpieczenia działają w tle — PreparedStatement chroni przed SQL Injection bez jakiegokolwiek udziału użytkownika. Pracownik biura nie musi wiedzieć, że system go chroni.</w:t>
+      </w:r>
+    </w:p>
+    <w:p>
+      <w:pPr>
+        <w:pStyle w:val="Heading2"/>
+      </w:pPr>
+      <w:r>
+        <w:t>Zasada 2: Spójność pozioma i pionowa</w:t>
+      </w:r>
+    </w:p>
+    <w:p>
+      <w:r>
+        <w:t>Zasada spójności zakłada, że mechanizmy bezpieczeństwa powinny być stosowane jednolicie na wszystkich poziomach systemu (spójność pionowa) oraz we wszystkich modułach na tym samym poziomie (spójność pozioma).</w:t>
+      </w:r>
+    </w:p>
+    <w:p>
+      <w:r>
+        <w:rPr>
+          <w:b/>
+        </w:rPr>
+        <w:t>Realizacja w systemie Auto-Expert:</w:t>
+      </w:r>
+    </w:p>
+    <w:p>
+      <w:pPr>
+        <w:pStyle w:val="ListBullet"/>
+      </w:pPr>
+      <w:r>
+        <w:t>Spójność pozioma — wszystkie 5 modułów systemu stosuje identyczne mechanizmy bezpieczeństwa: każde zapytanie do bazy danych wykorzystuje PreparedStatement (nigdy zwykły String), każde pole wejściowe przechodzi walidację formatu, a każda operacja na danych odbywa się przez klasę DatabaseManager (jeden punkt dostępu do bazy). Nie ma modułu, który „omija" zabezpieczenia.</w:t>
+      </w:r>
+    </w:p>
+    <w:p>
+      <w:pPr>
+        <w:pStyle w:val="ListBullet"/>
+      </w:pPr>
+      <w:r>
+        <w:t>Spójność pionowa — zabezpieczenia są stosowane na każdym poziomie architektury: (1) Warstwa prezentacji (App.java): walidacja formatu danych wejściowych (regex, długość), (2) Warstwa logiki (DatabaseManager.java): PreparedStatement, PRAGMA foreign_keys = ON, (3) Warstwa danych (SQLite): klucze obce, ograniczenia NOT NULL, typy danych. Żaden poziom nie polega wyłącznie na zabezpieczeniach innego poziomu.</w:t>
+      </w:r>
+    </w:p>
+    <w:p>
+      <w:pPr>
+        <w:pStyle w:val="Heading2"/>
+      </w:pPr>
+      <w:r>
+        <w:t>Zasada 3: Minimalne przywileje (Least Privilege)</w:t>
+      </w:r>
+    </w:p>
+    <w:p>
+      <w:r>
+        <w:t>Zasada minimalnego przywileju zakłada, że każdy użytkownik i komponent systemu powinien mieć dostęp tylko do tych zasobów, które są niezbędne do wykonania jego zadań.</w:t>
+      </w:r>
+    </w:p>
+    <w:p>
+      <w:r>
+        <w:rPr>
+          <w:b/>
+        </w:rPr>
+        <w:t>Realizacja w systemie Auto-Expert:</w:t>
+      </w:r>
+    </w:p>
+    <w:p>
+      <w:pPr>
+        <w:pStyle w:val="ListBullet"/>
+      </w:pPr>
+      <w:r>
+        <w:t>W specyfikacji przypadków użycia (Ćw. 10) zdefiniowano dwóch aktorów głównych z różnym zakresem uprawnień: Pracownik Biura ma dostęp do ewidencji klientów, rozliczeń i historii, natomiast Mechanik ma dostęp do zleceń i bazy części. Żaden z aktorów nie ma dostępu do bezpośredniej edycji bazy danych.</w:t>
+      </w:r>
+    </w:p>
+    <w:p>
+      <w:pPr>
+        <w:pStyle w:val="ListBullet"/>
+      </w:pPr>
+      <w:r>
+        <w:t>Klasa DatabaseManager udostępnia tylko ściśle określone metody publiczne (dodajKlienta, dodajPojazd, zmienStatus itp.). Nie ma metody ogólnej „wykonaj SQL", co uniemożliwia wykonanie dowolnego zapytania z poziomu interfejsu użytkownika. Metoda sprawdzMinStan() jest prywatna — wywoływana automatycznie, nie przez użytkownika.</w:t>
+      </w:r>
+    </w:p>
+    <w:p>
+      <w:pPr>
+        <w:pStyle w:val="ListBullet"/>
+      </w:pPr>
+      <w:r>
+        <w:t>Połączenie z bazą danych (metoda connect()) jest tworzone i zamykane w ramach każdej operacji (try-with-resources). Nie istnieje stałe, otwarte połączenie, które mogłoby zostać przechwycone lub nadużyte.</w:t>
+      </w:r>
+    </w:p>
+    <w:p>
+      <w:pPr>
+        <w:pStyle w:val="Heading2"/>
+      </w:pPr>
+      <w:r>
+        <w:t>Zasada 4: Domyślna odmowa dostępu (Default Deny)</w:t>
+      </w:r>
+    </w:p>
+    <w:p>
+      <w:r>
+        <w:t>Zasada domyślnej odmowy dostępu zakłada, że domyślnie dostęp jest zabroniony, a każde uprawnienie musi być jawnie przyznane.</w:t>
+      </w:r>
+    </w:p>
+    <w:p>
+      <w:r>
+        <w:rPr>
+          <w:b/>
+        </w:rPr>
+        <w:t>Realizacja w systemie Auto-Expert:</w:t>
+      </w:r>
+    </w:p>
+    <w:p>
+      <w:pPr>
+        <w:pStyle w:val="ListBullet"/>
+      </w:pPr>
+      <w:r>
+        <w:t>Walidacja danych działa na zasadzie „whitelist" — system akceptuje tylko dane spełniające ściśle określone kryteria (telefon: dokładnie 9 cyfr \d{9}, VIN: dokładnie 17 znaków, ID klienta: tylko liczba całkowita). Wszystko, co nie spełnia kryteriów, jest automatycznie odrzucane z komunikatem błędu.</w:t>
+      </w:r>
+    </w:p>
+    <w:p>
+      <w:pPr>
+        <w:pStyle w:val="ListBullet"/>
+      </w:pPr>
+      <w:r>
+        <w:t>Menu aplikacji obsługuje tylko zdefiniowane opcje (0-9). Każda inna wartość (litera, znak specjalny, liczba spoza zakresu) powoduje komunikat „Niepoprawna opcja!" lub „Błąd: Wprowadź poprawną cyfrę!" i powrót do menu. System nie próbuje „zgadywać" intencji użytkownika.</w:t>
+      </w:r>
+    </w:p>
+    <w:p>
+      <w:pPr>
+        <w:pStyle w:val="ListBullet"/>
+      </w:pPr>
+      <w:r>
+        <w:t>PRAGMA foreign_keys = ON jest włączane przy każdym połączeniu z bazą. Oznacza to, że próba dodania pojazdu z nieistniejącym klient_id lub naprawy z nieistniejącym pojazd_vin zostanie automatycznie odrzucona przez bazę danych. Integralność referencyjna jest wymuszana domyślnie — nie można jej ominąć.</w:t>
+      </w:r>
+    </w:p>
+    <w:p>
+      <w:pPr>
+        <w:pStyle w:val="Heading2"/>
+      </w:pPr>
+      <w:r>
+        <w:t>Podsumowanie</w:t>
+      </w:r>
+    </w:p>
+    <w:tbl>
+      <w:tblPr>
+        <w:tblStyle w:val="TableGrid"/>
+        <w:tblW w:type="auto" w:w="0"/>
+        <w:jc w:val="center"/>
+        <w:tblLook w:firstColumn="1" w:firstRow="1" w:lastColumn="0" w:lastRow="0" w:noHBand="0" w:noVBand="1" w:val="04A0"/>
+      </w:tblPr>
+      <w:tblGrid>
+        <w:gridCol w:w="2880"/>
+        <w:gridCol w:w="2880"/>
+        <w:gridCol w:w="2880"/>
+      </w:tblGrid>
+      <w:tr>
+        <w:tc>
+          <w:tcPr>
+            <w:tcW w:type="dxa" w:w="2880"/>
+          </w:tcPr>
+          <w:p>
+            <w:r>
+              <w:rPr>
+                <w:b/>
+              </w:rPr>
+              <w:t>Zasada</w:t>
+            </w:r>
+          </w:p>
+        </w:tc>
+        <w:tc>
+          <w:tcPr>
+            <w:tcW w:type="dxa" w:w="2880"/>
+          </w:tcPr>
+          <w:p>
+            <w:r>
+              <w:rPr>
+                <w:b/>
+              </w:rPr>
+              <w:t>Mechanizm</w:t>
+            </w:r>
+          </w:p>
+        </w:tc>
+        <w:tc>
+          <w:tcPr>
+            <w:tcW w:type="dxa" w:w="2880"/>
+          </w:tcPr>
+          <w:p>
+            <w:r>
+              <w:rPr>
+                <w:b/>
+              </w:rPr>
+              <w:t>Implementacja</w:t>
+            </w:r>
+          </w:p>
+        </w:tc>
+      </w:tr>
+      <w:tr>
+        <w:tc>
+          <w:tcPr>
+            <w:tcW w:type="dxa" w:w="2880"/>
+          </w:tcPr>
+          <w:p>
+            <w:r>
+              <w:t>Naturalny styk</w:t>
+            </w:r>
+          </w:p>
+        </w:tc>
+        <w:tc>
+          <w:tcPr>
+            <w:tcW w:type="dxa" w:w="2880"/>
+          </w:tcPr>
+          <w:p>
+            <w:r>
+              <w:t>Czytelne komunikaty, intuicyjne menu</w:t>
+            </w:r>
+          </w:p>
+        </w:tc>
+        <w:tc>
+          <w:tcPr>
+            <w:tcW w:type="dxa" w:w="2880"/>
+          </w:tcPr>
+          <w:p>
+            <w:r>
+              <w:t>App.java — walidacja z opisem błędu</w:t>
+            </w:r>
+          </w:p>
+        </w:tc>
+      </w:tr>
+      <w:tr>
+        <w:tc>
+          <w:tcPr>
+            <w:tcW w:type="dxa" w:w="2880"/>
+          </w:tcPr>
+          <w:p>
+            <w:r>
+              <w:t>Spójność</w:t>
+            </w:r>
+          </w:p>
+        </w:tc>
+        <w:tc>
+          <w:tcPr>
+            <w:tcW w:type="dxa" w:w="2880"/>
+          </w:tcPr>
+          <w:p>
+            <w:r>
+              <w:t>Identyczne zabezpieczenia we wszystkich modułach</w:t>
+            </w:r>
+          </w:p>
+        </w:tc>
+        <w:tc>
+          <w:tcPr>
+            <w:tcW w:type="dxa" w:w="2880"/>
+          </w:tcPr>
+          <w:p>
+            <w:r>
+              <w:t>PreparedStatement wszędzie, 3-warstwowa ochrona</w:t>
+            </w:r>
+          </w:p>
+        </w:tc>
+      </w:tr>
+      <w:tr>
+        <w:tc>
+          <w:tcPr>
+            <w:tcW w:type="dxa" w:w="2880"/>
+          </w:tcPr>
+          <w:p>
+            <w:r>
+              <w:t>Minimalny przywilej</w:t>
+            </w:r>
+          </w:p>
+        </w:tc>
+        <w:tc>
+          <w:tcPr>
+            <w:tcW w:type="dxa" w:w="2880"/>
+          </w:tcPr>
+          <w:p>
+            <w:r>
+              <w:t>Ograniczone metody publiczne, brak ogólnego SQL</w:t>
+            </w:r>
+          </w:p>
+        </w:tc>
+        <w:tc>
+          <w:tcPr>
+            <w:tcW w:type="dxa" w:w="2880"/>
+          </w:tcPr>
+          <w:p>
+            <w:r>
+              <w:t>DatabaseManager — metody per-operacja</w:t>
+            </w:r>
+          </w:p>
+        </w:tc>
+      </w:tr>
+      <w:tr>
+        <w:tc>
+          <w:tcPr>
+            <w:tcW w:type="dxa" w:w="2880"/>
+          </w:tcPr>
+          <w:p>
+            <w:r>
+              <w:t>Domyślna odmowa</w:t>
+            </w:r>
+          </w:p>
+        </w:tc>
+        <w:tc>
+          <w:tcPr>
+            <w:tcW w:type="dxa" w:w="2880"/>
+          </w:tcPr>
+          <w:p>
+            <w:r>
+              <w:t>Whitelist walidacji, FK constraints</w:t>
+            </w:r>
+          </w:p>
+        </w:tc>
+        <w:tc>
+          <w:tcPr>
+            <w:tcW w:type="dxa" w:w="2880"/>
+          </w:tcPr>
+          <w:p>
+            <w:r>
+              <w:t>Regex + PRAGMA foreign_keys = ON</w:t>
+            </w:r>
+          </w:p>
+        </w:tc>
+      </w:tr>
+    </w:tbl>
     <w:sectPr>
       <w:pgSz w:w="12240" w:h="15840"/>
       <w:pgMar w:top="1440" w:right="1800" w:bottom="1440" w:left="1800" w:header="720" w:footer="720" w:gutter="0"/>

</xml_diff>

<commit_message>
docs: Przebudowa dokumentacji - dodanie Cw. 1-7 i renumeracja rozdzialow
Dokument zawiera teraz kompletna dokumentacje od Projektu zaliczeniowego
(sklad grupy, temat, funkcjonalnosci) przez Cw. 7 (opis, moduly, rozwiazania)
az po Cw. 13. Wszystkie rozdzialy ponumerowane 1-11.

Co-Authored-By: Claude Sonnet 4.6 <noreply@anthropic.com>
</commit_message>
<xml_diff>
--- a/Dokumentacja_Auto-Expert.docx
+++ b/Dokumentacja_Auto-Expert.docx
@@ -91,7 +91,7 @@
         <w:spacing w:after="40"/>
       </w:pPr>
       <w:r>
-        <w:t>1. Opis projektu</w:t>
+        <w:t>1. Skład grupy i temat projektu (Projekt zaliczeniowy)</w:t>
       </w:r>
     </w:p>
     <w:p>
@@ -99,7 +99,7 @@
         <w:spacing w:after="40"/>
       </w:pPr>
       <w:r>
-        <w:t>2. Czasochłonność, zasoby i harmonogram (Ćw. 8)</w:t>
+        <w:t>2. Opis projektu — moduły i rozwiązania (Ćw. 7)</w:t>
       </w:r>
     </w:p>
     <w:p>
@@ -107,7 +107,7 @@
         <w:spacing w:after="40"/>
       </w:pPr>
       <w:r>
-        <w:t>3. Zarządzanie ryzykiem i kosztorys (Ćw. 9)</w:t>
+        <w:t>3. Czasochłonność, zasoby i harmonogram (Ćw. 8)</w:t>
       </w:r>
     </w:p>
     <w:p>
@@ -115,7 +115,7 @@
         <w:spacing w:after="40"/>
       </w:pPr>
       <w:r>
-        <w:t>4. Specyfikacja przypadków użycia (Ćw. 10)</w:t>
+        <w:t>4. Zarządzanie ryzykiem i kosztorys (Ćw. 9)</w:t>
       </w:r>
     </w:p>
     <w:p>
@@ -123,7 +123,7 @@
         <w:spacing w:after="40"/>
       </w:pPr>
       <w:r>
-        <w:t>5. Strategia bezpieczeństwa (Ćw. 11)</w:t>
+        <w:t>5. Specyfikacja przypadków użycia (Ćw. 10)</w:t>
       </w:r>
     </w:p>
     <w:p>
@@ -131,7 +131,7 @@
         <w:spacing w:after="40"/>
       </w:pPr>
       <w:r>
-        <w:t>6. Harmonogram testów (Ćw. 12)</w:t>
+        <w:t>6. Strategia bezpieczeństwa (Ćw. 11)</w:t>
       </w:r>
     </w:p>
     <w:p>
@@ -139,7 +139,7 @@
         <w:spacing w:after="40"/>
       </w:pPr>
       <w:r>
-        <w:t>7. Instrukcja obsługi</w:t>
+        <w:t>7. Harmonogram testów (Ćw. 12)</w:t>
       </w:r>
     </w:p>
     <w:p>
@@ -147,7 +147,7 @@
         <w:spacing w:after="40"/>
       </w:pPr>
       <w:r>
-        <w:t>8. Zrzuty ekranowe</w:t>
+        <w:t>8. Zasady stosowania zabezpieczeń (Ćw. 13)</w:t>
       </w:r>
     </w:p>
     <w:p>
@@ -155,7 +155,7 @@
         <w:spacing w:after="40"/>
       </w:pPr>
       <w:r>
-        <w:t>9. Diagramy UML</w:t>
+        <w:t>9. Instrukcja obsługi</w:t>
       </w:r>
     </w:p>
     <w:p>
@@ -163,7 +163,7 @@
         <w:spacing w:after="40"/>
       </w:pPr>
       <w:r>
-        <w:t xml:space="preserve">   9.1 Diagram przypadków użycia (Use Case)</w:t>
+        <w:t>10. Zrzuty ekranowe</w:t>
       </w:r>
     </w:p>
     <w:p>
@@ -171,7 +171,7 @@
         <w:spacing w:after="40"/>
       </w:pPr>
       <w:r>
-        <w:t xml:space="preserve">   9.2 Diagram klas</w:t>
+        <w:t>11. Diagramy UML</w:t>
       </w:r>
     </w:p>
     <w:p>
@@ -179,7 +179,7 @@
         <w:spacing w:after="40"/>
       </w:pPr>
       <w:r>
-        <w:t xml:space="preserve">   9.3 Diagram sekwencji</w:t>
+        <w:t xml:space="preserve">    11.1 Diagram przypadków użycia (Use Case)</w:t>
       </w:r>
     </w:p>
     <w:p>
@@ -187,7 +187,23 @@
         <w:spacing w:after="40"/>
       </w:pPr>
       <w:r>
-        <w:t xml:space="preserve">   9.4 Diagram ERD bazy danych</w:t>
+        <w:t xml:space="preserve">    11.2 Diagram klas</w:t>
+      </w:r>
+    </w:p>
+    <w:p>
+      <w:pPr>
+        <w:spacing w:after="40"/>
+      </w:pPr>
+      <w:r>
+        <w:t xml:space="preserve">    11.3 Diagram sekwencji</w:t>
+      </w:r>
+    </w:p>
+    <w:p>
+      <w:pPr>
+        <w:spacing w:after="40"/>
+      </w:pPr>
+      <w:r>
+        <w:t xml:space="preserve">    11.4 Diagram ERD bazy danych</w:t>
       </w:r>
     </w:p>
     <w:p>
@@ -200,12 +216,12 @@
         <w:pStyle w:val="Heading1"/>
       </w:pPr>
       <w:r>
-        <w:t>1. Opis projektu</w:t>
+        <w:t>1. Skład grupy i temat projektu</w:t>
       </w:r>
     </w:p>
     <w:p>
       <w:r>
-        <w:t>System „Auto-Expert" to aplikacja konsolowa napisana w języku Java, przeznaczona do kompleksowej obsługi warsztatu samochodowego. System umożliwia zarządzanie bazą klientów i pojazdów, rejestrację i śledzenie zleceń napraw ze zmianą statusów, prowadzenie magazynu części zamiennych z automatycznym alertowaniem o niskim stanie, generowanie kosztorysów i rozliczeń z obsługą płatności bezgotówkowych oraz przeglądanie archiwum historii serwisowej z możliwością filtrowania.</w:t>
+        <w:t>Zgodnie z wymaganiami projektu zaliczeniowego z przedmiotu Inżynieria Oprogramowania, poniżej przedstawiamy skład grupy projektowej oraz temat realizowanego projektu.</w:t>
       </w:r>
     </w:p>
     <w:p>
@@ -213,7 +229,133 @@
         <w:pStyle w:val="Heading2"/>
       </w:pPr>
       <w:r>
-        <w:t>Moduły systemu</w:t>
+        <w:t>1.1 Skład grupy projektowej</w:t>
+      </w:r>
+    </w:p>
+    <w:tbl>
+      <w:tblPr>
+        <w:tblStyle w:val="TableGrid"/>
+        <w:tblW w:type="auto" w:w="0"/>
+        <w:jc w:val="center"/>
+        <w:tblLook w:firstColumn="1" w:firstRow="1" w:lastColumn="0" w:lastRow="0" w:noHBand="0" w:noVBand="1" w:val="04A0"/>
+      </w:tblPr>
+      <w:tblGrid>
+        <w:gridCol w:w="2880"/>
+        <w:gridCol w:w="2880"/>
+        <w:gridCol w:w="2880"/>
+      </w:tblGrid>
+      <w:tr>
+        <w:tc>
+          <w:tcPr>
+            <w:tcW w:type="dxa" w:w="2880"/>
+          </w:tcPr>
+          <w:p>
+            <w:r>
+              <w:rPr>
+                <w:b/>
+              </w:rPr>
+              <w:t>Lp.</w:t>
+            </w:r>
+          </w:p>
+        </w:tc>
+        <w:tc>
+          <w:tcPr>
+            <w:tcW w:type="dxa" w:w="2880"/>
+          </w:tcPr>
+          <w:p>
+            <w:r>
+              <w:rPr>
+                <w:b/>
+              </w:rPr>
+              <w:t>Imię i nazwisko</w:t>
+            </w:r>
+          </w:p>
+        </w:tc>
+        <w:tc>
+          <w:tcPr>
+            <w:tcW w:type="dxa" w:w="2880"/>
+          </w:tcPr>
+          <w:p>
+            <w:r>
+              <w:rPr>
+                <w:b/>
+              </w:rPr>
+              <w:t>Nr albumu</w:t>
+            </w:r>
+          </w:p>
+        </w:tc>
+      </w:tr>
+      <w:tr>
+        <w:tc>
+          <w:tcPr>
+            <w:tcW w:type="dxa" w:w="2880"/>
+          </w:tcPr>
+          <w:p>
+            <w:r>
+              <w:t>1</w:t>
+            </w:r>
+          </w:p>
+        </w:tc>
+        <w:tc>
+          <w:tcPr>
+            <w:tcW w:type="dxa" w:w="2880"/>
+          </w:tcPr>
+          <w:p>
+            <w:r>
+              <w:t>Maciej Jagodziński</w:t>
+            </w:r>
+          </w:p>
+        </w:tc>
+        <w:tc>
+          <w:tcPr>
+            <w:tcW w:type="dxa" w:w="2880"/>
+          </w:tcPr>
+          <w:p>
+            <w:r>
+              <w:t>63732</w:t>
+            </w:r>
+          </w:p>
+        </w:tc>
+      </w:tr>
+      <w:tr>
+        <w:tc>
+          <w:tcPr>
+            <w:tcW w:type="dxa" w:w="2880"/>
+          </w:tcPr>
+          <w:p>
+            <w:r>
+              <w:t>2</w:t>
+            </w:r>
+          </w:p>
+        </w:tc>
+        <w:tc>
+          <w:tcPr>
+            <w:tcW w:type="dxa" w:w="2880"/>
+          </w:tcPr>
+          <w:p>
+            <w:r>
+              <w:t>Mikhail Rodia</w:t>
+            </w:r>
+          </w:p>
+        </w:tc>
+        <w:tc>
+          <w:tcPr>
+            <w:tcW w:type="dxa" w:w="2880"/>
+          </w:tcPr>
+          <w:p>
+            <w:r>
+              <w:t>61385</w:t>
+            </w:r>
+          </w:p>
+        </w:tc>
+      </w:tr>
+    </w:tbl>
+    <w:p>
+      <w:pPr>
+        <w:pStyle w:val="Heading2"/>
+      </w:pPr>
+      <w:r>
+        <w:t>1.2 Temat projektu</w:t>
       </w:r>
     </w:p>
     <w:p>
@@ -221,11 +363,23 @@
         <w:rPr>
           <w:b/>
         </w:rPr>
-        <w:t>Moduł 1: Ewidencja klientów i pojazdów</w:t>
+        <w:t xml:space="preserve">Temat: </w:t>
       </w:r>
       <w:r>
-        <w:br/>
-        <w:t>Dodawanie, przeglądanie i zarządzanie bazą klientów (imię, nazwisko, telefon) oraz przypisanych do nich pojazdów (VIN, marka, model). Walidacja numeru telefonu (9 cyfr) i VIN (17 znaków).</w:t>
+        <w:t>System zarządzania warsztatem samochodowym „Auto-Expert"</w:t>
+      </w:r>
+    </w:p>
+    <w:p>
+      <w:r>
+        <w:t>Projekt dotyczy stworzenia systemu informatycznego wspomagającego codzienną pracę warsztatu samochodowego. System umożliwia prowadzenie ewidencji klientów i ich pojazdów, zarządzanie zleceniami napraw, kontrolę stanów magazynowych części zamiennych, automatyczne generowanie rozliczeń finansowych oraz przeglądanie archiwum historii serwisowej.</w:t>
+      </w:r>
+    </w:p>
+    <w:p>
+      <w:pPr>
+        <w:pStyle w:val="Heading2"/>
+      </w:pPr>
+      <w:r>
+        <w:t>1.3 Wyodrębnione funkcjonalności (min. 5)</w:t>
       </w:r>
     </w:p>
     <w:p>
@@ -233,11 +387,10 @@
         <w:rPr>
           <w:b/>
         </w:rPr>
-        <w:t>Moduł 2: Zarządzanie zleceniami (naprawami)</w:t>
+        <w:t xml:space="preserve">1. </w:t>
       </w:r>
       <w:r>
-        <w:br/>
-        <w:t>Tworzenie kart napraw przypisanych do pojazdów, śledzenie statusów zleceń (Przyjęte → W trakcie naprawy → Zakończone), przypisywanie mechaników do zleceń.</w:t>
+        <w:t>Ewidencja klientów i pojazdów — dodawanie, przeglądanie i walidacja danych klientów oraz przypisanych pojazdów.</w:t>
       </w:r>
     </w:p>
     <w:p>
@@ -245,11 +398,10 @@
         <w:rPr>
           <w:b/>
         </w:rPr>
-        <w:t>Moduł 3: Zarządzanie bazą części i materiałów</w:t>
+        <w:t xml:space="preserve">2. </w:t>
       </w:r>
       <w:r>
-        <w:br/>
-        <w:t>Prowadzenie magazynu części zamiennych z informacją o nazwie, cenie, ilości i minimalnym stanie magazynowym. Automatyczne zgłaszanie alertu przy niskim stanie.</w:t>
+        <w:t>Zarządzanie zleceniami (naprawami) — rejestracja napraw, zmiana statusów (Przyjęte → W trakcie naprawy → Zakończone), przypisywanie mechaników.</w:t>
       </w:r>
     </w:p>
     <w:p>
@@ -257,11 +409,10 @@
         <w:rPr>
           <w:b/>
         </w:rPr>
-        <w:t>Moduł 4: Moduł rozliczeniowy</w:t>
+        <w:t xml:space="preserve">3. </w:t>
       </w:r>
       <w:r>
-        <w:br/>
-        <w:t>Automatyczne generowanie kosztorysów na podstawie roboczogodzin (stawka 150 PLN/rbh) i kosztu części. Symulacja płatności bezgotówkowej z terminalem bankowym.</w:t>
+        <w:t>Zarządzanie bazą części i materiałów — prowadzenie magazynu z automatycznym alertem niskiego stanu magazynowego.</w:t>
       </w:r>
     </w:p>
     <w:p>
@@ -269,11 +420,21 @@
         <w:rPr>
           <w:b/>
         </w:rPr>
-        <w:t>Moduł 5: Archiwum historii serwisowej</w:t>
+        <w:t xml:space="preserve">4. </w:t>
       </w:r>
       <w:r>
-        <w:br/>
-        <w:t>Przeglądanie pełnej historii napraw z możliwością filtrowania po numerze VIN pojazdu lub nazwisku właściciela.</w:t>
+        <w:t>Moduł rozliczeniowy — automatyczne generowanie kosztorysów i obsługa płatności gotówkowych oraz bezgotówkowych.</w:t>
+      </w:r>
+    </w:p>
+    <w:p>
+      <w:r>
+        <w:rPr>
+          <w:b/>
+        </w:rPr>
+        <w:t xml:space="preserve">5. </w:t>
+      </w:r>
+      <w:r>
+        <w:t>Archiwum historii serwisowej — przeglądanie historii napraw z filtrowaniem po numerze VIN lub nazwisku klienta.</w:t>
       </w:r>
     </w:p>
     <w:p>
@@ -281,47 +442,22 @@
         <w:pStyle w:val="Heading2"/>
       </w:pPr>
       <w:r>
-        <w:t>Zastosowane rozwiązania techniczne</w:t>
+        <w:t>1.4 Język programowania</w:t>
       </w:r>
     </w:p>
     <w:p>
-      <w:pPr>
-        <w:pStyle w:val="ListBullet"/>
-      </w:pPr>
       <w:r>
-        <w:t>Baza danych SQLite – lekka, jednoplikowa baza relacyjna, idealna dla lokalnej aplikacji warsztatowej. Plik bazy tworzony automatycznie przy uruchomieniu.</w:t>
+        <w:t>Implementacja projektu: Java (JDK 17) z bazą danych SQLite (sterownik JDBC).</w:t>
       </w:r>
     </w:p>
     <w:p>
-      <w:pPr>
-        <w:pStyle w:val="ListBullet"/>
-      </w:pPr>
       <w:r>
-        <w:t>PreparedStatement (JDBC) – zabezpieczenie przed atakami SQL Injection we wszystkich zapytaniach do bazy danych.</w:t>
+        <w:t>Środowisko programistyczne: Visual Studio Code z rozszerzeniami do Javy.</w:t>
       </w:r>
     </w:p>
     <w:p>
-      <w:pPr>
-        <w:pStyle w:val="ListBullet"/>
-      </w:pPr>
       <w:r>
-        <w:t>Walidacja danych wejściowych – kontrola formatu telefonu (regex \d{9}), długości VIN (17 znaków), typów numerycznych (roboczogodziny, koszty).</w:t>
-      </w:r>
-    </w:p>
-    <w:p>
-      <w:pPr>
-        <w:pStyle w:val="ListBullet"/>
-      </w:pPr>
-      <w:r>
-        <w:t>Klucze obce (FOREIGN KEY) z PRAGMA foreign_keys = ON – zapewnienie integralności relacji pomiędzy tabelami klienci, pojazdy i naprawy.</w:t>
-      </w:r>
-    </w:p>
-    <w:p>
-      <w:pPr>
-        <w:pStyle w:val="ListBullet"/>
-      </w:pPr>
-      <w:r>
-        <w:t>Architektura dwuwarstwowa – podział na klasę App.java (warstwa prezentacji / interfejs użytkownika) i DatabaseManager.java (warstwa dostępu do danych).</w:t>
+        <w:t>System kontroli wersji: Git / GitHub.</w:t>
       </w:r>
     </w:p>
     <w:p>
@@ -334,7 +470,12 @@
         <w:pStyle w:val="Heading1"/>
       </w:pPr>
       <w:r>
-        <w:t>2. Czasochłonność, zasoby i harmonogram (Ćw. 8)</w:t>
+        <w:t>2. Opis projektu — moduły i rozwiązania (Ćw. 7)</w:t>
+      </w:r>
+    </w:p>
+    <w:p>
+      <w:r>
+        <w:t>Zgodnie z wymaganiami ćwiczeń nr 7, poniżej przedstawiamy szczegółowy opis projektu: czego dotyczy, z jakich modułów się składa oraz jakie rozwiązania zostały zastosowane dla poszczególnych potencjalnych problemów.</w:t>
       </w:r>
     </w:p>
     <w:p>
@@ -342,20 +483,12 @@
         <w:pStyle w:val="Heading2"/>
       </w:pPr>
       <w:r>
-        <w:t>2.1 Czasochłonność projektu</w:t>
+        <w:t>2.1 Czego dotyczy projekt</w:t>
       </w:r>
     </w:p>
     <w:p>
       <w:r>
-        <w:t>Łączny nakład pracy szacowany jest na ok. 36-40 roboczogodzin (rbh):</w:t>
-        <w:br/>
-        <w:t>- Projektowanie (UML i baza danych): 6 rbh – opracowanie struktury klas i bazy SQLite.</w:t>
-        <w:br/>
-        <w:t>- Implementacja (Java): 20-22 rbh – zakodowanie 5 kluczowych funkcjonalności oraz walidacji danych.</w:t>
-        <w:br/>
-        <w:t>- Testowanie: 5 rbh – sprawdzenie logiki rozliczeń i spójności transakcji.</w:t>
-        <w:br/>
-        <w:t>- Dokumentacja: 5 rbh – przygotowanie instrukcji i zrzutów ekranu.</w:t>
+        <w:t>System „Auto-Expert" to aplikacja konsolowa napisana w języku Java, przeznaczona do kompleksowej obsługi warsztatu samochodowego. Aplikacja jest dedykowana dla małych i średnich warsztatów, które potrzebują prostego, lokalnego narzędzia do zarządzania codziennymi operacjami bez konieczności instalacji serwera bazy danych czy zakupu kosztownych licencji.</w:t>
       </w:r>
     </w:p>
     <w:p>
@@ -363,7 +496,187 @@
         <w:pStyle w:val="Heading2"/>
       </w:pPr>
       <w:r>
-        <w:t>2.2 Zasoby i podział obowiązków</w:t>
+        <w:t>2.2 Moduły systemu</w:t>
+      </w:r>
+    </w:p>
+    <w:p>
+      <w:r>
+        <w:rPr>
+          <w:b/>
+        </w:rPr>
+        <w:t>Moduł 1: Ewidencja klientów i pojazdów</w:t>
+      </w:r>
+    </w:p>
+    <w:p>
+      <w:r>
+        <w:t>Odpowiada za przechowywanie danych klientów (imię, nazwisko, numer telefonu) oraz przypisanych do nich pojazdów (VIN, marka, model). Moduł zapewnia walidację danych wejściowych — numer telefonu musi składać się z dokładnie 9 cyfr (regex \d{9}), a numer VIN z dokładnie 17 znaków. Relacja klient–pojazd jest typu 1:* i jest zabezpieczona kluczem obcym (FOREIGN KEY).</w:t>
+      </w:r>
+    </w:p>
+    <w:p>
+      <w:r>
+        <w:rPr>
+          <w:b/>
+        </w:rPr>
+        <w:t>Moduł 2: Zarządzanie zleceniami (naprawami)</w:t>
+      </w:r>
+    </w:p>
+    <w:p>
+      <w:r>
+        <w:t>Umożliwia tworzenie kart napraw przypisanych do pojazdów poprzez numer VIN. Każde zlecenie posiada status (Przyjęte → W trakcie naprawy → Zakończone), który można zmieniać w trakcie realizacji. Do zlecenia można opcjonalnie przypisać mechanika. Moduł rejestruje również datę przyjęcia zlecenia.</w:t>
+      </w:r>
+    </w:p>
+    <w:p>
+      <w:r>
+        <w:rPr>
+          <w:b/>
+        </w:rPr>
+        <w:t>Moduł 3: Zarządzanie bazą części i materiałów</w:t>
+      </w:r>
+    </w:p>
+    <w:p>
+      <w:r>
+        <w:t>Prowadzi magazyn części zamiennych z informacją o nazwie, cenie jednostkowej, aktualnej ilości oraz minimalnym stanie magazynowym. System automatycznie generuje alert „NISKI STAN!", gdy ilość danej części spadnie poniżej ustalonego minimum. Pracownik może dodawać nowe części oraz aktualizować stany magazynowe.</w:t>
+      </w:r>
+    </w:p>
+    <w:p>
+      <w:r>
+        <w:rPr>
+          <w:b/>
+        </w:rPr>
+        <w:t>Moduł 4: Moduł rozliczeniowy</w:t>
+      </w:r>
+    </w:p>
+    <w:p>
+      <w:r>
+        <w:t>Automatycznie generuje kosztorysy na podstawie liczby roboczogodzin (stawka 150 PLN/rbh) oraz kosztu zużytych części. Dla każdej faktury użytkownik może wybrać formę płatności: gotówkową lub bezgotówkową. W przypadku płatności kartą system symuluje komunikację z zewnętrznym terminalem bankowym.</w:t>
+      </w:r>
+    </w:p>
+    <w:p>
+      <w:r>
+        <w:rPr>
+          <w:b/>
+        </w:rPr>
+        <w:t>Moduł 5: Archiwum historii serwisowej</w:t>
+      </w:r>
+    </w:p>
+    <w:p>
+      <w:r>
+        <w:t>Umożliwia przeglądanie pełnej historii napraw z możliwością filtrowania wyników. Dostępne są dwa kryteria wyszukiwania: po numerze VIN pojazdu (dokładne dopasowanie) oraz po nazwisku klienta (wyszukiwanie częściowe — LIKE). Wyniki zawierają szczegóły naprawy: datę, opis usterki, mechanika, status i koszt.</w:t>
+      </w:r>
+    </w:p>
+    <w:p>
+      <w:pPr>
+        <w:pStyle w:val="Heading2"/>
+      </w:pPr>
+      <w:r>
+        <w:t>2.3 Rozwiązania potencjalnych problemów</w:t>
+      </w:r>
+    </w:p>
+    <w:p>
+      <w:r>
+        <w:rPr>
+          <w:b/>
+        </w:rPr>
+        <w:t>Problem: Niespójność danych w bazie (np. pojazd bez właściciela)</w:t>
+      </w:r>
+    </w:p>
+    <w:p>
+      <w:r>
+        <w:t>Rozwiązanie: Zastosowanie kluczy obcych (FOREIGN KEY) z włączoną dyrektywą PRAGMA foreign_keys = ON przy każdym połączeniu z bazą. Baza SQLite automatycznie odrzuca operacje naruszające integralność referencyjną.</w:t>
+      </w:r>
+    </w:p>
+    <w:p>
+      <w:r>
+        <w:rPr>
+          <w:b/>
+        </w:rPr>
+        <w:t>Problem: Ataki SQL Injection przez pola formularzy</w:t>
+      </w:r>
+    </w:p>
+    <w:p>
+      <w:r>
+        <w:t>Rozwiązanie: Użycie mechanizmu PreparedStatement w JDBC we wszystkich zapytaniach do bazy danych. Parametry są przekazywane jako wartości typowane, co całkowicie eliminuje możliwość wstrzyknięcia złośliwego kodu SQL.</w:t>
+      </w:r>
+    </w:p>
+    <w:p>
+      <w:r>
+        <w:rPr>
+          <w:b/>
+        </w:rPr>
+        <w:t>Problem: Błędne dane wejściowe od użytkownika</w:t>
+      </w:r>
+    </w:p>
+    <w:p>
+      <w:r>
+        <w:t>Rozwiązanie: Wielopoziomowa walidacja — format telefonu (regex \d{9}), długość VIN (17 znaków), kontrola typów numerycznych (roboczogodziny, koszty), sprawdzenie pustych pól. Każdy błąd generuje czytelny komunikat z opisem wymagań.</w:t>
+      </w:r>
+    </w:p>
+    <w:p>
+      <w:r>
+        <w:rPr>
+          <w:b/>
+        </w:rPr>
+        <w:t>Problem: Utrata danych przy awarii sprzętu</w:t>
+      </w:r>
+    </w:p>
+    <w:p>
+      <w:r>
+        <w:t>Rozwiązanie: Korzystanie z systemu kontroli wersji Git/GitHub z codziennym wypychaniem zmian. Baza SQLite jest jednoplikowa — łatwa do tworzenia kopii zapasowych.</w:t>
+      </w:r>
+    </w:p>
+    <w:p>
+      <w:r>
+        <w:rPr>
+          <w:b/>
+        </w:rPr>
+        <w:t>Problem: Brak kompatybilności na różnych systemach</w:t>
+      </w:r>
+    </w:p>
+    <w:p>
+      <w:r>
+        <w:t>Rozwiązanie: Java jest wieloplatformowa (Write Once, Run Anywhere). Jedynym wymaganiem jest zainstalowane środowisko JRE 17+. SQLite nie wymaga osobnego serwera.</w:t>
+      </w:r>
+    </w:p>
+    <w:p>
+      <w:r>
+        <w:br w:type="page"/>
+      </w:r>
+    </w:p>
+    <w:p>
+      <w:pPr>
+        <w:pStyle w:val="Heading1"/>
+      </w:pPr>
+      <w:r>
+        <w:t>3. Czasochłonność, zasoby i harmonogram (Ćw. 8)</w:t>
+      </w:r>
+    </w:p>
+    <w:p>
+      <w:pPr>
+        <w:pStyle w:val="Heading2"/>
+      </w:pPr>
+      <w:r>
+        <w:t>3.1 Czasochłonność projektu</w:t>
+      </w:r>
+    </w:p>
+    <w:p>
+      <w:r>
+        <w:t>Łączny nakład pracy szacowany jest na ok. 36-40 roboczogodzin (rbh):</w:t>
+        <w:br/>
+        <w:t>- Projektowanie (UML i baza danych): 6 rbh</w:t>
+        <w:br/>
+        <w:t>- Implementacja (Java): 20-22 rbh</w:t>
+        <w:br/>
+        <w:t>- Testowanie: 5 rbh</w:t>
+        <w:br/>
+        <w:t>- Dokumentacja: 5 rbh</w:t>
+      </w:r>
+    </w:p>
+    <w:p>
+      <w:pPr>
+        <w:pStyle w:val="Heading2"/>
+      </w:pPr>
+      <w:r>
+        <w:t>3.2 Zasoby i podział obowiązków</w:t>
       </w:r>
     </w:p>
     <w:p>
@@ -398,7 +711,7 @@
         <w:pStyle w:val="ListBullet"/>
       </w:pPr>
       <w:r>
-        <w:t>Analiza i projektowanie: Przygotowanie diagramu przypadków użycia (Use Case) oraz zaprojektowanie struktury bazy danych SQLite.</w:t>
+        <w:t>Analiza i projektowanie: Diagram przypadków użycia (Use Case) oraz struktura bazy SQLite.</w:t>
       </w:r>
     </w:p>
     <w:p>
@@ -406,7 +719,7 @@
         <w:pStyle w:val="ListBullet"/>
       </w:pPr>
       <w:r>
-        <w:t>Implementacja: Stworzenie bazy danych i połączenia (JDBC). Moduł ewidencji klientów i pojazdów (interfejs + zapis do bazy). Moduł rozliczeniowy (automatyczne wyliczanie kosztów naprawy). Symulacja płatności bezgotówkowej.</w:t>
+        <w:t>Implementacja: Baza danych + JDBC. Moduł ewidencji klientów i pojazdów. Moduł rozliczeniowy + symulacja płatności bezgotówkowej.</w:t>
       </w:r>
     </w:p>
     <w:p>
@@ -414,7 +727,7 @@
         <w:pStyle w:val="ListBullet"/>
       </w:pPr>
       <w:r>
-        <w:t>Testy i dokumentacja: Przeprowadzenie testów walidacji danych i opisanie modułów ewidencji oraz rozliczeń w dokumentacji końcowej.</w:t>
+        <w:t>Testy: Testy walidacji danych. Opis modułów ewidencji i rozliczeń w dokumentacji.</w:t>
       </w:r>
     </w:p>
     <w:p>
@@ -430,7 +743,7 @@
         <w:pStyle w:val="ListBullet"/>
       </w:pPr>
       <w:r>
-        <w:t>Analiza i projektowanie: Przygotowanie diagramu klas UML, diagramu sekwencji dla procesu naprawy oraz diagramu ERD bazy danych.</w:t>
+        <w:t>Analiza i projektowanie: Diagram klas UML, diagram sekwencji, diagram ERD.</w:t>
       </w:r>
     </w:p>
     <w:p>
@@ -438,7 +751,7 @@
         <w:pStyle w:val="ListBullet"/>
       </w:pPr>
       <w:r>
-        <w:t>Implementacja: Przygotowanie głównego menu aplikacji. System zarządzania zleceniami/naprawami (zmiana statusów, przypisanie mechanika). Zarządzanie bazą części zamiennych (alert niskiego stanu). Archiwum historii serwisowej (filtrowanie).</w:t>
+        <w:t>Implementacja: Menu główne. Zarządzanie zleceniami + statusy. Baza części + alert. Historia serwisowa + filtrowanie.</w:t>
       </w:r>
     </w:p>
     <w:p>
@@ -446,7 +759,7 @@
         <w:pStyle w:val="ListBullet"/>
       </w:pPr>
       <w:r>
-        <w:t>Testy i dokumentacja: Przeprowadzenie testów transakcji bazodanowych oraz przygotowanie instrukcji obsługi, zrzutów ekranu i diagramów UML w dokumentacji końcowej.</w:t>
+        <w:t>Testy: Testy transakcji bazodanowych. Instrukcja obsługi, zrzuty ekranu, diagramy UML.</w:t>
       </w:r>
     </w:p>
     <w:p>
@@ -454,7 +767,7 @@
         <w:pStyle w:val="Heading2"/>
       </w:pPr>
       <w:r>
-        <w:t>2.3 Harmonogram realizacji</w:t>
+        <w:t>3.3 Harmonogram realizacji</w:t>
       </w:r>
     </w:p>
     <w:p>
@@ -481,6 +794,9 @@
           </w:tcPr>
           <w:p>
             <w:r>
+              <w:rPr>
+                <w:b/>
+              </w:rPr>
               <w:t>Tydzień</w:t>
             </w:r>
           </w:p>
@@ -491,6 +807,9 @@
           </w:tcPr>
           <w:p>
             <w:r>
+              <w:rPr>
+                <w:b/>
+              </w:rPr>
               <w:t>Zadania</w:t>
             </w:r>
           </w:p>
@@ -501,6 +820,9 @@
           </w:tcPr>
           <w:p>
             <w:r>
+              <w:rPr>
+                <w:b/>
+              </w:rPr>
               <w:t>Odpowiedzialny</w:t>
             </w:r>
           </w:p>
@@ -619,7 +941,7 @@
           </w:tcPr>
           <w:p>
             <w:r>
-              <w:t>Testy walidacji, poprawa błędów, dokumentacja końcowa</w:t>
+              <w:t>Testy, poprawa błędów, dokumentacja końcowa</w:t>
             </w:r>
           </w:p>
         </w:tc>
@@ -645,7 +967,7 @@
         <w:pStyle w:val="Heading1"/>
       </w:pPr>
       <w:r>
-        <w:t>3. Zarządzanie ryzykiem i kosztorys (Ćw. 9)</w:t>
+        <w:t>4. Zarządzanie ryzykiem i kosztorys (Ćw. 9)</w:t>
       </w:r>
     </w:p>
     <w:p>
@@ -653,7 +975,7 @@
         <w:pStyle w:val="Heading2"/>
       </w:pPr>
       <w:r>
-        <w:t>3.1 Zarządzanie ryzykiem</w:t>
+        <w:t>4.1 Zarządzanie ryzykiem</w:t>
       </w:r>
     </w:p>
     <w:tbl>
@@ -726,7 +1048,7 @@
           </w:tcPr>
           <w:p>
             <w:r>
-              <w:t>Błędne zaprojektowanie relacyjnej struktury bazy danych SQLite, co może skutkować problemami z normalizacją danych.</w:t>
+              <w:t>Błędne zaprojektowanie struktury bazy danych SQLite.</w:t>
             </w:r>
           </w:p>
         </w:tc>
@@ -736,7 +1058,7 @@
           </w:tcPr>
           <w:p>
             <w:r>
-              <w:t>Szczegółowa weryfikacja diagramu klas UML oraz struktury bazy przed rozpoczęciem kodowania.</w:t>
+              <w:t>Weryfikacja diagramu klas UML i struktury bazy przed kodowaniem.</w:t>
             </w:r>
           </w:p>
         </w:tc>
@@ -758,7 +1080,7 @@
           </w:tcPr>
           <w:p>
             <w:r>
-              <w:t>Opóźnienia w harmonogramie spowodowane trudnościami z integracją JDBC z interfejsem. Utrata kodu źródłowego (awaria laptopa).</w:t>
+              <w:t>Opóźnienia w integracji JDBC. Utrata kodu (awaria laptopa).</w:t>
             </w:r>
           </w:p>
         </w:tc>
@@ -768,7 +1090,7 @@
           </w:tcPr>
           <w:p>
             <w:r>
-              <w:t>Podział na niezależne moduły. Tydzień 4 jako bufor. Korzystanie z Git/GitHub z codziennym pushowaniem zmian.</w:t>
+              <w:t>Niezależne moduły. Tydzień 4 jako bufor. Git/GitHub z codziennym pushowaniem.</w:t>
             </w:r>
           </w:p>
         </w:tc>
@@ -790,7 +1112,7 @@
           </w:tcPr>
           <w:p>
             <w:r>
-              <w:t>Brak kompatybilności środowiska uruchomieniowego (brak Java na docelowym komputerze warsztatu).</w:t>
+              <w:t>Brak Java na docelowym komputerze warsztatu.</w:t>
             </w:r>
           </w:p>
         </w:tc>
@@ -800,7 +1122,7 @@
           </w:tcPr>
           <w:p>
             <w:r>
-              <w:t>Zbudowanie aplikacji do pliku .jar i dołączenie instrukcji instalacji JRE 17.</w:t>
+              <w:t>Budowa pliku .jar + instrukcja instalacji JRE 17.</w:t>
             </w:r>
           </w:p>
         </w:tc>
@@ -811,7 +1133,7 @@
         <w:pStyle w:val="Heading2"/>
       </w:pPr>
       <w:r>
-        <w:t>3.2 Szczegółowy kosztorys projektu</w:t>
+        <w:t>4.2 Szczegółowy kosztorys</w:t>
       </w:r>
     </w:p>
     <w:tbl>
@@ -835,7 +1157,7 @@
               <w:rPr>
                 <w:b/>
               </w:rPr>
-              <w:t>Pozycja kosztorysu</w:t>
+              <w:t>Pozycja</w:t>
             </w:r>
           </w:p>
         </w:tc>
@@ -860,7 +1182,7 @@
           </w:tcPr>
           <w:p>
             <w:r>
-              <w:t>A. Koszty osobowe: Analiza, projektowanie, implementacja i testowanie (2 programistów × 20 rbh × 80 PLN)</w:t>
+              <w:t>A. Koszty osobowe: 2 programistów × 20 rbh × 80 PLN</w:t>
             </w:r>
           </w:p>
         </w:tc>
@@ -882,7 +1204,7 @@
           </w:tcPr>
           <w:p>
             <w:r>
-              <w:t>Zarządzanie projektem i dokumentacja (wliczone w powyższą pulę)</w:t>
+              <w:t>Zarządzanie projektem i dokumentacja (wliczone)</w:t>
             </w:r>
           </w:p>
         </w:tc>
@@ -904,7 +1226,7 @@
           </w:tcPr>
           <w:p>
             <w:r>
-              <w:t>B. Koszty sprzętowe: Amortyzacja 2 laptopów (4 tygodnie × 200 PLN/laptop)</w:t>
+              <w:t>B. Amortyzacja sprzętu: 2 laptopy × 4 tygodnie</w:t>
             </w:r>
           </w:p>
         </w:tc>
@@ -926,7 +1248,7 @@
           </w:tcPr>
           <w:p>
             <w:r>
-              <w:t>Licencje oprogramowania (Open Source: VS Code, JDK 17, SQLite)</w:t>
+              <w:t>Licencje oprogramowania (Open Source)</w:t>
             </w:r>
           </w:p>
         </w:tc>
@@ -948,7 +1270,7 @@
           </w:tcPr>
           <w:p>
             <w:r>
-              <w:t>C. Koszty wdrożenia: Instalacja i konfiguracja na komputerze warsztatu (2 rbh)</w:t>
+              <w:t>C. Instalacja i konfiguracja (2 rbh × 80 PLN)</w:t>
             </w:r>
           </w:p>
         </w:tc>
@@ -970,7 +1292,7 @@
           </w:tcPr>
           <w:p>
             <w:r>
-              <w:t>Szkolenie personelu warsztatu (3 rbh)</w:t>
+              <w:t>Szkolenie personelu warsztatu (3 rbh × 80 PLN)</w:t>
             </w:r>
           </w:p>
         </w:tc>
@@ -992,7 +1314,7 @@
           <w:b/>
         </w:rPr>
         <w:br/>
-        <w:t>Całkowity szacowany koszt realizacji i wdrożenia systemu: 4 000 PLN netto.</w:t>
+        <w:t>Całkowity koszt realizacji i wdrożenia: 4 000 PLN netto.</w:t>
       </w:r>
     </w:p>
     <w:p>
@@ -1005,7 +1327,7 @@
         <w:pStyle w:val="Heading1"/>
       </w:pPr>
       <w:r>
-        <w:t>4. Specyfikacja przypadków użycia (Ćw. 10)</w:t>
+        <w:t>5. Specyfikacja przypadków użycia (Ćw. 10)</w:t>
       </w:r>
     </w:p>
     <w:p>
@@ -1013,7 +1335,7 @@
         <w:pStyle w:val="Heading2"/>
       </w:pPr>
       <w:r>
-        <w:t>4.1 Aktorzy systemu</w:t>
+        <w:t>5.1 Aktorzy systemu</w:t>
       </w:r>
     </w:p>
     <w:tbl>
@@ -1096,7 +1418,7 @@
           </w:tcPr>
           <w:p>
             <w:r>
-              <w:t>Bezpośrednia obsługa klienta, wprowadzanie danych, przyjmowanie pojazdów, rozliczenia końcowe.</w:t>
+              <w:t>Obsługa klienta, wprowadzanie danych, rozliczenia.</w:t>
             </w:r>
           </w:p>
         </w:tc>
@@ -1128,7 +1450,7 @@
           </w:tcPr>
           <w:p>
             <w:r>
-              <w:t>Realizacja napraw, zmiana statusów zleceń, przypisywanie zużytych części.</w:t>
+              <w:t>Realizacja napraw, zmiana statusów, przypisywanie części.</w:t>
             </w:r>
           </w:p>
         </w:tc>
@@ -1140,7 +1462,7 @@
           </w:tcPr>
           <w:p>
             <w:r>
-              <w:t>System Bankowy / Terminal</w:t>
+              <w:t>System Bankowy</w:t>
             </w:r>
           </w:p>
         </w:tc>
@@ -1150,7 +1472,7 @@
           </w:tcPr>
           <w:p>
             <w:r>
-              <w:t>Pomocniczy (zewnętrzny)</w:t>
+              <w:t>Pomocniczy</w:t>
             </w:r>
           </w:p>
         </w:tc>
@@ -1160,7 +1482,7 @@
           </w:tcPr>
           <w:p>
             <w:r>
-              <w:t>Procesowanie płatności bezgotówkowych w module rozliczeniowym.</w:t>
+              <w:t>Procesowanie płatności bezgotówkowych.</w:t>
             </w:r>
           </w:p>
         </w:tc>
@@ -1171,7 +1493,7 @@
         <w:pStyle w:val="Heading2"/>
       </w:pPr>
       <w:r>
-        <w:t>4.2 Przypadki użycia ze związkami «include» i «extend»</w:t>
+        <w:t>5.2 Przypadki użycia ze związkami «include» i «extend»</w:t>
       </w:r>
     </w:p>
     <w:p>
@@ -1182,7 +1504,7 @@
         <w:t>1. Zarządzanie ewidencją klientów i pojazdów</w:t>
       </w:r>
       <w:r>
-        <w:t xml:space="preserve"> (realizuje Maciej Jagodziński)</w:t>
+        <w:t xml:space="preserve"> (realizuje Maciej)</w:t>
       </w:r>
     </w:p>
     <w:p>
@@ -1190,7 +1512,7 @@
         <w:pStyle w:val="ListBullet"/>
       </w:pPr>
       <w:r>
-        <w:t>«include» Walidacja danych wejściowych — sprawdzenie poprawności pól (VIN, telefon).</w:t>
+        <w:t>«include» Walidacja danych wejściowych</w:t>
       </w:r>
     </w:p>
     <w:p>
@@ -1201,7 +1523,7 @@
         <w:t>2. Zarządzanie zleceniami (naprawami)</w:t>
       </w:r>
       <w:r>
-        <w:t xml:space="preserve"> (realizuje Mikhail Rodia)</w:t>
+        <w:t xml:space="preserve"> (realizuje Mikhail)</w:t>
       </w:r>
     </w:p>
     <w:p>
@@ -1209,7 +1531,7 @@
         <w:pStyle w:val="ListBullet"/>
       </w:pPr>
       <w:r>
-        <w:t>«include» Wyszukanie pojazdu w bazie — weryfikacja istnienia pojazdu przed otwarciem karty naprawy.</w:t>
+        <w:t>«include» Wyszukanie pojazdu w bazie</w:t>
       </w:r>
     </w:p>
     <w:p>
@@ -1217,7 +1539,7 @@
         <w:pStyle w:val="ListBullet"/>
       </w:pPr>
       <w:r>
-        <w:t>«extend» Przypisanie mechanika do zlecenia — opcjonalne rozszerzenie przy tworzeniu zlecenia.</w:t>
+        <w:t>«extend» Przypisanie mechanika do zlecenia</w:t>
       </w:r>
     </w:p>
     <w:p>
@@ -1228,7 +1550,7 @@
         <w:t>3. Zarządzanie bazą części i materiałów</w:t>
       </w:r>
       <w:r>
-        <w:t xml:space="preserve"> (realizuje Mikhail Rodia)</w:t>
+        <w:t xml:space="preserve"> (realizuje Mikhail)</w:t>
       </w:r>
     </w:p>
     <w:p>
@@ -1236,7 +1558,7 @@
         <w:pStyle w:val="ListBullet"/>
       </w:pPr>
       <w:r>
-        <w:t>«extend» Zgłoszenie niskiego stanu magazynowego — automatyczny alert, gdy ilość &lt; minimum.</w:t>
+        <w:t>«extend» Zgłoszenie niskiego stanu magazynowego</w:t>
       </w:r>
     </w:p>
     <w:p>
@@ -1247,7 +1569,7 @@
         <w:t>4. Generowanie kosztorysu i rozliczanie napraw</w:t>
       </w:r>
       <w:r>
-        <w:t xml:space="preserve"> (realizuje Maciej Jagodziński)</w:t>
+        <w:t xml:space="preserve"> (realizuje Maciej)</w:t>
       </w:r>
     </w:p>
     <w:p>
@@ -1255,7 +1577,7 @@
         <w:pStyle w:val="ListBullet"/>
       </w:pPr>
       <w:r>
-        <w:t>«include» Podsumowanie zużytych części i roboczogodzin — automatyczne obliczenia.</w:t>
+        <w:t>«include» Podsumowanie części i roboczogodzin</w:t>
       </w:r>
     </w:p>
     <w:p>
@@ -1263,7 +1585,7 @@
         <w:pStyle w:val="ListBullet"/>
       </w:pPr>
       <w:r>
-        <w:t>«extend» Płatność bezgotówkowa — komunikacja z zewnętrznym systemem bankowym.</w:t>
+        <w:t>«extend» Płatność bezgotówkowa</w:t>
       </w:r>
     </w:p>
     <w:p>
@@ -1274,7 +1596,7 @@
         <w:t>5. Przeglądanie historii serwisowej</w:t>
       </w:r>
       <w:r>
-        <w:t xml:space="preserve"> (realizuje Mikhail Rodia)</w:t>
+        <w:t xml:space="preserve"> (realizuje Mikhail)</w:t>
       </w:r>
     </w:p>
     <w:p>
@@ -1282,13 +1604,7 @@
         <w:pStyle w:val="ListBullet"/>
       </w:pPr>
       <w:r>
-        <w:t>«include» Filtrowanie wyników — wyszukiwanie po VIN lub nazwisku właściciela.</w:t>
-      </w:r>
-    </w:p>
-    <w:p>
-      <w:r>
-        <w:br/>
-        <w:t>Diagram przypadków użycia znajduje się w rozdziale 9.1.</w:t>
+        <w:t>«include» Filtrowanie wyników</w:t>
       </w:r>
     </w:p>
     <w:p>
@@ -1301,7 +1617,7 @@
         <w:pStyle w:val="Heading1"/>
       </w:pPr>
       <w:r>
-        <w:t>5. Strategia bezpieczeństwa projektu (Ćw. 11)</w:t>
+        <w:t>6. Strategia bezpieczeństwa projektu (Ćw. 11)</w:t>
       </w:r>
     </w:p>
     <w:p>
@@ -1309,7 +1625,7 @@
         <w:pStyle w:val="Heading2"/>
       </w:pPr>
       <w:r>
-        <w:t>5.1 Określenie zasobów – „co chronić"</w:t>
+        <w:t>6.1 Określenie zasobów — „co chronić"</w:t>
       </w:r>
     </w:p>
     <w:p>
@@ -1320,7 +1636,7 @@
         <w:t xml:space="preserve">Dane osobowe klientów i pracowników: </w:t>
       </w:r>
       <w:r>
-        <w:t>Imiona, nazwiska, numery telefonów, powiązania z pojazdami (VIN). Dane podlegające przepisom RODO.</w:t>
+        <w:t>Imiona, nazwiska, telefony, VIN. Podlegają RODO.</w:t>
       </w:r>
     </w:p>
     <w:p>
@@ -1328,10 +1644,10 @@
         <w:rPr>
           <w:b/>
         </w:rPr>
-        <w:t xml:space="preserve">Dane finansowe i operacyjne warsztatu: </w:t>
+        <w:t xml:space="preserve">Dane finansowe warsztatu: </w:t>
       </w:r>
       <w:r>
-        <w:t>Historia transakcji, kosztorysy, bazy cenowe części zamiennych, informacje o marżach serwisu.</w:t>
+        <w:t>Transakcje, kosztorysy, ceny części, marże.</w:t>
       </w:r>
     </w:p>
     <w:p>
@@ -1339,10 +1655,10 @@
         <w:rPr>
           <w:b/>
         </w:rPr>
-        <w:t xml:space="preserve">Integralność i ciągłość działania aplikacji: </w:t>
+        <w:t xml:space="preserve">Integralność aplikacji: </w:t>
       </w:r>
       <w:r>
-        <w:t>Kod źródłowy (.jar), konfiguracja JRE oraz fizyczny plik bazy SQLite — jego utrata blokuje pracę warsztatu.</w:t>
+        <w:t>Kod .jar, konfiguracja JRE, plik bazy SQLite.</w:t>
       </w:r>
     </w:p>
     <w:p>
@@ -1350,7 +1666,7 @@
         <w:pStyle w:val="Heading2"/>
       </w:pPr>
       <w:r>
-        <w:t>5.2 Identyfikacja zagrożeń – „przed czym chronić"</w:t>
+        <w:t>6.2 Identyfikacja zagrożeń — „przed czym chronić"</w:t>
       </w:r>
     </w:p>
     <w:p>
@@ -1366,7 +1682,7 @@
         <w:pStyle w:val="ListBullet"/>
       </w:pPr>
       <w:r>
-        <w:t>Nieautoryzowany dostęp lokalny — uruchomienie aplikacji lub otwarcie pliku bazy przez osobę nieuprawnioną.</w:t>
+        <w:t>Nieautoryzowany dostęp lokalny — uruchomienie aplikacji przez osobę nieuprawnioną.</w:t>
       </w:r>
     </w:p>
     <w:p>
@@ -1374,7 +1690,7 @@
         <w:pStyle w:val="ListBullet"/>
       </w:pPr>
       <w:r>
-        <w:t>Błędy ludzkie i ataki SQL Injection — wprowadzenie destrukcyjnych danych w polach formularzy.</w:t>
+        <w:t>Błędy ludzkie i ataki SQL Injection.</w:t>
       </w:r>
     </w:p>
     <w:p>
@@ -1382,7 +1698,7 @@
         <w:pStyle w:val="Heading2"/>
       </w:pPr>
       <w:r>
-        <w:t>5.3 Oszacowanie ryzyka – analiza kosztów i zysku</w:t>
+        <w:t>6.3 Oszacowanie ryzyka — analiza kosztów i zysku</w:t>
       </w:r>
     </w:p>
     <w:tbl>
@@ -1489,7 +1805,7 @@
           </w:tcPr>
           <w:p>
             <w:r>
-              <w:t>Automatyczny backup pliku SQLite na zewnętrzny nośnik przy zamykaniu aplikacji.</w:t>
+              <w:t>Automatyczny backup SQLite na zewnętrzny nośnik.</w:t>
             </w:r>
           </w:p>
         </w:tc>
@@ -1531,7 +1847,7 @@
           </w:tcPr>
           <w:p>
             <w:r>
-              <w:t>Lokalny ekran logowania, hasła hashowane (SHA-256) w bazie.</w:t>
+              <w:t>Ekran logowania, hasła hashowane SHA-256.</w:t>
             </w:r>
           </w:p>
         </w:tc>
@@ -1573,7 +1889,7 @@
           </w:tcPr>
           <w:p>
             <w:r>
-              <w:t>PreparedStatement w JDBC zamiast zwykłych zapytań tekstowych.</w:t>
+              <w:t>PreparedStatement w JDBC.</w:t>
             </w:r>
           </w:p>
         </w:tc>
@@ -1589,7 +1905,7 @@
         <w:pStyle w:val="Heading1"/>
       </w:pPr>
       <w:r>
-        <w:t>6. Harmonogram testów projektu (Ćw. 12)</w:t>
+        <w:t>7. Harmonogram testów projektu (Ćw. 12)</w:t>
       </w:r>
     </w:p>
     <w:p>
@@ -1597,12 +1913,12 @@
         <w:pStyle w:val="Heading2"/>
       </w:pPr>
       <w:r>
-        <w:t>6.1 Strategia testowania</w:t>
+        <w:t>7.1 Strategia testowania</w:t>
       </w:r>
     </w:p>
     <w:p>
       <w:r>
-        <w:t>Testowanie systemu „Auto-Expert" odbywa się metodą testów manualnych wykonywanych przez obu członków zespołu. Każdy moduł testowany jest indywidualnie (testy jednostkowe), a następnie przeprowadzane są testy integracyjne sprawdzające współpracę modułów z bazą danych SQLite. Stosowane jest testowanie krzyżowe — każdy tester weryfikuje moduły implementowane przez drugiego członka zespołu.</w:t>
+        <w:t>Testowanie manualne przez obu członków zespołu. Testy jednostkowe per moduł, następnie testy integracyjne. Testowanie krzyżowe — każdy testuje moduły drugiego.</w:t>
       </w:r>
     </w:p>
     <w:p>
@@ -1610,7 +1926,7 @@
         <w:pStyle w:val="Heading2"/>
       </w:pPr>
       <w:r>
-        <w:t>6.2 Scenariusze testowe</w:t>
+        <w:t>7.2 Scenariusze testowe</w:t>
       </w:r>
     </w:p>
     <w:tbl>
@@ -1722,7 +2038,7 @@
               <w:rPr>
                 <w:sz w:val="17"/>
               </w:rPr>
-              <w:t>Klient – dane poprawne</w:t>
+              <w:t>Klient — poprawne dane</w:t>
             </w:r>
           </w:p>
         </w:tc>
@@ -1748,7 +2064,7 @@
               <w:rPr>
                 <w:sz w:val="17"/>
               </w:rPr>
-              <w:t>Klient zapisany, komunikat OK</w:t>
+              <w:t>Klient zapisany</w:t>
             </w:r>
           </w:p>
         </w:tc>
@@ -1789,7 +2105,7 @@
               <w:rPr>
                 <w:sz w:val="17"/>
               </w:rPr>
-              <w:t>Klient – walidacja telefonu</w:t>
+              <w:t>Klient — walidacja</w:t>
             </w:r>
           </w:p>
         </w:tc>
@@ -1802,7 +2118,7 @@
               <w:rPr>
                 <w:sz w:val="17"/>
               </w:rPr>
-              <w:t>Telefon z literami / zła długość</w:t>
+              <w:t>Zły telefon</w:t>
             </w:r>
           </w:p>
         </w:tc>
@@ -1815,7 +2131,7 @@
               <w:rPr>
                 <w:sz w:val="17"/>
               </w:rPr>
-              <w:t>Błąd, klient NIE zapisany</w:t>
+              <w:t>Błąd, nie zapisany</w:t>
             </w:r>
           </w:p>
         </w:tc>
@@ -1856,7 +2172,7 @@
               <w:rPr>
                 <w:sz w:val="17"/>
               </w:rPr>
-              <w:t>Pojazd – walidacja VIN</w:t>
+              <w:t>Pojazd — walidacja VIN</w:t>
             </w:r>
           </w:p>
         </w:tc>
@@ -1882,7 +2198,7 @@
               <w:rPr>
                 <w:sz w:val="17"/>
               </w:rPr>
-              <w:t>Błąd, pojazd NIE zapisany</w:t>
+              <w:t>Błąd, nie zapisany</w:t>
             </w:r>
           </w:p>
         </w:tc>
@@ -1923,7 +2239,7 @@
               <w:rPr>
                 <w:sz w:val="17"/>
               </w:rPr>
-              <w:t>Naprawa z mechanikiem</w:t>
+              <w:t>Naprawa + mechanik</w:t>
             </w:r>
           </w:p>
         </w:tc>
@@ -1936,7 +2252,7 @@
               <w:rPr>
                 <w:sz w:val="17"/>
               </w:rPr>
-              <w:t>Nowa naprawa + nazwa mechanika</w:t>
+              <w:t>Nowa naprawa</w:t>
             </w:r>
           </w:p>
         </w:tc>
@@ -1949,7 +2265,7 @@
               <w:rPr>
                 <w:sz w:val="17"/>
               </w:rPr>
-              <w:t>Status „Przyjęte", mechanik przypisany</w:t>
+              <w:t>Status Przyjęte, mechanik przypisany</w:t>
             </w:r>
           </w:p>
         </w:tc>
@@ -1990,7 +2306,7 @@
               <w:rPr>
                 <w:sz w:val="17"/>
               </w:rPr>
-              <w:t>Zmiana statusu zlecenia</w:t>
+              <w:t>Zmiana statusu</w:t>
             </w:r>
           </w:p>
         </w:tc>
@@ -2016,7 +2332,7 @@
               <w:rPr>
                 <w:sz w:val="17"/>
               </w:rPr>
-              <w:t>Status zmieniony na liście</w:t>
+              <w:t>Status zmieniony</w:t>
             </w:r>
           </w:p>
         </w:tc>
@@ -2057,7 +2373,7 @@
               <w:rPr>
                 <w:sz w:val="17"/>
               </w:rPr>
-              <w:t>Części – dodawanie</w:t>
+              <w:t>Części — dodawanie</w:t>
             </w:r>
           </w:p>
         </w:tc>
@@ -2070,7 +2386,7 @@
               <w:rPr>
                 <w:sz w:val="17"/>
               </w:rPr>
-              <w:t>Nowa część: nazwa, cena, ilość, min</w:t>
+              <w:t>Nowa część w magazynie</w:t>
             </w:r>
           </w:p>
         </w:tc>
@@ -2083,7 +2399,7 @@
               <w:rPr>
                 <w:sz w:val="17"/>
               </w:rPr>
-              <w:t>Część widoczna w magazynie</w:t>
+              <w:t>Część widoczna</w:t>
             </w:r>
           </w:p>
         </w:tc>
@@ -2124,7 +2440,7 @@
               <w:rPr>
                 <w:sz w:val="17"/>
               </w:rPr>
-              <w:t>Części – alert niskiego stanu</w:t>
+              <w:t>Części — alert</w:t>
             </w:r>
           </w:p>
         </w:tc>
@@ -2150,7 +2466,7 @@
               <w:rPr>
                 <w:sz w:val="17"/>
               </w:rPr>
-              <w:t>Alert „⚠ NISKI STAN!"</w:t>
+              <w:t>Alert NISKI STAN</w:t>
             </w:r>
           </w:p>
         </w:tc>
@@ -2191,7 +2507,7 @@
               <w:rPr>
                 <w:sz w:val="17"/>
               </w:rPr>
-              <w:t>Rozliczenie – kalkulacja</w:t>
+              <w:t>Rozliczenie</w:t>
             </w:r>
           </w:p>
         </w:tc>
@@ -2204,7 +2520,7 @@
               <w:rPr>
                 <w:sz w:val="17"/>
               </w:rPr>
-              <w:t>2.5 rbh × 150 + 350 części</w:t>
+              <w:t>2.5 rbh × 150 + 350</w:t>
             </w:r>
           </w:p>
         </w:tc>
@@ -2258,7 +2574,7 @@
               <w:rPr>
                 <w:sz w:val="17"/>
               </w:rPr>
-              <w:t>Historia – filtr VIN</w:t>
+              <w:t>Historia — VIN</w:t>
             </w:r>
           </w:p>
         </w:tc>
@@ -2271,7 +2587,7 @@
               <w:rPr>
                 <w:sz w:val="17"/>
               </w:rPr>
-              <w:t>Wyszukanie po numerze VIN</w:t>
+              <w:t>Szukaj po VIN</w:t>
             </w:r>
           </w:p>
         </w:tc>
@@ -2284,7 +2600,7 @@
               <w:rPr>
                 <w:sz w:val="17"/>
               </w:rPr>
-              <w:t>Lista napraw danego pojazdu</w:t>
+              <w:t>Lista napraw pojazdu</w:t>
             </w:r>
           </w:p>
         </w:tc>
@@ -2325,7 +2641,7 @@
               <w:rPr>
                 <w:sz w:val="17"/>
               </w:rPr>
-              <w:t>Historia – filtr nazwisko</w:t>
+              <w:t>Historia — nazwisko</w:t>
             </w:r>
           </w:p>
         </w:tc>
@@ -2338,7 +2654,7 @@
               <w:rPr>
                 <w:sz w:val="17"/>
               </w:rPr>
-              <w:t>Fragment nazwiska klienta</w:t>
+              <w:t>Fragment nazwiska</w:t>
             </w:r>
           </w:p>
         </w:tc>
@@ -2351,7 +2667,7 @@
               <w:rPr>
                 <w:sz w:val="17"/>
               </w:rPr>
-              <w:t>Pasujące wyniki (LIKE)</w:t>
+              <w:t>Pasujące wyniki</w:t>
             </w:r>
           </w:p>
         </w:tc>
@@ -2375,38 +2691,16 @@
         <w:pStyle w:val="Heading2"/>
       </w:pPr>
       <w:r>
-        <w:t>6.3 Czas trwania i przydział testerów</w:t>
+        <w:t>7.3 Czas i przydział</w:t>
       </w:r>
     </w:p>
     <w:p>
       <w:r>
-        <w:t>Łączny czas testowania: 5 roboczogodzin.</w:t>
+        <w:t>Łączny czas: 5 rbh. Testy jednostkowe: 3 rbh. Integracyjne: 1 rbh. Walidacja: 1 rbh.</w:t>
         <w:br/>
-        <w:t>- Testy jednostkowe poszczególnych modułów: 3 rbh (po ~0.5 rbh na moduł)</w:t>
+        <w:t>Maciej testuje moduły Mikhaila (T4-T7, T9-T10). Mikhail testuje moduły Macieja (T1-T3, T8).</w:t>
         <w:br/>
-        <w:t>- Testy integracyjne (współpraca modułów z bazą danych): 1 rbh</w:t>
-        <w:br/>
-        <w:t>- Testy walidacji danych wejściowych i scenariuszy błędnych: 1 rbh</w:t>
-        <w:br/>
-        <w:br/>
-        <w:t>Testowanie krzyżowe:</w:t>
-        <w:br/>
-        <w:t>- Maciej Jagodziński testuje moduły Mikhail'a: zlecenia, części, historia (T4-T7, T9-T10)</w:t>
-        <w:br/>
-        <w:t>- Mikhail Rodia testuje moduły Maciej'a: ewidencja, rozliczenia (T1-T3, T8)</w:t>
-      </w:r>
-    </w:p>
-    <w:p>
-      <w:pPr>
-        <w:pStyle w:val="Heading2"/>
-      </w:pPr>
-      <w:r>
-        <w:t>6.4 Wyniki testów</w:t>
-      </w:r>
-    </w:p>
-    <w:p>
-      <w:r>
-        <w:t>Wszystkie 10 scenariuszy testowych (T1–T10) zakończone wynikiem pozytywnym (PASS). Nie wykryto błędów krytycznych.</w:t>
+        <w:t>Wynik: 10/10 PASS.</w:t>
       </w:r>
     </w:p>
     <w:p>
@@ -2419,7 +2713,12 @@
         <w:pStyle w:val="Heading1"/>
       </w:pPr>
       <w:r>
-        <w:t>7. Instrukcja obsługi systemu</w:t>
+        <w:t>8. Zasady stosowania zabezpieczeń (Ćw. 13)</w:t>
+      </w:r>
+    </w:p>
+    <w:p>
+      <w:r>
+        <w:t>Na podstawie wykładu dotyczącego złożoności problemu stosowania zabezpieczeń, poniżej opisano realizację 4 kluczowych zasad w systemie „Auto-Expert".</w:t>
       </w:r>
     </w:p>
     <w:p>
@@ -2427,937 +2726,12 @@
         <w:pStyle w:val="Heading2"/>
       </w:pPr>
       <w:r>
-        <w:t>7.1 Wymagania systemowe</w:t>
-      </w:r>
-    </w:p>
-    <w:p>
-      <w:pPr>
-        <w:pStyle w:val="ListBullet"/>
-      </w:pPr>
-      <w:r>
-        <w:t>Java Runtime Environment (JRE) w wersji 17 lub nowszej</w:t>
-      </w:r>
-    </w:p>
-    <w:p>
-      <w:pPr>
-        <w:pStyle w:val="ListBullet"/>
-      </w:pPr>
-      <w:r>
-        <w:t>System operacyjny: Windows / macOS / Linux</w:t>
-      </w:r>
-    </w:p>
-    <w:p>
-      <w:pPr>
-        <w:pStyle w:val="ListBullet"/>
-      </w:pPr>
-      <w:r>
-        <w:t>Biblioteka sqlite-jdbc-3.53.1.0.jar (dołączona w folderze lib/)</w:t>
-      </w:r>
-    </w:p>
-    <w:p>
-      <w:pPr>
-        <w:pStyle w:val="Heading2"/>
-      </w:pPr>
-      <w:r>
-        <w:t>7.2 Kompilacja i uruchomienie</w:t>
+        <w:t>8.1 Zasada naturalnego styku z użytkownikiem</w:t>
       </w:r>
     </w:p>
     <w:p>
       <w:r>
-        <w:t>Kompilacja:</w:t>
-      </w:r>
-    </w:p>
-    <w:p>
-      <w:r>
-        <w:rPr>
-          <w:rFonts w:ascii="Consolas" w:hAnsi="Consolas"/>
-          <w:sz w:val="20"/>
-        </w:rPr>
-        <w:t>javac -cp "lib/sqlite-jdbc-3.53.1.0.jar" -d bin src/*.java</w:t>
-      </w:r>
-    </w:p>
-    <w:p>
-      <w:r>
-        <w:t>Uruchomienie (macOS/Linux):</w:t>
-      </w:r>
-    </w:p>
-    <w:p>
-      <w:r>
-        <w:rPr>
-          <w:rFonts w:ascii="Consolas" w:hAnsi="Consolas"/>
-          <w:sz w:val="20"/>
-        </w:rPr>
-        <w:t>java -cp "bin:lib/sqlite-jdbc-3.53.1.0.jar" App</w:t>
-      </w:r>
-    </w:p>
-    <w:p>
-      <w:r>
-        <w:t>Uruchomienie (Windows):</w:t>
-      </w:r>
-    </w:p>
-    <w:p>
-      <w:r>
-        <w:rPr>
-          <w:rFonts w:ascii="Consolas" w:hAnsi="Consolas"/>
-          <w:sz w:val="20"/>
-        </w:rPr>
-        <w:t>java -cp "bin;lib\sqlite-jdbc-3.53.1.0.jar" App</w:t>
-      </w:r>
-    </w:p>
-    <w:p>
-      <w:pPr>
-        <w:pStyle w:val="Heading2"/>
-      </w:pPr>
-      <w:r>
-        <w:t>7.3 Obsługa menu</w:t>
-      </w:r>
-    </w:p>
-    <w:p>
-      <w:r>
-        <w:t>Po uruchomieniu wyświetla się menu główne z opcjami 0-9. Należy wpisać numer opcji i nacisnąć Enter. Opcje 7, 8 i 9 otwierają podmenu z własnymi opcjami — powrót do menu głównego przez 0.</w:t>
-      </w:r>
-    </w:p>
-    <w:p>
-      <w:r>
-        <w:rPr>
-          <w:b/>
-        </w:rPr>
-        <w:t xml:space="preserve">Opcja 1 – Dodaj klienta: </w:t>
-      </w:r>
-      <w:r>
-        <w:t>Imię, nazwisko, telefon (dokładnie 9 cyfr). Walidacja automatyczna.</w:t>
-      </w:r>
-    </w:p>
-    <w:p>
-      <w:r>
-        <w:rPr>
-          <w:b/>
-        </w:rPr>
-        <w:t xml:space="preserve">Opcja 2 – Lista klientów: </w:t>
-      </w:r>
-      <w:r>
-        <w:t>ID, imię, nazwisko, telefon wszystkich klientów.</w:t>
-      </w:r>
-    </w:p>
-    <w:p>
-      <w:r>
-        <w:rPr>
-          <w:b/>
-        </w:rPr>
-        <w:t xml:space="preserve">Opcja 3 – Dodaj pojazd: </w:t>
-      </w:r>
-      <w:r>
-        <w:t>17-znakowy VIN, marka, model, ID właściciela.</w:t>
-      </w:r>
-    </w:p>
-    <w:p>
-      <w:r>
-        <w:rPr>
-          <w:b/>
-        </w:rPr>
-        <w:t xml:space="preserve">Opcja 4 – Lista pojazdów: </w:t>
-      </w:r>
-      <w:r>
-        <w:t>VIN, marka, model, właściciel.</w:t>
-      </w:r>
-    </w:p>
-    <w:p>
-      <w:r>
-        <w:rPr>
-          <w:b/>
-        </w:rPr>
-        <w:t xml:space="preserve">Opcja 5 – Nowa naprawa: </w:t>
-      </w:r>
-      <w:r>
-        <w:t>Opis usterki, roboczogodziny, koszt części, VIN, mechanik (opcjonalnie).</w:t>
-      </w:r>
-    </w:p>
-    <w:p>
-      <w:r>
-        <w:rPr>
-          <w:b/>
-        </w:rPr>
-        <w:t xml:space="preserve">Opcja 6 – Rozliczenia: </w:t>
-      </w:r>
-      <w:r>
-        <w:t>Faktury z kalkulacją + wybór płatności gotówkowej/bezgotówkowej.</w:t>
-      </w:r>
-    </w:p>
-    <w:p>
-      <w:r>
-        <w:rPr>
-          <w:b/>
-        </w:rPr>
-        <w:t xml:space="preserve">Opcja 7 – Zlecenia: </w:t>
-      </w:r>
-      <w:r>
-        <w:t>Lista zleceń ze statusami. Zmiana statusu: Przyjęte → W trakcie → Zakończone.</w:t>
-      </w:r>
-    </w:p>
-    <w:p>
-      <w:r>
-        <w:rPr>
-          <w:b/>
-        </w:rPr>
-        <w:t xml:space="preserve">Opcja 8 – Magazyn części: </w:t>
-      </w:r>
-      <w:r>
-        <w:t>Lista z alertami niskiego stanu. Dodawanie i aktualizacja ilości.</w:t>
-      </w:r>
-    </w:p>
-    <w:p>
-      <w:r>
-        <w:rPr>
-          <w:b/>
-        </w:rPr>
-        <w:t xml:space="preserve">Opcja 9 – Historia serwisowa: </w:t>
-      </w:r>
-      <w:r>
-        <w:t>Wyszukiwanie po VIN lub nazwisku klienta.</w:t>
-      </w:r>
-    </w:p>
-    <w:p>
-      <w:r>
-        <w:br w:type="page"/>
-      </w:r>
-    </w:p>
-    <w:p>
-      <w:pPr>
-        <w:pStyle w:val="Heading1"/>
-      </w:pPr>
-      <w:r>
-        <w:t>8. Zrzuty ekranowe</w:t>
-      </w:r>
-    </w:p>
-    <w:p>
-      <w:pPr>
-        <w:jc w:val="center"/>
-      </w:pPr>
-      <w:r>
-        <w:drawing>
-          <wp:inline xmlns:a="http://schemas.openxmlformats.org/drawingml/2006/main" xmlns:pic="http://schemas.openxmlformats.org/drawingml/2006/picture">
-            <wp:extent cx="5303520" cy="4037249"/>
-            <wp:docPr id="1" name="Picture 1"/>
-            <wp:cNvGraphicFramePr>
-              <a:graphicFrameLocks noChangeAspect="1"/>
-            </wp:cNvGraphicFramePr>
-            <a:graphic>
-              <a:graphicData uri="http://schemas.openxmlformats.org/drawingml/2006/picture">
-                <pic:pic>
-                  <pic:nvPicPr>
-                    <pic:cNvPr id="0" name="screen_menu.png"/>
-                    <pic:cNvPicPr/>
-                  </pic:nvPicPr>
-                  <pic:blipFill>
-                    <a:blip r:embed="rId9"/>
-                    <a:stretch>
-                      <a:fillRect/>
-                    </a:stretch>
-                  </pic:blipFill>
-                  <pic:spPr>
-                    <a:xfrm>
-                      <a:off x="0" y="0"/>
-                      <a:ext cx="5303520" cy="4037249"/>
-                    </a:xfrm>
-                    <a:prstGeom prst="rect"/>
-                  </pic:spPr>
-                </pic:pic>
-              </a:graphicData>
-            </a:graphic>
-          </wp:inline>
-        </w:drawing>
-      </w:r>
-    </w:p>
-    <w:p>
-      <w:pPr>
-        <w:jc w:val="center"/>
-      </w:pPr>
-      <w:r>
-        <w:rPr>
-          <w:i/>
-          <w:sz w:val="18"/>
-        </w:rPr>
-        <w:t>Rysunek 1: Menu główne systemu Auto-Expert</w:t>
-      </w:r>
-    </w:p>
-    <w:p/>
-    <w:p>
-      <w:pPr>
-        <w:jc w:val="center"/>
-      </w:pPr>
-      <w:r>
-        <w:drawing>
-          <wp:inline xmlns:a="http://schemas.openxmlformats.org/drawingml/2006/main" xmlns:pic="http://schemas.openxmlformats.org/drawingml/2006/picture">
-            <wp:extent cx="5303520" cy="2738756"/>
-            <wp:docPr id="2" name="Picture 2"/>
-            <wp:cNvGraphicFramePr>
-              <a:graphicFrameLocks noChangeAspect="1"/>
-            </wp:cNvGraphicFramePr>
-            <a:graphic>
-              <a:graphicData uri="http://schemas.openxmlformats.org/drawingml/2006/picture">
-                <pic:pic>
-                  <pic:nvPicPr>
-                    <pic:cNvPr id="0" name="screen_klient.png"/>
-                    <pic:cNvPicPr/>
-                  </pic:nvPicPr>
-                  <pic:blipFill>
-                    <a:blip r:embed="rId10"/>
-                    <a:stretch>
-                      <a:fillRect/>
-                    </a:stretch>
-                  </pic:blipFill>
-                  <pic:spPr>
-                    <a:xfrm>
-                      <a:off x="0" y="0"/>
-                      <a:ext cx="5303520" cy="2738756"/>
-                    </a:xfrm>
-                    <a:prstGeom prst="rect"/>
-                  </pic:spPr>
-                </pic:pic>
-              </a:graphicData>
-            </a:graphic>
-          </wp:inline>
-        </w:drawing>
-      </w:r>
-    </w:p>
-    <w:p>
-      <w:pPr>
-        <w:jc w:val="center"/>
-      </w:pPr>
-      <w:r>
-        <w:rPr>
-          <w:i/>
-          <w:sz w:val="18"/>
-        </w:rPr>
-        <w:t>Rysunek 2: Dodawanie klienta z walidacją numeru telefonu</w:t>
-      </w:r>
-    </w:p>
-    <w:p/>
-    <w:p>
-      <w:pPr>
-        <w:jc w:val="center"/>
-      </w:pPr>
-      <w:r>
-        <w:drawing>
-          <wp:inline xmlns:a="http://schemas.openxmlformats.org/drawingml/2006/main" xmlns:pic="http://schemas.openxmlformats.org/drawingml/2006/picture">
-            <wp:extent cx="5303520" cy="2738756"/>
-            <wp:docPr id="3" name="Picture 3"/>
-            <wp:cNvGraphicFramePr>
-              <a:graphicFrameLocks noChangeAspect="1"/>
-            </wp:cNvGraphicFramePr>
-            <a:graphic>
-              <a:graphicData uri="http://schemas.openxmlformats.org/drawingml/2006/picture">
-                <pic:pic>
-                  <pic:nvPicPr>
-                    <pic:cNvPr id="0" name="screen_lista.png"/>
-                    <pic:cNvPicPr/>
-                  </pic:nvPicPr>
-                  <pic:blipFill>
-                    <a:blip r:embed="rId11"/>
-                    <a:stretch>
-                      <a:fillRect/>
-                    </a:stretch>
-                  </pic:blipFill>
-                  <pic:spPr>
-                    <a:xfrm>
-                      <a:off x="0" y="0"/>
-                      <a:ext cx="5303520" cy="2738756"/>
-                    </a:xfrm>
-                    <a:prstGeom prst="rect"/>
-                  </pic:spPr>
-                </pic:pic>
-              </a:graphicData>
-            </a:graphic>
-          </wp:inline>
-        </w:drawing>
-      </w:r>
-    </w:p>
-    <w:p>
-      <w:pPr>
-        <w:jc w:val="center"/>
-      </w:pPr>
-      <w:r>
-        <w:rPr>
-          <w:i/>
-          <w:sz w:val="18"/>
-        </w:rPr>
-        <w:t>Rysunek 3: Lista klientów i pojazdów w systemie</w:t>
-      </w:r>
-    </w:p>
-    <w:p/>
-    <w:p>
-      <w:pPr>
-        <w:jc w:val="center"/>
-      </w:pPr>
-      <w:r>
-        <w:drawing>
-          <wp:inline xmlns:a="http://schemas.openxmlformats.org/drawingml/2006/main" xmlns:pic="http://schemas.openxmlformats.org/drawingml/2006/picture">
-            <wp:extent cx="5303520" cy="2577653"/>
-            <wp:docPr id="4" name="Picture 4"/>
-            <wp:cNvGraphicFramePr>
-              <a:graphicFrameLocks noChangeAspect="1"/>
-            </wp:cNvGraphicFramePr>
-            <a:graphic>
-              <a:graphicData uri="http://schemas.openxmlformats.org/drawingml/2006/picture">
-                <pic:pic>
-                  <pic:nvPicPr>
-                    <pic:cNvPr id="0" name="screen_vin.png"/>
-                    <pic:cNvPicPr/>
-                  </pic:nvPicPr>
-                  <pic:blipFill>
-                    <a:blip r:embed="rId12"/>
-                    <a:stretch>
-                      <a:fillRect/>
-                    </a:stretch>
-                  </pic:blipFill>
-                  <pic:spPr>
-                    <a:xfrm>
-                      <a:off x="0" y="0"/>
-                      <a:ext cx="5303520" cy="2577653"/>
-                    </a:xfrm>
-                    <a:prstGeom prst="rect"/>
-                  </pic:spPr>
-                </pic:pic>
-              </a:graphicData>
-            </a:graphic>
-          </wp:inline>
-        </w:drawing>
-      </w:r>
-    </w:p>
-    <w:p>
-      <w:pPr>
-        <w:jc w:val="center"/>
-      </w:pPr>
-      <w:r>
-        <w:rPr>
-          <w:i/>
-          <w:sz w:val="18"/>
-        </w:rPr>
-        <w:t>Rysunek 4: Walidacja numeru VIN przy dodawaniu pojazdu</w:t>
-      </w:r>
-    </w:p>
-    <w:p/>
-    <w:p>
-      <w:pPr>
-        <w:jc w:val="center"/>
-      </w:pPr>
-      <w:r>
-        <w:drawing>
-          <wp:inline xmlns:a="http://schemas.openxmlformats.org/drawingml/2006/main" xmlns:pic="http://schemas.openxmlformats.org/drawingml/2006/picture">
-            <wp:extent cx="5303520" cy="4523781"/>
-            <wp:docPr id="5" name="Picture 5"/>
-            <wp:cNvGraphicFramePr>
-              <a:graphicFrameLocks noChangeAspect="1"/>
-            </wp:cNvGraphicFramePr>
-            <a:graphic>
-              <a:graphicData uri="http://schemas.openxmlformats.org/drawingml/2006/picture">
-                <pic:pic>
-                  <pic:nvPicPr>
-                    <pic:cNvPr id="0" name="screen_zlecenia.png"/>
-                    <pic:cNvPicPr/>
-                  </pic:nvPicPr>
-                  <pic:blipFill>
-                    <a:blip r:embed="rId13"/>
-                    <a:stretch>
-                      <a:fillRect/>
-                    </a:stretch>
-                  </pic:blipFill>
-                  <pic:spPr>
-                    <a:xfrm>
-                      <a:off x="0" y="0"/>
-                      <a:ext cx="5303520" cy="4523781"/>
-                    </a:xfrm>
-                    <a:prstGeom prst="rect"/>
-                  </pic:spPr>
-                </pic:pic>
-              </a:graphicData>
-            </a:graphic>
-          </wp:inline>
-        </w:drawing>
-      </w:r>
-    </w:p>
-    <w:p>
-      <w:pPr>
-        <w:jc w:val="center"/>
-      </w:pPr>
-      <w:r>
-        <w:rPr>
-          <w:i/>
-          <w:sz w:val="18"/>
-        </w:rPr>
-        <w:t>Rysunek 5: Zarządzanie zleceniami — lista i zmiana statusu</w:t>
-      </w:r>
-    </w:p>
-    <w:p/>
-    <w:p>
-      <w:pPr>
-        <w:jc w:val="center"/>
-      </w:pPr>
-      <w:r>
-        <w:drawing>
-          <wp:inline xmlns:a="http://schemas.openxmlformats.org/drawingml/2006/main" xmlns:pic="http://schemas.openxmlformats.org/drawingml/2006/picture">
-            <wp:extent cx="5303520" cy="4523781"/>
-            <wp:docPr id="6" name="Picture 6"/>
-            <wp:cNvGraphicFramePr>
-              <a:graphicFrameLocks noChangeAspect="1"/>
-            </wp:cNvGraphicFramePr>
-            <a:graphic>
-              <a:graphicData uri="http://schemas.openxmlformats.org/drawingml/2006/picture">
-                <pic:pic>
-                  <pic:nvPicPr>
-                    <pic:cNvPr id="0" name="screen_rozliczenie.png"/>
-                    <pic:cNvPicPr/>
-                  </pic:nvPicPr>
-                  <pic:blipFill>
-                    <a:blip r:embed="rId14"/>
-                    <a:stretch>
-                      <a:fillRect/>
-                    </a:stretch>
-                  </pic:blipFill>
-                  <pic:spPr>
-                    <a:xfrm>
-                      <a:off x="0" y="0"/>
-                      <a:ext cx="5303520" cy="4523781"/>
-                    </a:xfrm>
-                    <a:prstGeom prst="rect"/>
-                  </pic:spPr>
-                </pic:pic>
-              </a:graphicData>
-            </a:graphic>
-          </wp:inline>
-        </w:drawing>
-      </w:r>
-    </w:p>
-    <w:p>
-      <w:pPr>
-        <w:jc w:val="center"/>
-      </w:pPr>
-      <w:r>
-        <w:rPr>
-          <w:i/>
-          <w:sz w:val="18"/>
-        </w:rPr>
-        <w:t>Rysunek 6: Moduł rozliczeniowy z płatnością bezgotówkową</w:t>
-      </w:r>
-    </w:p>
-    <w:p/>
-    <w:p>
-      <w:pPr>
-        <w:jc w:val="center"/>
-      </w:pPr>
-      <w:r>
-        <w:drawing>
-          <wp:inline xmlns:a="http://schemas.openxmlformats.org/drawingml/2006/main" xmlns:pic="http://schemas.openxmlformats.org/drawingml/2006/picture">
-            <wp:extent cx="5303520" cy="2577653"/>
-            <wp:docPr id="7" name="Picture 7"/>
-            <wp:cNvGraphicFramePr>
-              <a:graphicFrameLocks noChangeAspect="1"/>
-            </wp:cNvGraphicFramePr>
-            <a:graphic>
-              <a:graphicData uri="http://schemas.openxmlformats.org/drawingml/2006/picture">
-                <pic:pic>
-                  <pic:nvPicPr>
-                    <pic:cNvPr id="0" name="screen_czesci.png"/>
-                    <pic:cNvPicPr/>
-                  </pic:nvPicPr>
-                  <pic:blipFill>
-                    <a:blip r:embed="rId15"/>
-                    <a:stretch>
-                      <a:fillRect/>
-                    </a:stretch>
-                  </pic:blipFill>
-                  <pic:spPr>
-                    <a:xfrm>
-                      <a:off x="0" y="0"/>
-                      <a:ext cx="5303520" cy="2577653"/>
-                    </a:xfrm>
-                    <a:prstGeom prst="rect"/>
-                  </pic:spPr>
-                </pic:pic>
-              </a:graphicData>
-            </a:graphic>
-          </wp:inline>
-        </w:drawing>
-      </w:r>
-    </w:p>
-    <w:p>
-      <w:pPr>
-        <w:jc w:val="center"/>
-      </w:pPr>
-      <w:r>
-        <w:rPr>
-          <w:i/>
-          <w:sz w:val="18"/>
-        </w:rPr>
-        <w:t>Rysunek 7: Magazyn części z alertem niskiego stanu</w:t>
-      </w:r>
-    </w:p>
-    <w:p/>
-    <w:p>
-      <w:pPr>
-        <w:jc w:val="center"/>
-      </w:pPr>
-      <w:r>
-        <w:drawing>
-          <wp:inline xmlns:a="http://schemas.openxmlformats.org/drawingml/2006/main" xmlns:pic="http://schemas.openxmlformats.org/drawingml/2006/picture">
-            <wp:extent cx="5303520" cy="3225288"/>
-            <wp:docPr id="8" name="Picture 8"/>
-            <wp:cNvGraphicFramePr>
-              <a:graphicFrameLocks noChangeAspect="1"/>
-            </wp:cNvGraphicFramePr>
-            <a:graphic>
-              <a:graphicData uri="http://schemas.openxmlformats.org/drawingml/2006/picture">
-                <pic:pic>
-                  <pic:nvPicPr>
-                    <pic:cNvPr id="0" name="screen_historia.png"/>
-                    <pic:cNvPicPr/>
-                  </pic:nvPicPr>
-                  <pic:blipFill>
-                    <a:blip r:embed="rId16"/>
-                    <a:stretch>
-                      <a:fillRect/>
-                    </a:stretch>
-                  </pic:blipFill>
-                  <pic:spPr>
-                    <a:xfrm>
-                      <a:off x="0" y="0"/>
-                      <a:ext cx="5303520" cy="3225288"/>
-                    </a:xfrm>
-                    <a:prstGeom prst="rect"/>
-                  </pic:spPr>
-                </pic:pic>
-              </a:graphicData>
-            </a:graphic>
-          </wp:inline>
-        </w:drawing>
-      </w:r>
-    </w:p>
-    <w:p>
-      <w:pPr>
-        <w:jc w:val="center"/>
-      </w:pPr>
-      <w:r>
-        <w:rPr>
-          <w:i/>
-          <w:sz w:val="18"/>
-        </w:rPr>
-        <w:t>Rysunek 8: Archiwum historii serwisowej — wyszukiwanie po VIN</w:t>
-      </w:r>
-    </w:p>
-    <w:p/>
-    <w:p>
-      <w:r>
-        <w:br w:type="page"/>
-      </w:r>
-    </w:p>
-    <w:p>
-      <w:pPr>
-        <w:pStyle w:val="Heading1"/>
-      </w:pPr>
-      <w:r>
-        <w:t>9. Diagramy UML</w:t>
-      </w:r>
-    </w:p>
-    <w:p>
-      <w:pPr>
-        <w:pStyle w:val="Heading2"/>
-      </w:pPr>
-      <w:r>
-        <w:t>9.1 Diagram przypadków użycia (Use Case)</w:t>
-      </w:r>
-    </w:p>
-    <w:p>
-      <w:r>
-        <w:t>Diagram przedstawia 5 głównych przypadków użycia systemu (kolor niebieski), przypadki włączone «include» i rozszerzające «extend» (kolor żółty) oraz 3 aktorów: Pracownik Biura, Mechanik i System Bankowy.</w:t>
-      </w:r>
-    </w:p>
-    <w:p>
-      <w:pPr>
-        <w:jc w:val="center"/>
-      </w:pPr>
-      <w:r>
-        <w:drawing>
-          <wp:inline xmlns:a="http://schemas.openxmlformats.org/drawingml/2006/main" xmlns:pic="http://schemas.openxmlformats.org/drawingml/2006/picture">
-            <wp:extent cx="5303520" cy="3949033"/>
-            <wp:docPr id="9" name="Picture 9"/>
-            <wp:cNvGraphicFramePr>
-              <a:graphicFrameLocks noChangeAspect="1"/>
-            </wp:cNvGraphicFramePr>
-            <a:graphic>
-              <a:graphicData uri="http://schemas.openxmlformats.org/drawingml/2006/picture">
-                <pic:pic>
-                  <pic:nvPicPr>
-                    <pic:cNvPr id="0" name="diagram_use_case.png"/>
-                    <pic:cNvPicPr/>
-                  </pic:nvPicPr>
-                  <pic:blipFill>
-                    <a:blip r:embed="rId17"/>
-                    <a:stretch>
-                      <a:fillRect/>
-                    </a:stretch>
-                  </pic:blipFill>
-                  <pic:spPr>
-                    <a:xfrm>
-                      <a:off x="0" y="0"/>
-                      <a:ext cx="5303520" cy="3949033"/>
-                    </a:xfrm>
-                    <a:prstGeom prst="rect"/>
-                  </pic:spPr>
-                </pic:pic>
-              </a:graphicData>
-            </a:graphic>
-          </wp:inline>
-        </w:drawing>
-      </w:r>
-    </w:p>
-    <w:p>
-      <w:pPr>
-        <w:jc w:val="center"/>
-      </w:pPr>
-      <w:r>
-        <w:rPr>
-          <w:i/>
-          <w:sz w:val="18"/>
-        </w:rPr>
-        <w:t>Rysunek 9: Diagram przypadków użycia (Use Case)</w:t>
-      </w:r>
-    </w:p>
-    <w:p>
-      <w:r>
-        <w:br w:type="page"/>
-      </w:r>
-    </w:p>
-    <w:p>
-      <w:pPr>
-        <w:pStyle w:val="Heading2"/>
-      </w:pPr>
-      <w:r>
-        <w:t>9.2 Diagram klas UML</w:t>
-      </w:r>
-    </w:p>
-    <w:p>
-      <w:r>
-        <w:t>Diagram przedstawia strukturę systemu z podziałem na klasy aplikacyjne (App — warstwa prezentacji, DatabaseManager — warstwa danych) oraz encje bazodanowe (Klient, Pojazd, Naprawa, Część) z relacjami 1:*.</w:t>
-      </w:r>
-    </w:p>
-    <w:p>
-      <w:pPr>
-        <w:jc w:val="center"/>
-      </w:pPr>
-      <w:r>
-        <w:drawing>
-          <wp:inline xmlns:a="http://schemas.openxmlformats.org/drawingml/2006/main" xmlns:pic="http://schemas.openxmlformats.org/drawingml/2006/picture">
-            <wp:extent cx="5303520" cy="3953000"/>
-            <wp:docPr id="10" name="Picture 10"/>
-            <wp:cNvGraphicFramePr>
-              <a:graphicFrameLocks noChangeAspect="1"/>
-            </wp:cNvGraphicFramePr>
-            <a:graphic>
-              <a:graphicData uri="http://schemas.openxmlformats.org/drawingml/2006/picture">
-                <pic:pic>
-                  <pic:nvPicPr>
-                    <pic:cNvPr id="0" name="diagram_klas.png"/>
-                    <pic:cNvPicPr/>
-                  </pic:nvPicPr>
-                  <pic:blipFill>
-                    <a:blip r:embed="rId18"/>
-                    <a:stretch>
-                      <a:fillRect/>
-                    </a:stretch>
-                  </pic:blipFill>
-                  <pic:spPr>
-                    <a:xfrm>
-                      <a:off x="0" y="0"/>
-                      <a:ext cx="5303520" cy="3953000"/>
-                    </a:xfrm>
-                    <a:prstGeom prst="rect"/>
-                  </pic:spPr>
-                </pic:pic>
-              </a:graphicData>
-            </a:graphic>
-          </wp:inline>
-        </w:drawing>
-      </w:r>
-    </w:p>
-    <w:p>
-      <w:pPr>
-        <w:jc w:val="center"/>
-      </w:pPr>
-      <w:r>
-        <w:rPr>
-          <w:i/>
-          <w:sz w:val="18"/>
-        </w:rPr>
-        <w:t>Rysunek 10: Diagram klas UML</w:t>
-      </w:r>
-    </w:p>
-    <w:p>
-      <w:r>
-        <w:br w:type="page"/>
-      </w:r>
-    </w:p>
-    <w:p>
-      <w:pPr>
-        <w:pStyle w:val="Heading2"/>
-      </w:pPr>
-      <w:r>
-        <w:t>9.3 Diagram sekwencji – proces naprawy</w:t>
-      </w:r>
-    </w:p>
-    <w:p>
-      <w:r>
-        <w:t>Diagram przedstawia przepływ komunikatów podczas rejestracji nowej naprawy (kroki 1-8) oraz zmiany statusu zlecenia (kroki 9-13). Widoczne jest użycie PreparedStatement przy komunikacji z bazą SQLite.</w:t>
-      </w:r>
-    </w:p>
-    <w:p>
-      <w:pPr>
-        <w:jc w:val="center"/>
-      </w:pPr>
-      <w:r>
-        <w:drawing>
-          <wp:inline xmlns:a="http://schemas.openxmlformats.org/drawingml/2006/main" xmlns:pic="http://schemas.openxmlformats.org/drawingml/2006/picture">
-            <wp:extent cx="5303520" cy="4320016"/>
-            <wp:docPr id="11" name="Picture 11"/>
-            <wp:cNvGraphicFramePr>
-              <a:graphicFrameLocks noChangeAspect="1"/>
-            </wp:cNvGraphicFramePr>
-            <a:graphic>
-              <a:graphicData uri="http://schemas.openxmlformats.org/drawingml/2006/picture">
-                <pic:pic>
-                  <pic:nvPicPr>
-                    <pic:cNvPr id="0" name="diagram_sekwencji.png"/>
-                    <pic:cNvPicPr/>
-                  </pic:nvPicPr>
-                  <pic:blipFill>
-                    <a:blip r:embed="rId19"/>
-                    <a:stretch>
-                      <a:fillRect/>
-                    </a:stretch>
-                  </pic:blipFill>
-                  <pic:spPr>
-                    <a:xfrm>
-                      <a:off x="0" y="0"/>
-                      <a:ext cx="5303520" cy="4320016"/>
-                    </a:xfrm>
-                    <a:prstGeom prst="rect"/>
-                  </pic:spPr>
-                </pic:pic>
-              </a:graphicData>
-            </a:graphic>
-          </wp:inline>
-        </w:drawing>
-      </w:r>
-    </w:p>
-    <w:p>
-      <w:pPr>
-        <w:jc w:val="center"/>
-      </w:pPr>
-      <w:r>
-        <w:rPr>
-          <w:i/>
-          <w:sz w:val="18"/>
-        </w:rPr>
-        <w:t>Rysunek 11: Diagram sekwencji UML — proces naprawy</w:t>
-      </w:r>
-    </w:p>
-    <w:p>
-      <w:r>
-        <w:br w:type="page"/>
-      </w:r>
-    </w:p>
-    <w:p>
-      <w:pPr>
-        <w:pStyle w:val="Heading2"/>
-      </w:pPr>
-      <w:r>
-        <w:t>9.4 Diagram ERD bazy danych</w:t>
-      </w:r>
-    </w:p>
-    <w:p>
-      <w:r>
-        <w:t>Diagram ERD (Entity Relationship Diagram) przedstawia strukturę relacyjnej bazy danych SQLite systemu „Auto-Expert". Baza składa się z 4 tabel połączonych relacjami 1:* przez klucze obce.</w:t>
-      </w:r>
-    </w:p>
-    <w:p>
-      <w:pPr>
-        <w:jc w:val="center"/>
-      </w:pPr>
-      <w:r>
-        <w:drawing>
-          <wp:inline xmlns:a="http://schemas.openxmlformats.org/drawingml/2006/main" xmlns:pic="http://schemas.openxmlformats.org/drawingml/2006/picture">
-            <wp:extent cx="5303520" cy="3448307"/>
-            <wp:docPr id="12" name="Picture 12"/>
-            <wp:cNvGraphicFramePr>
-              <a:graphicFrameLocks noChangeAspect="1"/>
-            </wp:cNvGraphicFramePr>
-            <a:graphic>
-              <a:graphicData uri="http://schemas.openxmlformats.org/drawingml/2006/picture">
-                <pic:pic>
-                  <pic:nvPicPr>
-                    <pic:cNvPr id="0" name="diagram_erd.png"/>
-                    <pic:cNvPicPr/>
-                  </pic:nvPicPr>
-                  <pic:blipFill>
-                    <a:blip r:embed="rId20"/>
-                    <a:stretch>
-                      <a:fillRect/>
-                    </a:stretch>
-                  </pic:blipFill>
-                  <pic:spPr>
-                    <a:xfrm>
-                      <a:off x="0" y="0"/>
-                      <a:ext cx="5303520" cy="3448307"/>
-                    </a:xfrm>
-                    <a:prstGeom prst="rect"/>
-                  </pic:spPr>
-                </pic:pic>
-              </a:graphicData>
-            </a:graphic>
-          </wp:inline>
-        </w:drawing>
-      </w:r>
-    </w:p>
-    <w:p>
-      <w:pPr>
-        <w:jc w:val="center"/>
-      </w:pPr>
-      <w:r>
-        <w:rPr>
-          <w:i/>
-          <w:sz w:val="18"/>
-        </w:rPr>
-        <w:t>Rysunek 12: Diagram ERD bazy danych</w:t>
-      </w:r>
-    </w:p>
-    <w:p>
-      <w:r>
-        <w:br w:type="page"/>
-      </w:r>
-    </w:p>
-    <w:p>
-      <w:pPr>
-        <w:pStyle w:val="Heading1"/>
-      </w:pPr>
-      <w:r>
-        <w:t>Ćwiczenia 13 – Zasady stosowania zabezpieczeń</w:t>
-      </w:r>
-    </w:p>
-    <w:p>
-      <w:r>
-        <w:t>Na podstawie wykładu dotyczącego złożoności problemu stosowania zabezpieczeń, poniżej opisano realizację czterech kluczowych zasad bezpieczeństwa w systemie „Auto-Expert".</w:t>
-      </w:r>
-    </w:p>
-    <w:p>
-      <w:pPr>
-        <w:pStyle w:val="Heading2"/>
-      </w:pPr>
-      <w:r>
-        <w:t>Zasada 1: Naturalny styk z użytkownikiem</w:t>
-      </w:r>
-    </w:p>
-    <w:p>
-      <w:r>
-        <w:t>Zasada ta mówi, że mechanizmy bezpieczeństwa powinny być dla użytkownika naturalne i nie powinny utrudniać codziennej pracy z systemem.</w:t>
+        <w:t>Mechanizmy bezpieczeństwa są dla użytkownika naturalne i nie utrudniają pracy.</w:t>
       </w:r>
     </w:p>
     <w:p>
@@ -3373,7 +2747,23 @@
         <w:pStyle w:val="ListBullet"/>
       </w:pPr>
       <w:r>
-        <w:t>Walidacja danych wejściowych odbywa się natychmiast po wprowadzeniu danych przez użytkownika, a komunikaty błędów są jasne i precyzyjne (np. „Numer telefonu musi składać się z dokładnie 9 cyfr! (Wprowadzono: 5)"). Użytkownik nie musi pamiętać o formatach — system sam informuje o wymaganiach. Menu konsolowe jest intuicyjne i ponumerowane (opcje 0-9), a podmenu (zlecenia, części, historia) mają spójną strukturę z opcją „0 — Powrót do menu głównego". Zabezpieczenia działają w tle — PreparedStatement chroni przed SQL Injection bez jakiegokolwiek udziału użytkownika. Pracownik biura nie musi wiedzieć, że system go chroni.</w:t>
+        <w:t>Komunikaty błędów są jasne i precyzyjne (np. „Numer telefonu musi składać się z dokładnie 9 cyfr!").</w:t>
+      </w:r>
+    </w:p>
+    <w:p>
+      <w:pPr>
+        <w:pStyle w:val="ListBullet"/>
+      </w:pPr>
+      <w:r>
+        <w:t>Menu konsolowe jest intuicyjne (opcje 0-9), podmenu mają spójną strukturę.</w:t>
+      </w:r>
+    </w:p>
+    <w:p>
+      <w:pPr>
+        <w:pStyle w:val="ListBullet"/>
+      </w:pPr>
+      <w:r>
+        <w:t>PreparedStatement działa w tle — użytkownik nie wie, że jest chroniony przed SQL Injection.</w:t>
       </w:r>
     </w:p>
     <w:p>
@@ -3381,12 +2771,12 @@
         <w:pStyle w:val="Heading2"/>
       </w:pPr>
       <w:r>
-        <w:t>Zasada 2: Spójność pozioma i pionowa</w:t>
+        <w:t>8.2 Zasada spójności poziomej i pionowej</w:t>
       </w:r>
     </w:p>
     <w:p>
       <w:r>
-        <w:t>Zasada spójności zakłada, że mechanizmy bezpieczeństwa powinny być stosowane jednolicie na wszystkich poziomach systemu (spójność pionowa) oraz we wszystkich modułach na tym samym poziomie (spójność pozioma).</w:t>
+        <w:t>Mechanizmy bezpieczeństwa stosowane jednolicie we wszystkich modułach i na wszystkich poziomach.</w:t>
       </w:r>
     </w:p>
     <w:p>
@@ -3402,7 +2792,7 @@
         <w:pStyle w:val="ListBullet"/>
       </w:pPr>
       <w:r>
-        <w:t>Spójność pozioma — wszystkie 5 modułów systemu stosuje identyczne mechanizmy bezpieczeństwa: każde zapytanie do bazy danych wykorzystuje PreparedStatement (nigdy zwykły String), każde pole wejściowe przechodzi walidację formatu, a każda operacja na danych odbywa się przez klasę DatabaseManager (jeden punkt dostępu do bazy). Nie ma modułu, który „omija" zabezpieczenia.</w:t>
+        <w:t>Spójność pozioma — wszystkie 5 modułów używa PreparedStatement, walidacji i jednego punktu dostępu (DatabaseManager).</w:t>
       </w:r>
     </w:p>
     <w:p>
@@ -3410,7 +2800,7 @@
         <w:pStyle w:val="ListBullet"/>
       </w:pPr>
       <w:r>
-        <w:t>Spójność pionowa — zabezpieczenia są stosowane na każdym poziomie architektury: (1) Warstwa prezentacji (App.java): walidacja formatu danych wejściowych (regex, długość), (2) Warstwa logiki (DatabaseManager.java): PreparedStatement, PRAGMA foreign_keys = ON, (3) Warstwa danych (SQLite): klucze obce, ograniczenia NOT NULL, typy danych. Żaden poziom nie polega wyłącznie na zabezpieczeniach innego poziomu.</w:t>
+        <w:t>Spójność pionowa — zabezpieczenia na każdym poziomie: App.java (walidacja formatu), DatabaseManager.java (PreparedStatement, FK), SQLite (NOT NULL, PRIMARY KEY).</w:t>
       </w:r>
     </w:p>
     <w:p>
@@ -3418,12 +2808,12 @@
         <w:pStyle w:val="Heading2"/>
       </w:pPr>
       <w:r>
-        <w:t>Zasada 3: Minimalne przywileje (Least Privilege)</w:t>
+        <w:t>8.3 Zasada minimalnego przywileju</w:t>
       </w:r>
     </w:p>
     <w:p>
       <w:r>
-        <w:t>Zasada minimalnego przywileju zakłada, że każdy użytkownik i komponent systemu powinien mieć dostęp tylko do tych zasobów, które są niezbędne do wykonania jego zadań.</w:t>
+        <w:t>Każdy użytkownik i komponent ma dostęp tylko do niezbędnych zasobów.</w:t>
       </w:r>
     </w:p>
     <w:p>
@@ -3439,7 +2829,7 @@
         <w:pStyle w:val="ListBullet"/>
       </w:pPr>
       <w:r>
-        <w:t>W specyfikacji przypadków użycia (Ćw. 10) zdefiniowano dwóch aktorów głównych z różnym zakresem uprawnień: Pracownik Biura ma dostęp do ewidencji klientów, rozliczeń i historii, natomiast Mechanik ma dostęp do zleceń i bazy części. Żaden z aktorów nie ma dostępu do bezpośredniej edycji bazy danych.</w:t>
+        <w:t>DatabaseManager udostępnia tylko metody per-operacja (dodajKlienta, zmienStatus). Nie ma metody „wykonaj dowolny SQL".</w:t>
       </w:r>
     </w:p>
     <w:p>
@@ -3447,7 +2837,7 @@
         <w:pStyle w:val="ListBullet"/>
       </w:pPr>
       <w:r>
-        <w:t>Klasa DatabaseManager udostępnia tylko ściśle określone metody publiczne (dodajKlienta, dodajPojazd, zmienStatus itp.). Nie ma metody ogólnej „wykonaj SQL", co uniemożliwia wykonanie dowolnego zapytania z poziomu interfejsu użytkownika. Metoda sprawdzMinStan() jest prywatna — wywoływana automatycznie, nie przez użytkownika.</w:t>
+        <w:t>Metoda sprawdzMinStan() jest prywatna — wywoływana automatycznie, nie przez użytkownika.</w:t>
       </w:r>
     </w:p>
     <w:p>
@@ -3455,7 +2845,7 @@
         <w:pStyle w:val="ListBullet"/>
       </w:pPr>
       <w:r>
-        <w:t>Połączenie z bazą danych (metoda connect()) jest tworzone i zamykane w ramach każdej operacji (try-with-resources). Nie istnieje stałe, otwarte połączenie, które mogłoby zostać przechwycone lub nadużyte.</w:t>
+        <w:t>Połączenie z bazą tworzone i zamykane per operacja (try-with-resources).</w:t>
       </w:r>
     </w:p>
     <w:p>
@@ -3463,12 +2853,12 @@
         <w:pStyle w:val="Heading2"/>
       </w:pPr>
       <w:r>
-        <w:t>Zasada 4: Domyślna odmowa dostępu (Default Deny)</w:t>
+        <w:t>8.4 Zasada domyślnej odmowy dostępu</w:t>
       </w:r>
     </w:p>
     <w:p>
       <w:r>
-        <w:t>Zasada domyślnej odmowy dostępu zakłada, że domyślnie dostęp jest zabroniony, a każde uprawnienie musi być jawnie przyznane.</w:t>
+        <w:t>Domyślnie dostęp jest zabroniony — każde uprawnienie musi być jawnie przyznane.</w:t>
       </w:r>
     </w:p>
     <w:p>
@@ -3484,7 +2874,7 @@
         <w:pStyle w:val="ListBullet"/>
       </w:pPr>
       <w:r>
-        <w:t>Walidacja danych działa na zasadzie „whitelist" — system akceptuje tylko dane spełniające ściśle określone kryteria (telefon: dokładnie 9 cyfr \d{9}, VIN: dokładnie 17 znaków, ID klienta: tylko liczba całkowita). Wszystko, co nie spełnia kryteriów, jest automatycznie odrzucane z komunikatem błędu.</w:t>
+        <w:t>Walidacja typu „whitelist" — akceptowane tylko dane spełniające kryteria (\d{9}, 17 znaków, Integer).</w:t>
       </w:r>
     </w:p>
     <w:p>
@@ -3492,7 +2882,7 @@
         <w:pStyle w:val="ListBullet"/>
       </w:pPr>
       <w:r>
-        <w:t>Menu aplikacji obsługuje tylko zdefiniowane opcje (0-9). Każda inna wartość (litera, znak specjalny, liczba spoza zakresu) powoduje komunikat „Niepoprawna opcja!" lub „Błąd: Wprowadź poprawną cyfrę!" i powrót do menu. System nie próbuje „zgadywać" intencji użytkownika.</w:t>
+        <w:t>Menu odrzuca każdą opcję spoza zakresu 0-9.</w:t>
       </w:r>
     </w:p>
     <w:p>
@@ -3500,7 +2890,7 @@
         <w:pStyle w:val="ListBullet"/>
       </w:pPr>
       <w:r>
-        <w:t>PRAGMA foreign_keys = ON jest włączane przy każdym połączeniu z bazą. Oznacza to, że próba dodania pojazdu z nieistniejącym klient_id lub naprawy z nieistniejącym pojazd_vin zostanie automatycznie odrzucona przez bazę danych. Integralność referencyjna jest wymuszana domyślnie — nie można jej ominąć.</w:t>
+        <w:t>PRAGMA foreign_keys = ON — próba dodania rekordu z nieistniejącym kluczem obcym jest automatycznie odrzucana.</w:t>
       </w:r>
     </w:p>
     <w:p>
@@ -3508,7 +2898,7 @@
         <w:pStyle w:val="Heading2"/>
       </w:pPr>
       <w:r>
-        <w:t>Podsumowanie</w:t>
+        <w:t>Podsumowanie zasad</w:t>
       </w:r>
     </w:p>
     <w:tbl>
@@ -3645,7 +3035,7 @@
           </w:tcPr>
           <w:p>
             <w:r>
-              <w:t>Ograniczone metody publiczne, brak ogólnego SQL</w:t>
+              <w:t>Metody per-operacja, brak ogólnego SQL</w:t>
             </w:r>
           </w:p>
         </w:tc>
@@ -3655,7 +3045,7 @@
           </w:tcPr>
           <w:p>
             <w:r>
-              <w:t>DatabaseManager — metody per-operacja</w:t>
+              <w:t>DatabaseManager — ograniczone API</w:t>
             </w:r>
           </w:p>
         </w:tc>
@@ -3693,6 +3083,920 @@
         </w:tc>
       </w:tr>
     </w:tbl>
+    <w:p>
+      <w:r>
+        <w:br w:type="page"/>
+      </w:r>
+    </w:p>
+    <w:p>
+      <w:pPr>
+        <w:pStyle w:val="Heading1"/>
+      </w:pPr>
+      <w:r>
+        <w:t>9. Instrukcja obsługi systemu</w:t>
+      </w:r>
+    </w:p>
+    <w:p>
+      <w:pPr>
+        <w:pStyle w:val="Heading2"/>
+      </w:pPr>
+      <w:r>
+        <w:t>9.1 Wymagania</w:t>
+      </w:r>
+    </w:p>
+    <w:p>
+      <w:pPr>
+        <w:pStyle w:val="ListBullet"/>
+      </w:pPr>
+      <w:r>
+        <w:t>Java JRE 17+, dowolny system operacyjny, plik sqlite-jdbc-3.53.1.0.jar (w lib/).</w:t>
+      </w:r>
+    </w:p>
+    <w:p>
+      <w:pPr>
+        <w:pStyle w:val="Heading2"/>
+      </w:pPr>
+      <w:r>
+        <w:t>9.2 Kompilacja i uruchomienie</w:t>
+      </w:r>
+    </w:p>
+    <w:p>
+      <w:r>
+        <w:t xml:space="preserve">Kompilacja: </w:t>
+      </w:r>
+      <w:r>
+        <w:rPr>
+          <w:rFonts w:ascii="Consolas" w:hAnsi="Consolas"/>
+          <w:sz w:val="20"/>
+        </w:rPr>
+        <w:t>javac -cp "lib/sqlite-jdbc-3.53.1.0.jar" -d bin src/*.java</w:t>
+      </w:r>
+    </w:p>
+    <w:p>
+      <w:r>
+        <w:t xml:space="preserve">Uruchomienie (macOS/Linux): </w:t>
+      </w:r>
+      <w:r>
+        <w:rPr>
+          <w:rFonts w:ascii="Consolas" w:hAnsi="Consolas"/>
+          <w:sz w:val="20"/>
+        </w:rPr>
+        <w:t>java -cp "bin:lib/sqlite-jdbc-3.53.1.0.jar" App</w:t>
+      </w:r>
+    </w:p>
+    <w:p>
+      <w:r>
+        <w:t xml:space="preserve">Uruchomienie (Windows): </w:t>
+      </w:r>
+      <w:r>
+        <w:rPr>
+          <w:rFonts w:ascii="Consolas" w:hAnsi="Consolas"/>
+          <w:sz w:val="20"/>
+        </w:rPr>
+        <w:t>java -cp "bin;lib\sqlite-jdbc-3.53.1.0.jar" App</w:t>
+      </w:r>
+    </w:p>
+    <w:p>
+      <w:pPr>
+        <w:pStyle w:val="Heading2"/>
+      </w:pPr>
+      <w:r>
+        <w:t>9.3 Obsługa menu</w:t>
+      </w:r>
+    </w:p>
+    <w:p>
+      <w:r>
+        <w:t>Po uruchomieniu wyświetla się menu 0-9. Opcje 7, 8, 9 mają podmenu (powrót przez 0).</w:t>
+      </w:r>
+    </w:p>
+    <w:p>
+      <w:r>
+        <w:rPr>
+          <w:b/>
+        </w:rPr>
+        <w:t xml:space="preserve">Opcja 1: </w:t>
+      </w:r>
+      <w:r>
+        <w:t>Dodaj klienta (imię, nazwisko, telefon 9 cyfr)</w:t>
+      </w:r>
+    </w:p>
+    <w:p>
+      <w:r>
+        <w:rPr>
+          <w:b/>
+        </w:rPr>
+        <w:t xml:space="preserve">Opcja 2: </w:t>
+      </w:r>
+      <w:r>
+        <w:t>Lista klientów</w:t>
+      </w:r>
+    </w:p>
+    <w:p>
+      <w:r>
+        <w:rPr>
+          <w:b/>
+        </w:rPr>
+        <w:t xml:space="preserve">Opcja 3: </w:t>
+      </w:r>
+      <w:r>
+        <w:t>Dodaj pojazd (VIN 17 zn., marka, model, ID klienta)</w:t>
+      </w:r>
+    </w:p>
+    <w:p>
+      <w:r>
+        <w:rPr>
+          <w:b/>
+        </w:rPr>
+        <w:t xml:space="preserve">Opcja 4: </w:t>
+      </w:r>
+      <w:r>
+        <w:t>Lista pojazdów</w:t>
+      </w:r>
+    </w:p>
+    <w:p>
+      <w:r>
+        <w:rPr>
+          <w:b/>
+        </w:rPr>
+        <w:t xml:space="preserve">Opcja 5: </w:t>
+      </w:r>
+      <w:r>
+        <w:t>Nowa naprawa (opis, rbh, części, VIN, mechanik)</w:t>
+      </w:r>
+    </w:p>
+    <w:p>
+      <w:r>
+        <w:rPr>
+          <w:b/>
+        </w:rPr>
+        <w:t xml:space="preserve">Opcja 6: </w:t>
+      </w:r>
+      <w:r>
+        <w:t>Rozliczenia — faktury + płatność gotówkowa/bezgotówkowa</w:t>
+      </w:r>
+    </w:p>
+    <w:p>
+      <w:r>
+        <w:rPr>
+          <w:b/>
+        </w:rPr>
+        <w:t xml:space="preserve">Opcja 7: </w:t>
+      </w:r>
+      <w:r>
+        <w:t>Zlecenia — lista ze statusami + zmiana statusu</w:t>
+      </w:r>
+    </w:p>
+    <w:p>
+      <w:r>
+        <w:rPr>
+          <w:b/>
+        </w:rPr>
+        <w:t xml:space="preserve">Opcja 8: </w:t>
+      </w:r>
+      <w:r>
+        <w:t>Części — magazyn z alertami + dodawanie + aktualizacja</w:t>
+      </w:r>
+    </w:p>
+    <w:p>
+      <w:r>
+        <w:rPr>
+          <w:b/>
+        </w:rPr>
+        <w:t xml:space="preserve">Opcja 9: </w:t>
+      </w:r>
+      <w:r>
+        <w:t>Historia — wyszukiwanie po VIN lub nazwisku</w:t>
+      </w:r>
+    </w:p>
+    <w:p>
+      <w:r>
+        <w:rPr>
+          <w:b/>
+        </w:rPr>
+        <w:t xml:space="preserve">Opcja 0: </w:t>
+      </w:r>
+      <w:r>
+        <w:t>Wyjście z programu</w:t>
+      </w:r>
+    </w:p>
+    <w:p>
+      <w:r>
+        <w:br w:type="page"/>
+      </w:r>
+    </w:p>
+    <w:p>
+      <w:pPr>
+        <w:pStyle w:val="Heading1"/>
+      </w:pPr>
+      <w:r>
+        <w:t>10. Zrzuty ekranowe</w:t>
+      </w:r>
+    </w:p>
+    <w:p>
+      <w:pPr>
+        <w:jc w:val="center"/>
+      </w:pPr>
+      <w:r>
+        <w:drawing>
+          <wp:inline xmlns:a="http://schemas.openxmlformats.org/drawingml/2006/main" xmlns:pic="http://schemas.openxmlformats.org/drawingml/2006/picture">
+            <wp:extent cx="5303520" cy="4037249"/>
+            <wp:docPr id="1" name="Picture 1"/>
+            <wp:cNvGraphicFramePr>
+              <a:graphicFrameLocks noChangeAspect="1"/>
+            </wp:cNvGraphicFramePr>
+            <a:graphic>
+              <a:graphicData uri="http://schemas.openxmlformats.org/drawingml/2006/picture">
+                <pic:pic>
+                  <pic:nvPicPr>
+                    <pic:cNvPr id="0" name="screen_menu.png"/>
+                    <pic:cNvPicPr/>
+                  </pic:nvPicPr>
+                  <pic:blipFill>
+                    <a:blip r:embed="rId9"/>
+                    <a:stretch>
+                      <a:fillRect/>
+                    </a:stretch>
+                  </pic:blipFill>
+                  <pic:spPr>
+                    <a:xfrm>
+                      <a:off x="0" y="0"/>
+                      <a:ext cx="5303520" cy="4037249"/>
+                    </a:xfrm>
+                    <a:prstGeom prst="rect"/>
+                  </pic:spPr>
+                </pic:pic>
+              </a:graphicData>
+            </a:graphic>
+          </wp:inline>
+        </w:drawing>
+      </w:r>
+    </w:p>
+    <w:p>
+      <w:pPr>
+        <w:jc w:val="center"/>
+      </w:pPr>
+      <w:r>
+        <w:rPr>
+          <w:i/>
+          <w:sz w:val="18"/>
+        </w:rPr>
+        <w:t>Rysunek 1: Menu główne systemu Auto-Expert</w:t>
+      </w:r>
+    </w:p>
+    <w:p/>
+    <w:p>
+      <w:pPr>
+        <w:jc w:val="center"/>
+      </w:pPr>
+      <w:r>
+        <w:drawing>
+          <wp:inline xmlns:a="http://schemas.openxmlformats.org/drawingml/2006/main" xmlns:pic="http://schemas.openxmlformats.org/drawingml/2006/picture">
+            <wp:extent cx="5303520" cy="2738756"/>
+            <wp:docPr id="2" name="Picture 2"/>
+            <wp:cNvGraphicFramePr>
+              <a:graphicFrameLocks noChangeAspect="1"/>
+            </wp:cNvGraphicFramePr>
+            <a:graphic>
+              <a:graphicData uri="http://schemas.openxmlformats.org/drawingml/2006/picture">
+                <pic:pic>
+                  <pic:nvPicPr>
+                    <pic:cNvPr id="0" name="screen_klient.png"/>
+                    <pic:cNvPicPr/>
+                  </pic:nvPicPr>
+                  <pic:blipFill>
+                    <a:blip r:embed="rId10"/>
+                    <a:stretch>
+                      <a:fillRect/>
+                    </a:stretch>
+                  </pic:blipFill>
+                  <pic:spPr>
+                    <a:xfrm>
+                      <a:off x="0" y="0"/>
+                      <a:ext cx="5303520" cy="2738756"/>
+                    </a:xfrm>
+                    <a:prstGeom prst="rect"/>
+                  </pic:spPr>
+                </pic:pic>
+              </a:graphicData>
+            </a:graphic>
+          </wp:inline>
+        </w:drawing>
+      </w:r>
+    </w:p>
+    <w:p>
+      <w:pPr>
+        <w:jc w:val="center"/>
+      </w:pPr>
+      <w:r>
+        <w:rPr>
+          <w:i/>
+          <w:sz w:val="18"/>
+        </w:rPr>
+        <w:t>Rysunek 2: Dodawanie klienta z walidacją telefonu</w:t>
+      </w:r>
+    </w:p>
+    <w:p/>
+    <w:p>
+      <w:pPr>
+        <w:jc w:val="center"/>
+      </w:pPr>
+      <w:r>
+        <w:drawing>
+          <wp:inline xmlns:a="http://schemas.openxmlformats.org/drawingml/2006/main" xmlns:pic="http://schemas.openxmlformats.org/drawingml/2006/picture">
+            <wp:extent cx="5303520" cy="2413327"/>
+            <wp:docPr id="3" name="Picture 3"/>
+            <wp:cNvGraphicFramePr>
+              <a:graphicFrameLocks noChangeAspect="1"/>
+            </wp:cNvGraphicFramePr>
+            <a:graphic>
+              <a:graphicData uri="http://schemas.openxmlformats.org/drawingml/2006/picture">
+                <pic:pic>
+                  <pic:nvPicPr>
+                    <pic:cNvPr id="0" name="screen_lista.png"/>
+                    <pic:cNvPicPr/>
+                  </pic:nvPicPr>
+                  <pic:blipFill>
+                    <a:blip r:embed="rId11"/>
+                    <a:stretch>
+                      <a:fillRect/>
+                    </a:stretch>
+                  </pic:blipFill>
+                  <pic:spPr>
+                    <a:xfrm>
+                      <a:off x="0" y="0"/>
+                      <a:ext cx="5303520" cy="2413327"/>
+                    </a:xfrm>
+                    <a:prstGeom prst="rect"/>
+                  </pic:spPr>
+                </pic:pic>
+              </a:graphicData>
+            </a:graphic>
+          </wp:inline>
+        </w:drawing>
+      </w:r>
+    </w:p>
+    <w:p>
+      <w:pPr>
+        <w:jc w:val="center"/>
+      </w:pPr>
+      <w:r>
+        <w:rPr>
+          <w:i/>
+          <w:sz w:val="18"/>
+        </w:rPr>
+        <w:t>Rysunek 3: Lista klientów i pojazdów</w:t>
+      </w:r>
+    </w:p>
+    <w:p/>
+    <w:p>
+      <w:pPr>
+        <w:jc w:val="center"/>
+      </w:pPr>
+      <w:r>
+        <w:drawing>
+          <wp:inline xmlns:a="http://schemas.openxmlformats.org/drawingml/2006/main" xmlns:pic="http://schemas.openxmlformats.org/drawingml/2006/picture">
+            <wp:extent cx="5303520" cy="2577653"/>
+            <wp:docPr id="4" name="Picture 4"/>
+            <wp:cNvGraphicFramePr>
+              <a:graphicFrameLocks noChangeAspect="1"/>
+            </wp:cNvGraphicFramePr>
+            <a:graphic>
+              <a:graphicData uri="http://schemas.openxmlformats.org/drawingml/2006/picture">
+                <pic:pic>
+                  <pic:nvPicPr>
+                    <pic:cNvPr id="0" name="screen_vin.png"/>
+                    <pic:cNvPicPr/>
+                  </pic:nvPicPr>
+                  <pic:blipFill>
+                    <a:blip r:embed="rId12"/>
+                    <a:stretch>
+                      <a:fillRect/>
+                    </a:stretch>
+                  </pic:blipFill>
+                  <pic:spPr>
+                    <a:xfrm>
+                      <a:off x="0" y="0"/>
+                      <a:ext cx="5303520" cy="2577653"/>
+                    </a:xfrm>
+                    <a:prstGeom prst="rect"/>
+                  </pic:spPr>
+                </pic:pic>
+              </a:graphicData>
+            </a:graphic>
+          </wp:inline>
+        </w:drawing>
+      </w:r>
+    </w:p>
+    <w:p>
+      <w:pPr>
+        <w:jc w:val="center"/>
+      </w:pPr>
+      <w:r>
+        <w:rPr>
+          <w:i/>
+          <w:sz w:val="18"/>
+        </w:rPr>
+        <w:t>Rysunek 4: Walidacja numeru VIN</w:t>
+      </w:r>
+    </w:p>
+    <w:p/>
+    <w:p>
+      <w:pPr>
+        <w:jc w:val="center"/>
+      </w:pPr>
+      <w:r>
+        <w:drawing>
+          <wp:inline xmlns:a="http://schemas.openxmlformats.org/drawingml/2006/main" xmlns:pic="http://schemas.openxmlformats.org/drawingml/2006/picture">
+            <wp:extent cx="5303520" cy="3225288"/>
+            <wp:docPr id="5" name="Picture 5"/>
+            <wp:cNvGraphicFramePr>
+              <a:graphicFrameLocks noChangeAspect="1"/>
+            </wp:cNvGraphicFramePr>
+            <a:graphic>
+              <a:graphicData uri="http://schemas.openxmlformats.org/drawingml/2006/picture">
+                <pic:pic>
+                  <pic:nvPicPr>
+                    <pic:cNvPr id="0" name="screen_zlecenia.png"/>
+                    <pic:cNvPicPr/>
+                  </pic:nvPicPr>
+                  <pic:blipFill>
+                    <a:blip r:embed="rId13"/>
+                    <a:stretch>
+                      <a:fillRect/>
+                    </a:stretch>
+                  </pic:blipFill>
+                  <pic:spPr>
+                    <a:xfrm>
+                      <a:off x="0" y="0"/>
+                      <a:ext cx="5303520" cy="3225288"/>
+                    </a:xfrm>
+                    <a:prstGeom prst="rect"/>
+                  </pic:spPr>
+                </pic:pic>
+              </a:graphicData>
+            </a:graphic>
+          </wp:inline>
+        </w:drawing>
+      </w:r>
+    </w:p>
+    <w:p>
+      <w:pPr>
+        <w:jc w:val="center"/>
+      </w:pPr>
+      <w:r>
+        <w:rPr>
+          <w:i/>
+          <w:sz w:val="18"/>
+        </w:rPr>
+        <w:t>Rysunek 5: Zarządzanie zleceniami — lista i zmiana statusu</w:t>
+      </w:r>
+    </w:p>
+    <w:p/>
+    <w:p>
+      <w:pPr>
+        <w:jc w:val="center"/>
+      </w:pPr>
+      <w:r>
+        <w:drawing>
+          <wp:inline xmlns:a="http://schemas.openxmlformats.org/drawingml/2006/main" xmlns:pic="http://schemas.openxmlformats.org/drawingml/2006/picture">
+            <wp:extent cx="5303520" cy="3064185"/>
+            <wp:docPr id="6" name="Picture 6"/>
+            <wp:cNvGraphicFramePr>
+              <a:graphicFrameLocks noChangeAspect="1"/>
+            </wp:cNvGraphicFramePr>
+            <a:graphic>
+              <a:graphicData uri="http://schemas.openxmlformats.org/drawingml/2006/picture">
+                <pic:pic>
+                  <pic:nvPicPr>
+                    <pic:cNvPr id="0" name="screen_rozliczenie.png"/>
+                    <pic:cNvPicPr/>
+                  </pic:nvPicPr>
+                  <pic:blipFill>
+                    <a:blip r:embed="rId14"/>
+                    <a:stretch>
+                      <a:fillRect/>
+                    </a:stretch>
+                  </pic:blipFill>
+                  <pic:spPr>
+                    <a:xfrm>
+                      <a:off x="0" y="0"/>
+                      <a:ext cx="5303520" cy="3064185"/>
+                    </a:xfrm>
+                    <a:prstGeom prst="rect"/>
+                  </pic:spPr>
+                </pic:pic>
+              </a:graphicData>
+            </a:graphic>
+          </wp:inline>
+        </w:drawing>
+      </w:r>
+    </w:p>
+    <w:p>
+      <w:pPr>
+        <w:jc w:val="center"/>
+      </w:pPr>
+      <w:r>
+        <w:rPr>
+          <w:i/>
+          <w:sz w:val="18"/>
+        </w:rPr>
+        <w:t>Rysunek 6: Moduł rozliczeniowy z płatnością bezgotówkową</w:t>
+      </w:r>
+    </w:p>
+    <w:p/>
+    <w:p>
+      <w:pPr>
+        <w:jc w:val="center"/>
+      </w:pPr>
+      <w:r>
+        <w:drawing>
+          <wp:inline xmlns:a="http://schemas.openxmlformats.org/drawingml/2006/main" xmlns:pic="http://schemas.openxmlformats.org/drawingml/2006/picture">
+            <wp:extent cx="5303520" cy="2413327"/>
+            <wp:docPr id="7" name="Picture 7"/>
+            <wp:cNvGraphicFramePr>
+              <a:graphicFrameLocks noChangeAspect="1"/>
+            </wp:cNvGraphicFramePr>
+            <a:graphic>
+              <a:graphicData uri="http://schemas.openxmlformats.org/drawingml/2006/picture">
+                <pic:pic>
+                  <pic:nvPicPr>
+                    <pic:cNvPr id="0" name="screen_czesci.png"/>
+                    <pic:cNvPicPr/>
+                  </pic:nvPicPr>
+                  <pic:blipFill>
+                    <a:blip r:embed="rId15"/>
+                    <a:stretch>
+                      <a:fillRect/>
+                    </a:stretch>
+                  </pic:blipFill>
+                  <pic:spPr>
+                    <a:xfrm>
+                      <a:off x="0" y="0"/>
+                      <a:ext cx="5303520" cy="2413327"/>
+                    </a:xfrm>
+                    <a:prstGeom prst="rect"/>
+                  </pic:spPr>
+                </pic:pic>
+              </a:graphicData>
+            </a:graphic>
+          </wp:inline>
+        </w:drawing>
+      </w:r>
+    </w:p>
+    <w:p>
+      <w:pPr>
+        <w:jc w:val="center"/>
+      </w:pPr>
+      <w:r>
+        <w:rPr>
+          <w:i/>
+          <w:sz w:val="18"/>
+        </w:rPr>
+        <w:t>Rysunek 7: Magazyn części z alertem niskiego stanu</w:t>
+      </w:r>
+    </w:p>
+    <w:p/>
+    <w:p>
+      <w:pPr>
+        <w:jc w:val="center"/>
+      </w:pPr>
+      <w:r>
+        <w:drawing>
+          <wp:inline xmlns:a="http://schemas.openxmlformats.org/drawingml/2006/main" xmlns:pic="http://schemas.openxmlformats.org/drawingml/2006/picture">
+            <wp:extent cx="5303520" cy="2252224"/>
+            <wp:docPr id="8" name="Picture 8"/>
+            <wp:cNvGraphicFramePr>
+              <a:graphicFrameLocks noChangeAspect="1"/>
+            </wp:cNvGraphicFramePr>
+            <a:graphic>
+              <a:graphicData uri="http://schemas.openxmlformats.org/drawingml/2006/picture">
+                <pic:pic>
+                  <pic:nvPicPr>
+                    <pic:cNvPr id="0" name="screen_historia.png"/>
+                    <pic:cNvPicPr/>
+                  </pic:nvPicPr>
+                  <pic:blipFill>
+                    <a:blip r:embed="rId16"/>
+                    <a:stretch>
+                      <a:fillRect/>
+                    </a:stretch>
+                  </pic:blipFill>
+                  <pic:spPr>
+                    <a:xfrm>
+                      <a:off x="0" y="0"/>
+                      <a:ext cx="5303520" cy="2252224"/>
+                    </a:xfrm>
+                    <a:prstGeom prst="rect"/>
+                  </pic:spPr>
+                </pic:pic>
+              </a:graphicData>
+            </a:graphic>
+          </wp:inline>
+        </w:drawing>
+      </w:r>
+    </w:p>
+    <w:p>
+      <w:pPr>
+        <w:jc w:val="center"/>
+      </w:pPr>
+      <w:r>
+        <w:rPr>
+          <w:i/>
+          <w:sz w:val="18"/>
+        </w:rPr>
+        <w:t>Rysunek 8: Historia serwisowa — wyszukiwanie po VIN</w:t>
+      </w:r>
+    </w:p>
+    <w:p/>
+    <w:p>
+      <w:r>
+        <w:br w:type="page"/>
+      </w:r>
+    </w:p>
+    <w:p>
+      <w:pPr>
+        <w:pStyle w:val="Heading1"/>
+      </w:pPr>
+      <w:r>
+        <w:t>11. Diagramy UML</w:t>
+      </w:r>
+    </w:p>
+    <w:p>
+      <w:pPr>
+        <w:pStyle w:val="Heading2"/>
+      </w:pPr>
+      <w:r>
+        <w:t>11.1 Diagram przypadków użycia (Use Case)</w:t>
+      </w:r>
+    </w:p>
+    <w:p>
+      <w:r>
+        <w:t>5 głównych przypadków, 3 aktorów, związki «include» i «extend».</w:t>
+      </w:r>
+    </w:p>
+    <w:p>
+      <w:pPr>
+        <w:jc w:val="center"/>
+      </w:pPr>
+      <w:r>
+        <w:drawing>
+          <wp:inline xmlns:a="http://schemas.openxmlformats.org/drawingml/2006/main" xmlns:pic="http://schemas.openxmlformats.org/drawingml/2006/picture">
+            <wp:extent cx="5303520" cy="3949033"/>
+            <wp:docPr id="9" name="Picture 9"/>
+            <wp:cNvGraphicFramePr>
+              <a:graphicFrameLocks noChangeAspect="1"/>
+            </wp:cNvGraphicFramePr>
+            <a:graphic>
+              <a:graphicData uri="http://schemas.openxmlformats.org/drawingml/2006/picture">
+                <pic:pic>
+                  <pic:nvPicPr>
+                    <pic:cNvPr id="0" name="diagram_use_case.png"/>
+                    <pic:cNvPicPr/>
+                  </pic:nvPicPr>
+                  <pic:blipFill>
+                    <a:blip r:embed="rId17"/>
+                    <a:stretch>
+                      <a:fillRect/>
+                    </a:stretch>
+                  </pic:blipFill>
+                  <pic:spPr>
+                    <a:xfrm>
+                      <a:off x="0" y="0"/>
+                      <a:ext cx="5303520" cy="3949033"/>
+                    </a:xfrm>
+                    <a:prstGeom prst="rect"/>
+                  </pic:spPr>
+                </pic:pic>
+              </a:graphicData>
+            </a:graphic>
+          </wp:inline>
+        </w:drawing>
+      </w:r>
+    </w:p>
+    <w:p>
+      <w:pPr>
+        <w:jc w:val="center"/>
+      </w:pPr>
+      <w:r>
+        <w:rPr>
+          <w:i/>
+          <w:sz w:val="18"/>
+        </w:rPr>
+        <w:t>Rysunek 9: Diagram przypadków użycia</w:t>
+      </w:r>
+    </w:p>
+    <w:p>
+      <w:r>
+        <w:br w:type="page"/>
+      </w:r>
+    </w:p>
+    <w:p>
+      <w:pPr>
+        <w:pStyle w:val="Heading2"/>
+      </w:pPr>
+      <w:r>
+        <w:t>11.2 Diagram klas UML</w:t>
+      </w:r>
+    </w:p>
+    <w:p>
+      <w:r>
+        <w:t>Klasy App i DatabaseManager oraz 4 encje bazodanowe z relacjami 1:*.</w:t>
+      </w:r>
+    </w:p>
+    <w:p>
+      <w:pPr>
+        <w:jc w:val="center"/>
+      </w:pPr>
+      <w:r>
+        <w:drawing>
+          <wp:inline xmlns:a="http://schemas.openxmlformats.org/drawingml/2006/main" xmlns:pic="http://schemas.openxmlformats.org/drawingml/2006/picture">
+            <wp:extent cx="5303520" cy="3953000"/>
+            <wp:docPr id="10" name="Picture 10"/>
+            <wp:cNvGraphicFramePr>
+              <a:graphicFrameLocks noChangeAspect="1"/>
+            </wp:cNvGraphicFramePr>
+            <a:graphic>
+              <a:graphicData uri="http://schemas.openxmlformats.org/drawingml/2006/picture">
+                <pic:pic>
+                  <pic:nvPicPr>
+                    <pic:cNvPr id="0" name="diagram_klas.png"/>
+                    <pic:cNvPicPr/>
+                  </pic:nvPicPr>
+                  <pic:blipFill>
+                    <a:blip r:embed="rId18"/>
+                    <a:stretch>
+                      <a:fillRect/>
+                    </a:stretch>
+                  </pic:blipFill>
+                  <pic:spPr>
+                    <a:xfrm>
+                      <a:off x="0" y="0"/>
+                      <a:ext cx="5303520" cy="3953000"/>
+                    </a:xfrm>
+                    <a:prstGeom prst="rect"/>
+                  </pic:spPr>
+                </pic:pic>
+              </a:graphicData>
+            </a:graphic>
+          </wp:inline>
+        </w:drawing>
+      </w:r>
+    </w:p>
+    <w:p>
+      <w:pPr>
+        <w:jc w:val="center"/>
+      </w:pPr>
+      <w:r>
+        <w:rPr>
+          <w:i/>
+          <w:sz w:val="18"/>
+        </w:rPr>
+        <w:t>Rysunek 10: Diagram klas UML</w:t>
+      </w:r>
+    </w:p>
+    <w:p>
+      <w:r>
+        <w:br w:type="page"/>
+      </w:r>
+    </w:p>
+    <w:p>
+      <w:pPr>
+        <w:pStyle w:val="Heading2"/>
+      </w:pPr>
+      <w:r>
+        <w:t>11.3 Diagram sekwencji — proces naprawy</w:t>
+      </w:r>
+    </w:p>
+    <w:p>
+      <w:r>
+        <w:t>13 kroków procesu od przyjęcia zlecenia do zmiany statusu. PreparedStatement przy komunikacji z bazą.</w:t>
+      </w:r>
+    </w:p>
+    <w:p>
+      <w:pPr>
+        <w:jc w:val="center"/>
+      </w:pPr>
+      <w:r>
+        <w:drawing>
+          <wp:inline xmlns:a="http://schemas.openxmlformats.org/drawingml/2006/main" xmlns:pic="http://schemas.openxmlformats.org/drawingml/2006/picture">
+            <wp:extent cx="5303520" cy="4320016"/>
+            <wp:docPr id="11" name="Picture 11"/>
+            <wp:cNvGraphicFramePr>
+              <a:graphicFrameLocks noChangeAspect="1"/>
+            </wp:cNvGraphicFramePr>
+            <a:graphic>
+              <a:graphicData uri="http://schemas.openxmlformats.org/drawingml/2006/picture">
+                <pic:pic>
+                  <pic:nvPicPr>
+                    <pic:cNvPr id="0" name="diagram_sekwencji.png"/>
+                    <pic:cNvPicPr/>
+                  </pic:nvPicPr>
+                  <pic:blipFill>
+                    <a:blip r:embed="rId19"/>
+                    <a:stretch>
+                      <a:fillRect/>
+                    </a:stretch>
+                  </pic:blipFill>
+                  <pic:spPr>
+                    <a:xfrm>
+                      <a:off x="0" y="0"/>
+                      <a:ext cx="5303520" cy="4320016"/>
+                    </a:xfrm>
+                    <a:prstGeom prst="rect"/>
+                  </pic:spPr>
+                </pic:pic>
+              </a:graphicData>
+            </a:graphic>
+          </wp:inline>
+        </w:drawing>
+      </w:r>
+    </w:p>
+    <w:p>
+      <w:pPr>
+        <w:jc w:val="center"/>
+      </w:pPr>
+      <w:r>
+        <w:rPr>
+          <w:i/>
+          <w:sz w:val="18"/>
+        </w:rPr>
+        <w:t>Rysunek 11: Diagram sekwencji UML</w:t>
+      </w:r>
+    </w:p>
+    <w:p>
+      <w:r>
+        <w:br w:type="page"/>
+      </w:r>
+    </w:p>
+    <w:p>
+      <w:pPr>
+        <w:pStyle w:val="Heading2"/>
+      </w:pPr>
+      <w:r>
+        <w:t>11.4 Diagram ERD bazy danych</w:t>
+      </w:r>
+    </w:p>
+    <w:p>
+      <w:r>
+        <w:t>4 tabele: klienci, pojazdy, naprawy, czesci. Relacje 1:* przez klucze obce.</w:t>
+      </w:r>
+    </w:p>
+    <w:p>
+      <w:pPr>
+        <w:jc w:val="center"/>
+      </w:pPr>
+      <w:r>
+        <w:drawing>
+          <wp:inline xmlns:a="http://schemas.openxmlformats.org/drawingml/2006/main" xmlns:pic="http://schemas.openxmlformats.org/drawingml/2006/picture">
+            <wp:extent cx="5303520" cy="3448307"/>
+            <wp:docPr id="12" name="Picture 12"/>
+            <wp:cNvGraphicFramePr>
+              <a:graphicFrameLocks noChangeAspect="1"/>
+            </wp:cNvGraphicFramePr>
+            <a:graphic>
+              <a:graphicData uri="http://schemas.openxmlformats.org/drawingml/2006/picture">
+                <pic:pic>
+                  <pic:nvPicPr>
+                    <pic:cNvPr id="0" name="diagram_erd.png"/>
+                    <pic:cNvPicPr/>
+                  </pic:nvPicPr>
+                  <pic:blipFill>
+                    <a:blip r:embed="rId20"/>
+                    <a:stretch>
+                      <a:fillRect/>
+                    </a:stretch>
+                  </pic:blipFill>
+                  <pic:spPr>
+                    <a:xfrm>
+                      <a:off x="0" y="0"/>
+                      <a:ext cx="5303520" cy="3448307"/>
+                    </a:xfrm>
+                    <a:prstGeom prst="rect"/>
+                  </pic:spPr>
+                </pic:pic>
+              </a:graphicData>
+            </a:graphic>
+          </wp:inline>
+        </w:drawing>
+      </w:r>
+    </w:p>
+    <w:p>
+      <w:pPr>
+        <w:jc w:val="center"/>
+      </w:pPr>
+      <w:r>
+        <w:rPr>
+          <w:i/>
+          <w:sz w:val="18"/>
+        </w:rPr>
+        <w:t>Rysunek 12: Diagram ERD</w:t>
+      </w:r>
+    </w:p>
+    <w:p>
+      <w:r>
+        <w:br w:type="page"/>
+      </w:r>
+    </w:p>
     <w:sectPr>
       <w:pgSz w:w="12240" w:h="15840"/>
       <w:pgMar w:top="1440" w:right="1800" w:bottom="1440" w:left="1800" w:header="720" w:footer="720" w:gutter="0"/>

</xml_diff>